<commit_message>
Update Spanish Bible reference texts and add new content for 2026-04-15 release
</commit_message>
<xml_diff>
--- a/spa/docx/01.content.docx
+++ b/spa/docx/01.content.docx
@@ -2215,7 +2215,7 @@
         <w:rPr>
           <w:lang w:val="es_ES" w:bidi="es_ES"/>
         </w:rPr>
-        <w:t xml:space="preserve"> Lamec tuvo dos esposas: una se llamaba Ada y la otra, Zila.</w:t>
+        <w:t xml:space="preserve"> Lamec tuvo 2 esposas: una se llamaba Ada y la otra, Zila.</w:t>
       </w:r>
     </w:p>
     <w:p>
@@ -2483,7 +2483,7 @@
         <w:rPr>
           <w:lang w:val="es_ES" w:bidi="es_ES"/>
         </w:rPr>
-        <w:t xml:space="preserve"> Set tenía ciento cinco años cuando nació su hijo Enós.</w:t>
+        <w:t xml:space="preserve"> Set tenía 105 años cuando nació su hijo Enós.</w:t>
       </w:r>
     </w:p>
     <w:p>
@@ -2525,7 +2525,7 @@
         <w:rPr>
           <w:lang w:val="es_ES" w:bidi="es_ES"/>
         </w:rPr>
-        <w:t xml:space="preserve"> Enós tenía noventa años cuando nació su hijo Cainán.</w:t>
+        <w:t xml:space="preserve"> Enós tenía 90 años cuando nació su hijo Cainán.</w:t>
       </w:r>
     </w:p>
     <w:p>
@@ -2546,7 +2546,7 @@
         <w:rPr>
           <w:lang w:val="es_ES" w:bidi="es_ES"/>
         </w:rPr>
-        <w:t xml:space="preserve"> Cainán tenía setenta años cuando nació su hijo Malalel.</w:t>
+        <w:t xml:space="preserve"> Cainán tenía 70 años cuando nació su hijo Malalel.</w:t>
       </w:r>
     </w:p>
     <w:p>
@@ -2567,7 +2567,7 @@
         <w:rPr>
           <w:lang w:val="es_ES" w:bidi="es_ES"/>
         </w:rPr>
-        <w:t xml:space="preserve"> Malalel tenía sesenta y cinco años cuando nació su hijo Jared.</w:t>
+        <w:t xml:space="preserve"> Malalel tenía 65 años cuando nació su hijo Jared.</w:t>
       </w:r>
     </w:p>
     <w:p>
@@ -2588,7 +2588,7 @@
         <w:rPr>
           <w:lang w:val="es_ES" w:bidi="es_ES"/>
         </w:rPr>
-        <w:t xml:space="preserve"> Jared tenía ciento sesenta y dos años cuando nació su hijo Enoc.</w:t>
+        <w:t xml:space="preserve"> Jared tenía 162 años cuando nació su hijo Enoc.</w:t>
       </w:r>
     </w:p>
     <w:p>
@@ -2609,7 +2609,7 @@
         <w:rPr>
           <w:lang w:val="es_ES" w:bidi="es_ES"/>
         </w:rPr>
-        <w:t xml:space="preserve"> Enoc tenía sesenta y cinco años cuando nació su hijo Matusalén.</w:t>
+        <w:t xml:space="preserve"> Enoc tenía 65 años cuando nació su hijo Matusalén.</w:t>
       </w:r>
     </w:p>
     <w:p>
@@ -2630,7 +2630,7 @@
         <w:rPr>
           <w:lang w:val="es_ES" w:bidi="es_ES"/>
         </w:rPr>
-        <w:t xml:space="preserve"> Matusalén tenía ciento ochenta y siete años cuando nació su hijo Lamec.</w:t>
+        <w:t xml:space="preserve"> Matusalén tenía 187 años cuando nació su hijo Lamec.</w:t>
       </w:r>
     </w:p>
     <w:p>
@@ -2651,7 +2651,7 @@
         <w:rPr>
           <w:lang w:val="es_ES" w:bidi="es_ES"/>
         </w:rPr>
-        <w:t xml:space="preserve"> Lamec tenía ciento ochenta y dos años cuando nació su hijo Noé.</w:t>
+        <w:t xml:space="preserve"> Lamec tenía 182 años cuando nació su hijo Noé.</w:t>
       </w:r>
     </w:p>
     <w:p>
@@ -2672,7 +2672,7 @@
         <w:rPr>
           <w:lang w:val="es_ES" w:bidi="es_ES"/>
         </w:rPr>
-        <w:t xml:space="preserve"> Noé había cumplido ya quinientos años cuando tuvo a sus hijos Sem, Cam y Jafet.</w:t>
+        <w:t xml:space="preserve"> Noé había cumplido ya 500 años cuando tuvo a sus hijos Sem, Cam y Jafet.</w:t>
       </w:r>
     </w:p>
     <w:p>
@@ -2772,7 +2772,7 @@
         <w:rPr>
           <w:lang w:val="es_ES" w:bidi="es_ES"/>
         </w:rPr>
-        <w:t xml:space="preserve"> Por eso el Señor dijo: «No permanecerá mi espíritu en el ser humano para siempre, porque es un simple mortal; así que solo vivirá ciento veinte años».</w:t>
+        <w:t xml:space="preserve"> Por eso el Señor dijo: «No permanecerá mi espíritu en el ser humano para siempre, porque es un simple mortal; así que solo vivirá 120 años».</w:t>
       </w:r>
     </w:p>
     <w:p>
@@ -2898,7 +2898,7 @@
         <w:rPr>
           <w:lang w:val="es_ES" w:bidi="es_ES"/>
         </w:rPr>
-        <w:t xml:space="preserve"> Noé tuvo tres hijos: Sem, Cam y Jafet.</w:t>
+        <w:t xml:space="preserve"> Noé tuvo 3 hijos: Sem, Cam y Jafet.</w:t>
       </w:r>
     </w:p>
     <w:p>
@@ -2961,7 +2961,7 @@
         <w:rPr>
           <w:lang w:val="es_ES" w:bidi="es_ES"/>
         </w:rPr>
-        <w:t xml:space="preserve"> Debe tener ciento treinta y cinco metros de largo, veintidós metros y medio de ancho y trece metros y medio de alto.</w:t>
+        <w:t xml:space="preserve"> Debe tener 135 metros de largo, 22,5 metros de ancho y 13,5 metros de alto.</w:t>
       </w:r>
     </w:p>
     <w:p>
@@ -2982,7 +2982,7 @@
         <w:rPr>
           <w:lang w:val="es_ES" w:bidi="es_ES"/>
         </w:rPr>
-        <w:t xml:space="preserve"> Entre el techo y la pared alrededor de todo el barco deja un espacio libre de unos cuarenta y cinco centímetros para que entren la luz y el aire. Hazle tres cubiertas: una cubierta inferior, una intermedia y una superior, y ponle una puerta al costado.</w:t>
+        <w:t xml:space="preserve"> Entre el techo y la pared alrededor de todo el barco deja un espacio libre de unos 45 centímetros para que entren la luz y el aire. Hazle 3 cubiertas: 1 cubierta inferior, 1 intermedia y 1 superior, y ponle una puerta al costado.</w:t>
       </w:r>
     </w:p>
     <w:p>
@@ -3145,7 +3145,7 @@
         <w:rPr>
           <w:lang w:val="es_ES" w:bidi="es_ES"/>
         </w:rPr>
-        <w:t xml:space="preserve"> Lleva en el barco siete machos y siete hembras de todos los animales que se consideran puros; pero de los impuros lleva solo un macho y una hembra.</w:t>
+        <w:t xml:space="preserve"> Lleva en el barco 7 machos y 7 hembras de todos los animales que se consideran puros; pero de los impuros lleva solo un macho y una hembra.</w:t>
       </w:r>
     </w:p>
     <w:p>
@@ -3166,7 +3166,7 @@
         <w:rPr>
           <w:lang w:val="es_ES" w:bidi="es_ES"/>
         </w:rPr>
-        <w:t xml:space="preserve"> Lleva también siete machos y siete hembras de todas las aves del cielo, para conservar su especie.</w:t>
+        <w:t xml:space="preserve"> Lleva también 7 machos y 7 hembras de todas las aves del cielo, para conservar su especie.</w:t>
       </w:r>
     </w:p>
     <w:p>
@@ -3187,7 +3187,7 @@
         <w:rPr>
           <w:lang w:val="es_ES" w:bidi="es_ES"/>
         </w:rPr>
-        <w:t xml:space="preserve"> Dentro de siete días haré que llueva sobre la tierra durante cuarenta días y cuarenta noches, y será destruida toda clase de ser vivo».</w:t>
+        <w:t xml:space="preserve"> Dentro de 7 días haré que llueva sobre la tierra durante 40 días y 40 noches, y será destruida toda clase de ser vivo».</w:t>
       </w:r>
     </w:p>
     <w:p>
@@ -3229,7 +3229,7 @@
         <w:rPr>
           <w:lang w:val="es_ES" w:bidi="es_ES"/>
         </w:rPr>
-        <w:t xml:space="preserve"> Cuando comenzó el diluvio, Noé tenía seiscientos años.</w:t>
+        <w:t xml:space="preserve"> Cuando comenzó el diluvio, Noé tenía 600 años.</w:t>
       </w:r>
     </w:p>
     <w:p>
@@ -3271,7 +3271,7 @@
         <w:rPr>
           <w:lang w:val="es_ES" w:bidi="es_ES"/>
         </w:rPr>
-        <w:t xml:space="preserve"> Después de siete días, las aguas del diluvio comenzaron a inundar la tierra.</w:t>
+        <w:t xml:space="preserve"> Después de 7 días, las aguas del diluvio comenzaron a inundar la tierra.</w:t>
       </w:r>
     </w:p>
     <w:p>
@@ -3292,7 +3292,7 @@
         <w:rPr>
           <w:lang w:val="es_ES" w:bidi="es_ES"/>
         </w:rPr>
-        <w:t xml:space="preserve"> Eso ocurrió el día diecisiete del mes segundo del año en que Noé cumplió seiscientos años. Ese día se rompieron todas las fuentes del gran abismo, y se abrieron las compuertas del cielo, dejando caer una lluvia torrencial.</w:t>
+        <w:t xml:space="preserve"> Eso ocurrió el día 17 del mes segundo del año en que Noé cumplió 600 años. Ese día se rompieron todas las fuentes del gran abismo, y se abrieron las compuertas del cielo, dejando caer una lluvia torrencial.</w:t>
       </w:r>
     </w:p>
     <w:p>
@@ -3313,7 +3313,7 @@
         <w:rPr>
           <w:lang w:val="es_ES" w:bidi="es_ES"/>
         </w:rPr>
-        <w:t xml:space="preserve"> Llovió sin parar durante cuarenta días y cuarenta noches.</w:t>
+        <w:t xml:space="preserve"> Llovió sin parar durante 40 días y 40 noches.</w:t>
       </w:r>
     </w:p>
     <w:p>
@@ -3355,7 +3355,7 @@
         <w:rPr>
           <w:lang w:val="es_ES" w:bidi="es_ES"/>
         </w:rPr>
-        <w:t xml:space="preserve"> Con ellos entró en el barco toda clase de animales, domésticos y salvajes, reptiles y aves.</w:t>
+        <w:t xml:space="preserve"> Con ellos entró en el barco toda clase de animales, domésticos y salvajes, reptiles y aves,</w:t>
       </w:r>
     </w:p>
     <w:p>
@@ -3397,7 +3397,7 @@
         <w:rPr>
           <w:lang w:val="es_ES" w:bidi="es_ES"/>
         </w:rPr>
-        <w:t xml:space="preserve"> El diluvio duró cuarenta días. Cuando el nivel de las aguas subió, el barco comenzó a flotar sobre las aguas.</w:t>
+        <w:t xml:space="preserve"> El diluvio duró 40 días. Cuando el nivel de las aguas subió, el barco comenzó a flotar sobre las aguas.</w:t>
       </w:r>
     </w:p>
     <w:p>
@@ -3460,7 +3460,7 @@
         <w:rPr>
           <w:lang w:val="es_ES" w:bidi="es_ES"/>
         </w:rPr>
-        <w:t xml:space="preserve"> Subió unos siete metros por encima de las montañas.</w:t>
+        <w:t xml:space="preserve"> Subió unos 7 metros por encima de las montañas.</w:t>
       </w:r>
     </w:p>
     <w:p>
@@ -3523,7 +3523,7 @@
         <w:rPr>
           <w:lang w:val="es_ES" w:bidi="es_ES"/>
         </w:rPr>
-        <w:t xml:space="preserve"> Las aguas inundaron la tierra durante ciento cincuenta días.</w:t>
+        <w:t xml:space="preserve"> Las aguas inundaron la tierra durante 150 días.</w:t>
       </w:r>
     </w:p>
     <w:p>
@@ -3623,7 +3623,7 @@
         <w:rPr>
           <w:lang w:val="es_ES" w:bidi="es_ES"/>
         </w:rPr>
-        <w:t xml:space="preserve"> Así, el día diecisiete del mes séptimo el barco se posó sobre los montes de Ararat.</w:t>
+        <w:t xml:space="preserve"> Así, el día 17 del mes séptimo el barco se posó sobre los montes de Ararat.</w:t>
       </w:r>
     </w:p>
     <w:p>
@@ -3665,7 +3665,7 @@
         <w:rPr>
           <w:lang w:val="es_ES" w:bidi="es_ES"/>
         </w:rPr>
-        <w:t xml:space="preserve"> Después de cuarenta días, Noé abrió la ventana que había hecho en el barco</w:t>
+        <w:t xml:space="preserve"> Después de 40 días, Noé abrió la ventana que había hecho en el barco</w:t>
       </w:r>
     </w:p>
     <w:p>
@@ -3749,7 +3749,7 @@
         <w:rPr>
           <w:lang w:val="es_ES" w:bidi="es_ES"/>
         </w:rPr>
-        <w:t xml:space="preserve"> Esperó otros siete días y volvió a soltar la paloma.</w:t>
+        <w:t xml:space="preserve"> Esperó otros 7 días y volvió a soltar la paloma.</w:t>
       </w:r>
     </w:p>
     <w:p>
@@ -3791,7 +3791,7 @@
         <w:rPr>
           <w:lang w:val="es_ES" w:bidi="es_ES"/>
         </w:rPr>
-        <w:t xml:space="preserve"> Siete días después volvió a soltar la paloma, pero esta vez no regresó.</w:t>
+        <w:t xml:space="preserve"> Después de 7 días, volvió a soltar la paloma, pero esta vez no regresó.</w:t>
       </w:r>
     </w:p>
     <w:p>
@@ -3812,7 +3812,7 @@
         <w:rPr>
           <w:lang w:val="es_ES" w:bidi="es_ES"/>
         </w:rPr>
-        <w:t xml:space="preserve"> Noé tenía seiscientos un años de vida cuando las aguas se retiraron. El primer día del primer mes de ese año, Noé retiró el techo del barco y vio que la tierra estaba casi seca.</w:t>
+        <w:t xml:space="preserve"> Noé tenía 601 años de vida cuando las aguas se retiraron. El primer día del primer mes de ese año, Noé retiró el techo del barco y vio que la tierra estaba casi seca.</w:t>
       </w:r>
     </w:p>
     <w:p>
@@ -3833,7 +3833,7 @@
         <w:rPr>
           <w:lang w:val="es_ES" w:bidi="es_ES"/>
         </w:rPr>
-        <w:t xml:space="preserve"> El día veintisiete del mes segundo, la tierra ya estaba completamente seca.</w:t>
+        <w:t xml:space="preserve"> El día 27 del mes segundo, la tierra ya estaba completamente seca.</w:t>
       </w:r>
     </w:p>
     <w:p>
@@ -3875,7 +3875,7 @@
         <w:rPr>
           <w:lang w:val="es_ES" w:bidi="es_ES"/>
         </w:rPr>
-        <w:t xml:space="preserve"> «Ya pueden salir todos del barco. Saca a todos los animales, aves y reptiles para que se reproduzcan en abundancia y llenen la tierra».</w:t>
+        <w:t xml:space="preserve"> —Ya pueden salir todos del barco. Saca a todos los animales, aves y reptiles para que se reproduzcan en abundancia y llenen la tierra.</w:t>
       </w:r>
     </w:p>
     <w:p>
@@ -4017,7 +4017,7 @@
         <w:rPr>
           <w:lang w:val="es_ES" w:bidi="es_ES"/>
         </w:rPr>
-        <w:t xml:space="preserve"> Dios bendijo a Noé y a sus hijos con estas palabras: «¡Sean fructíferos, multiplíquense y vuelvan a llenar la tierra!</w:t>
+        <w:t xml:space="preserve"> Dios bendijo a Noé y a sus hijos con estas palabras: —¡Sean fructíferos, multiplíquense y vuelvan a llenar la tierra!</w:t>
       </w:r>
     </w:p>
     <w:p>
@@ -4143,7 +4143,7 @@
         <w:rPr>
           <w:lang w:val="es_ES" w:bidi="es_ES"/>
         </w:rPr>
-        <w:t xml:space="preserve"> Sean fructíferos y multiplíquense; sí, multiplíquense en la tierra y llénenla».</w:t>
+        <w:t xml:space="preserve"> Sean fructíferos y multiplíquense; sí, multiplíquense en la tierra y llénenla.</w:t>
       </w:r>
     </w:p>
     <w:p>
@@ -4185,7 +4185,7 @@
         <w:rPr>
           <w:lang w:val="es_ES" w:bidi="es_ES"/>
         </w:rPr>
-        <w:t xml:space="preserve"> Dios dijo también: «Habrá una señal del pacto que acabo de hacer con ustedes y con todos los animales.</w:t>
+        <w:t xml:space="preserve"> Dios dijo también:—Habrá una señal del pacto que acabo de hacer con ustedes y con todos los animales.</w:t>
       </w:r>
     </w:p>
     <w:p>
@@ -4227,7 +4227,7 @@
         <w:rPr>
           <w:lang w:val="es_ES" w:bidi="es_ES"/>
         </w:rPr>
-        <w:t xml:space="preserve"> Dios le dijo a Noé: «Esta es la señal del pacto que hago con todos los seres vivos de la tierra».</w:t>
+        <w:t xml:space="preserve"> Dios le dijo a Noé:—Esta es la señal del pacto que hago con todos los seres vivos de la tierra.</w:t>
       </w:r>
     </w:p>
     <w:p>
@@ -4248,7 +4248,7 @@
         <w:rPr>
           <w:lang w:val="es_ES" w:bidi="es_ES"/>
         </w:rPr>
-        <w:t xml:space="preserve"> Los tres hijos de Noé que salieron del barco fueron Sem, Cam y Jafet. Cam fue el padre de Canaán.</w:t>
+        <w:t xml:space="preserve"> Los 3 hijos de Noé que salieron del barco fueron Sem, Cam y Jafet. Cam fue el padre de Canaán.</w:t>
       </w:r>
     </w:p>
     <w:p>
@@ -4269,7 +4269,7 @@
         <w:rPr>
           <w:lang w:val="es_ES" w:bidi="es_ES"/>
         </w:rPr>
-        <w:t xml:space="preserve"> De estos tres hijos de Noé proceden todas las naciones de la tierra.</w:t>
+        <w:t xml:space="preserve"> De estos 3 hijos de Noé proceden todas las naciones de la tierra.</w:t>
       </w:r>
     </w:p>
     <w:p>
@@ -4374,7 +4374,7 @@
         <w:rPr>
           <w:lang w:val="es_ES" w:bidi="es_ES"/>
         </w:rPr>
-        <w:t xml:space="preserve"> Luego Noé dijo: «¡Bendito sea el Señor, Dios de Sem! ¡Que Canaán sea su esclavo!</w:t>
+        <w:t xml:space="preserve"> Luego Noé dijo:—¡Bendito sea el Señor, Dios de Sem! ¡Que Canaán sea su esclavo!</w:t>
       </w:r>
     </w:p>
     <w:p>
@@ -4395,7 +4395,7 @@
         <w:rPr>
           <w:lang w:val="es_ES" w:bidi="es_ES"/>
         </w:rPr>
-        <w:t xml:space="preserve"> ¡Que Dios entregue mucho territorio a Jafet, y habite Jafet en las tiendas de Sem! ¡Que Canaán sea su esclavo!».</w:t>
+        <w:t xml:space="preserve"> ¡Que Dios entregue mucho territorio a Jafet, y habite Jafet en las tiendas de Sem! ¡Que Canaán sea su esclavo!</w:t>
       </w:r>
     </w:p>
     <w:p>
@@ -4416,7 +4416,7 @@
         <w:rPr>
           <w:lang w:val="es_ES" w:bidi="es_ES"/>
         </w:rPr>
-        <w:t xml:space="preserve"> Noé vivió otros trescientos cincuenta años después del diluvio.</w:t>
+        <w:t xml:space="preserve"> Noé vivió otros 350 años después del diluvio.</w:t>
       </w:r>
     </w:p>
     <w:p>
@@ -4437,7 +4437,7 @@
         <w:rPr>
           <w:lang w:val="es_ES" w:bidi="es_ES"/>
         </w:rPr>
-        <w:t xml:space="preserve"> Murió a la edad de novecientos cincuenta años.</w:t>
+        <w:t xml:space="preserve"> Murió a la edad de 950 años.</w:t>
       </w:r>
     </w:p>
     <w:p>
@@ -5183,7 +5183,7 @@
         <w:rPr>
           <w:lang w:val="es_ES" w:bidi="es_ES"/>
         </w:rPr>
-        <w:t xml:space="preserve"> La siguiente es la lista de los descendientes de Sem. Dos años después del diluvio, cuando Sem tenía cien años, tuvo un hijo al que llamó Arfaxad.</w:t>
+        <w:t xml:space="preserve"> La siguiente es la lista de los descendientes de Sem. Dos años después del diluvio, cuando Sem tenía 100 años, tuvo un hijo al que llamó Arfaxad.</w:t>
       </w:r>
     </w:p>
     <w:p>
@@ -5204,7 +5204,7 @@
         <w:rPr>
           <w:lang w:val="es_ES" w:bidi="es_ES"/>
         </w:rPr>
-        <w:t xml:space="preserve"> Después del nacimiento de Arfaxad, Sem vivió quinientos años más y tuvo más hijos e hijas.</w:t>
+        <w:t xml:space="preserve"> Después del nacimiento de Arfaxad, Sem vivió 500 años más y tuvo más hijos e hijas.</w:t>
       </w:r>
     </w:p>
     <w:p>
@@ -5225,7 +5225,7 @@
         <w:rPr>
           <w:lang w:val="es_ES" w:bidi="es_ES"/>
         </w:rPr>
-        <w:t xml:space="preserve"> Arfaxad tenía treinta y cinco años cuando nació su hijo Selaj.</w:t>
+        <w:t xml:space="preserve"> Arfaxad tenía 35 años cuando nació su hijo Selaj.</w:t>
       </w:r>
     </w:p>
     <w:p>
@@ -5246,7 +5246,7 @@
         <w:rPr>
           <w:lang w:val="es_ES" w:bidi="es_ES"/>
         </w:rPr>
-        <w:t xml:space="preserve"> Después del nacimiento de Selaj, Arfaxad vivió cuatrocientos tres años más y tuvo más hijos e hijas.</w:t>
+        <w:t xml:space="preserve"> Después del nacimiento de Selaj, Arfaxad vivió 403 años más y tuvo más hijos e hijas.</w:t>
       </w:r>
     </w:p>
     <w:p>
@@ -5267,7 +5267,7 @@
         <w:rPr>
           <w:lang w:val="es_ES" w:bidi="es_ES"/>
         </w:rPr>
-        <w:t xml:space="preserve"> Selaj tenía treinta años cuando nació su hijo Éber.</w:t>
+        <w:t xml:space="preserve"> Selaj tenía 30 años cuando nació su hijo Éber.</w:t>
       </w:r>
     </w:p>
     <w:p>
@@ -5288,7 +5288,7 @@
         <w:rPr>
           <w:lang w:val="es_ES" w:bidi="es_ES"/>
         </w:rPr>
-        <w:t xml:space="preserve"> Después del nacimiento de Éber, Selaj vivió cuatrocientos tres años más y tuvo más hijos e hijas.</w:t>
+        <w:t xml:space="preserve"> Después del nacimiento de Éber, Selaj vivió 403 años más y tuvo más hijos e hijas.</w:t>
       </w:r>
     </w:p>
     <w:p>
@@ -5309,7 +5309,7 @@
         <w:rPr>
           <w:lang w:val="es_ES" w:bidi="es_ES"/>
         </w:rPr>
-        <w:t xml:space="preserve"> Éber tenía treinta y cuatro años cuando nació su hijo Péleg.</w:t>
+        <w:t xml:space="preserve"> Éber tenía 34 años cuando nació su hijo Péleg.</w:t>
       </w:r>
     </w:p>
     <w:p>
@@ -5330,7 +5330,7 @@
         <w:rPr>
           <w:lang w:val="es_ES" w:bidi="es_ES"/>
         </w:rPr>
-        <w:t xml:space="preserve"> Después del nacimiento de Péleg, Éber vivió cuatrocientos treinta años más y tuvo más hijos e hijas.</w:t>
+        <w:t xml:space="preserve"> Después del nacimiento de Péleg, Éber vivió 430 años más y tuvo más hijos e hijas.</w:t>
       </w:r>
     </w:p>
     <w:p>
@@ -5351,7 +5351,7 @@
         <w:rPr>
           <w:lang w:val="es_ES" w:bidi="es_ES"/>
         </w:rPr>
-        <w:t xml:space="preserve"> Péleg tenía treinta años cuando nació su hijo Reú.</w:t>
+        <w:t xml:space="preserve"> Péleg tenía 30 años cuando nació su hijo Reú.</w:t>
       </w:r>
     </w:p>
     <w:p>
@@ -5372,7 +5372,7 @@
         <w:rPr>
           <w:lang w:val="es_ES" w:bidi="es_ES"/>
         </w:rPr>
-        <w:t xml:space="preserve"> Después del nacimiento de Reú, Péleg vivió doscientos nueve años más y tuvo más hijos e hijas.</w:t>
+        <w:t xml:space="preserve"> Después del nacimiento de Reú, Péleg vivió 209 años más y tuvo más hijos e hijas.</w:t>
       </w:r>
     </w:p>
     <w:p>
@@ -5393,7 +5393,7 @@
         <w:rPr>
           <w:lang w:val="es_ES" w:bidi="es_ES"/>
         </w:rPr>
-        <w:t xml:space="preserve"> Reú tenía treinta y dos años cuando nació su hijo Serug.</w:t>
+        <w:t xml:space="preserve"> Reú tenía 32 años cuando nació su hijo Serug.</w:t>
       </w:r>
     </w:p>
     <w:p>
@@ -5456,7 +5456,7 @@
         <w:rPr>
           <w:lang w:val="es_ES" w:bidi="es_ES"/>
         </w:rPr>
-        <w:t xml:space="preserve"> Después del nacimiento de Najor, Serug vivió doscientos años más y tuvo más hijos e hijas.</w:t>
+        <w:t xml:space="preserve"> Después del nacimiento de Najor, Serug vivió 200 años más y tuvo más hijos e hijas.</w:t>
       </w:r>
     </w:p>
     <w:p>
@@ -5477,7 +5477,7 @@
         <w:rPr>
           <w:lang w:val="es_ES" w:bidi="es_ES"/>
         </w:rPr>
-        <w:t xml:space="preserve"> Najor tenía veintinueve años cuando nació su hijo Téraj.</w:t>
+        <w:t xml:space="preserve"> Najor tenía 29 años cuando nació su hijo Téraj.</w:t>
       </w:r>
     </w:p>
     <w:p>
@@ -5498,7 +5498,7 @@
         <w:rPr>
           <w:lang w:val="es_ES" w:bidi="es_ES"/>
         </w:rPr>
-        <w:t xml:space="preserve"> Después del nacimiento de Téraj, Najor vivió ciento diecinueve años más y tuvo más hijos e hijas.</w:t>
+        <w:t xml:space="preserve"> Después del nacimiento de Téraj, Najor vivió 119 años más y tuvo más hijos e hijas.</w:t>
       </w:r>
     </w:p>
     <w:p>
@@ -5519,7 +5519,7 @@
         <w:rPr>
           <w:lang w:val="es_ES" w:bidi="es_ES"/>
         </w:rPr>
-        <w:t xml:space="preserve"> Téraj tenía setenta años cuando tuvo a sus hijos Abrán, Najor y Aram.</w:t>
+        <w:t xml:space="preserve"> Téraj tenía 70 años cuando tuvo a sus hijos Abrán, Najor y Aram.</w:t>
       </w:r>
     </w:p>
     <w:p>
@@ -5645,7 +5645,7 @@
         <w:rPr>
           <w:lang w:val="es_ES" w:bidi="es_ES"/>
         </w:rPr>
-        <w:t xml:space="preserve"> Allí en Jarán murió Téraj, a la edad de doscientos cinco años.</w:t>
+        <w:t xml:space="preserve"> Allí en Jarán murió Téraj, a la edad de 205 años.</w:t>
       </w:r>
     </w:p>
     <w:p>
@@ -5745,7 +5745,7 @@
         <w:rPr>
           <w:lang w:val="es_ES" w:bidi="es_ES"/>
         </w:rPr>
-        <w:t xml:space="preserve"> Tal como el Señor le había dicho, Abram salió de Jarán, y Lot fue con él. Abram tenía entonces setenta y cinco años.</w:t>
+        <w:t xml:space="preserve"> Tal como el Señor le había dicho, Abram salió de Jarán, y Lot fue con él. Abram tenía entonces 75 años.</w:t>
       </w:r>
     </w:p>
     <w:p>
@@ -6638,7 +6638,7 @@
         <w:rPr>
           <w:lang w:val="es_ES" w:bidi="es_ES"/>
         </w:rPr>
-        <w:t xml:space="preserve"> Entonces salieron el rey de Sodoma, el rey de Gomorra, el rey de Admá, el rey de Zeboyín y el rey de Bela, también llamada Zoar. Lucharon contra ellos en el valle de Sidín:</w:t>
+        <w:t xml:space="preserve"> Entonces salieron el rey de Sodoma, el rey de Gomorra, el rey de Admá, el rey de Zeboyín y el rey de Bela, también llamada Zoar. Lucharon contra ellos en el valle de Sidín.</w:t>
       </w:r>
     </w:p>
     <w:p>
@@ -7137,7 +7137,7 @@
         <w:rPr>
           <w:lang w:val="es_ES" w:bidi="es_ES"/>
         </w:rPr>
-        <w:t xml:space="preserve"> Entonces el Señor le dijo: ―Tráeme una ternera de tres años, una cabra de tres años y un carnero de tres años, y una tórtola y un pichón.</w:t>
+        <w:t xml:space="preserve"> Entonces el Señor le dijo: ―Tráeme una ternera de 3 años, una cabra de 3 años y un carnero de 3 años, y una tórtola y un pichón.</w:t>
       </w:r>
     </w:p>
     <w:p>
@@ -7221,7 +7221,7 @@
         <w:rPr>
           <w:lang w:val="es_ES" w:bidi="es_ES"/>
         </w:rPr>
-        <w:t xml:space="preserve"> Entonces el Señor le dijo: ―Debes saber que tus descendientes vivirán como extranjeros en una tierra que no es la suya, y serán esclavizados y maltratados durante cuatrocientos años.</w:t>
+        <w:t xml:space="preserve"> Entonces el Señor le dijo: ―Debes saber que tus descendientes vivirán como extranjeros en una tierra que no es la suya, y serán esclavizados y maltratados durante 400 años.</w:t>
       </w:r>
     </w:p>
     <w:p>
@@ -7284,7 +7284,7 @@
         <w:rPr>
           <w:lang w:val="es_ES" w:bidi="es_ES"/>
         </w:rPr>
-        <w:t xml:space="preserve"> Después de cuatro generaciones, tus descendientes regresarán aquí, pues la maldad de los amorreos no habrá llegado a su colmo hasta entonces.</w:t>
+        <w:t xml:space="preserve"> Después de 4 generaciones, tus descendientes regresarán aquí, pues la maldad de los amorreos no habrá llegado a su colmo hasta entonces.</w:t>
       </w:r>
     </w:p>
     <w:p>
@@ -7426,7 +7426,7 @@
         <w:rPr>
           <w:lang w:val="es_ES" w:bidi="es_ES"/>
         </w:rPr>
-        <w:t xml:space="preserve"> Así que le dijo a Abram: —Mira, el Señor no me ha permitido tener hijos. Acuéstate con mi sierva, y tal vez por medio de ella pueda tener descendencia. Abram aceptó.</w:t>
+        <w:t xml:space="preserve"> Entonces Saray tomó a su sierva Agar la egipcia y se la entregó. Llevaban diez años viviendo en Canaán cuando sucedió esto.</w:t>
       </w:r>
     </w:p>
     <w:p>
@@ -7699,7 +7699,7 @@
         <w:rPr>
           <w:lang w:val="es_ES" w:bidi="es_ES"/>
         </w:rPr>
-        <w:t xml:space="preserve"> Abram tenía ochenta y seis años cuando nació Ismael.</w:t>
+        <w:t xml:space="preserve"> Abram tenía 86 años cuando nació Ismael.</w:t>
       </w:r>
     </w:p>
     <w:p>
@@ -7736,7 +7736,7 @@
         <w:rPr>
           <w:lang w:val="es_ES" w:bidi="es_ES"/>
         </w:rPr>
-        <w:t xml:space="preserve"> Cuando Abram tenía noventa y nueve años, el Señor se le apareció y le dijo: —Yo soy el Dios Todopoderoso. Camina delante de mí y sé íntegro.</w:t>
+        <w:t xml:space="preserve"> Cuando Abram tenía 99 años, el Señor se le apareció y le dijo: —Yo soy el Dios Todopoderoso. Camina delante de mí y sé íntegro.</w:t>
       </w:r>
     </w:p>
     <w:p>
@@ -8198,7 +8198,7 @@
         <w:rPr>
           <w:lang w:val="es_ES" w:bidi="es_ES"/>
         </w:rPr>
-        <w:t xml:space="preserve"> Abraham tenía noventa y nueve años cuando fue circuncidado,</w:t>
+        <w:t xml:space="preserve"> Abraham tenía 99 años cuando fue circuncidado,</w:t>
       </w:r>
     </w:p>
     <w:p>
@@ -8298,7 +8298,7 @@
         <w:rPr>
           <w:lang w:val="es_ES" w:bidi="es_ES"/>
         </w:rPr>
-        <w:t xml:space="preserve"> Abraham levantó la mirada y vio a tres hombres de pie frente a él. Entonces corrió desde la entrada de su tienda a saludarlos. Se inclinó rostro en tierra,</w:t>
+        <w:t xml:space="preserve"> Abraham levantó la mirada y vio a 3 hombres de pie frente a él. Entonces corrió desde la entrada de su tienda a saludarlos. Se inclinó rostro en tierra,</w:t>
       </w:r>
     </w:p>
     <w:p>
@@ -8718,7 +8718,7 @@
         <w:rPr>
           <w:lang w:val="es_ES" w:bidi="es_ES"/>
         </w:rPr>
-        <w:t xml:space="preserve"> Dos de los varones siguieron su camino hacia Sodoma, pero Abraham se quedó de pie delante del Señor.</w:t>
+        <w:t xml:space="preserve"> Siguieron su camino hacia Sodoma 2 de los varones, pero Abraham se quedó de pie delante del Señor.</w:t>
       </w:r>
     </w:p>
     <w:p>
@@ -8739,7 +8739,7 @@
         <w:rPr>
           <w:lang w:val="es_ES" w:bidi="es_ES"/>
         </w:rPr>
-        <w:t xml:space="preserve"> ¿Y si hay cincuenta justos en la ciudad? ¿De verdad exterminarás y no perdonarás la ciudad por amor a los cincuenta justos que hay en ella?</w:t>
+        <w:t xml:space="preserve"> —¿Y si hay 50 justos en la ciudad? ¿De verdad exterminarás y no perdonarás la ciudad por amor a los 50 justos que hay en ella?</w:t>
       </w:r>
     </w:p>
     <w:p>
@@ -8781,7 +8781,7 @@
         <w:rPr>
           <w:lang w:val="es_ES" w:bidi="es_ES"/>
         </w:rPr>
-        <w:t xml:space="preserve"> El Señor le contestó: —Si encuentro cincuenta justos en Sodoma, perdonaré toda la ciudad por causa de ellos.</w:t>
+        <w:t xml:space="preserve"> El Señor le contestó: —Si encuentro 50 justos en Sodoma, perdonaré toda la ciudad por causa de ellos.</w:t>
       </w:r>
     </w:p>
     <w:p>
@@ -8823,7 +8823,7 @@
         <w:rPr>
           <w:lang w:val="es_ES" w:bidi="es_ES"/>
         </w:rPr>
-        <w:t xml:space="preserve"> Quizá falten cinco para llegar a los cincuenta justos. ¿Destruirías la ciudad por faltar esos cinco? El Señor le dijo: —Si encontrara en la ciudad cuarenta y cinco justos, no la destruiría.</w:t>
+        <w:t xml:space="preserve"> Quizá falten 5 para llegar a los 50 justos. ¿Destruirías la ciudad por faltar esos 5? El Señor le dijo: —Si encontrara en la ciudad 45 justos, no la destruiría.</w:t>
       </w:r>
     </w:p>
     <w:p>
@@ -8844,7 +8844,7 @@
         <w:rPr>
           <w:lang w:val="es_ES" w:bidi="es_ES"/>
         </w:rPr>
-        <w:t xml:space="preserve"> Abraham continuó: —Quizá se encuentren allí cuarenta. Y el Señor le respondió: —No la destruiría, por causa de esos cuarenta.</w:t>
+        <w:t xml:space="preserve"> Abraham continuó: —Quizá se encuentren allí 40. Y el Señor le respondió: —No la destruiría, por causa de esos 40.</w:t>
       </w:r>
     </w:p>
     <w:p>
@@ -8865,7 +8865,7 @@
         <w:rPr>
           <w:lang w:val="es_ES" w:bidi="es_ES"/>
         </w:rPr>
-        <w:t xml:space="preserve"> —No te enojes conmigo, mi Señor —le rogó Abraham—, pero deja que insista: quizá se encuentren allí treinta. Y el Señor le dijo: —No destruiré la ciudad si encuentro en ella treinta justos.</w:t>
+        <w:t xml:space="preserve"> —No te enojes conmigo, mi Señor —le rogó Abraham—, pero deja que insista: quizá se encuentren allí 30. Y el Señor le dijo: —No destruiré la ciudad si encuentro en ella 30 justos.</w:t>
       </w:r>
     </w:p>
     <w:p>
@@ -8886,7 +8886,7 @@
         <w:rPr>
           <w:lang w:val="es_ES" w:bidi="es_ES"/>
         </w:rPr>
-        <w:t xml:space="preserve"> Abraham siguió: —Me atreveré a insistir a mi Señor: quizá se encuentren allí veinte. Y el Señor le contestó: —No la destruiré, por causa de los veinte.</w:t>
+        <w:t xml:space="preserve"> Abraham siguió: —Me atreveré a insistir a mi Señor: quizá se encuentren allí 20. Y el Señor le contestó: —No la destruiré, por causa de los 20.</w:t>
       </w:r>
     </w:p>
     <w:p>
@@ -8907,7 +8907,7 @@
         <w:rPr>
           <w:lang w:val="es_ES" w:bidi="es_ES"/>
         </w:rPr>
-        <w:t xml:space="preserve"> Finalmente, Abraham dijo: —No te enojes, Señor. Esto es lo último que te digo: quizá se encuentren allí diez. Y el Señor le dijo: —No la destruiré, por causa de los diez.</w:t>
+        <w:t xml:space="preserve"> Finalmente, Abraham dijo: —No te enojes, Señor. Esto es lo último que te digo: quizá se encuentren allí 10. Y el Señor le dijo: —No la destruiré, por causa de los 10.</w:t>
       </w:r>
     </w:p>
     <w:p>
@@ -9112,7 +9112,7 @@
         <w:rPr>
           <w:lang w:val="es_ES" w:bidi="es_ES"/>
         </w:rPr>
-        <w:t xml:space="preserve"> Miren, tengo dos hijas vírgenes. Las sacaré y podrán hacer con ellas lo que les parezca. Pero no hagan nada a estos hombres, pues han venido a hospedarse bajo mi techo.</w:t>
+        <w:t xml:space="preserve"> Miren, tengo 2 hijas vírgenes. Las sacaré y podrán hacer con ellas lo que les parezca. Pero no hagan nada a estos hombres, pues han venido a hospedarse bajo mi techo.</w:t>
       </w:r>
     </w:p>
     <w:p>
@@ -9154,7 +9154,7 @@
         <w:rPr>
           <w:lang w:val="es_ES" w:bidi="es_ES"/>
         </w:rPr>
-        <w:t xml:space="preserve"> Pero los dos varones agarraron a Lot, lo metieron en la casa y cerraron la puerta.</w:t>
+        <w:t xml:space="preserve"> Pero los 2 varones agarraron a Lot, lo metieron en la casa y cerraron la puerta.</w:t>
       </w:r>
     </w:p>
     <w:p>
@@ -9280,7 +9280,7 @@
         <w:rPr>
           <w:lang w:val="es_ES" w:bidi="es_ES"/>
         </w:rPr>
-        <w:t xml:space="preserve"> Pero Lot titubeaba, así que los hombres lo tomaron de la mano, junto con su esposa y sus dos hijas. Los sacaron y los dejaron fuera de la ciudad, porque el Señor les tuvo misericordia.</w:t>
+        <w:t xml:space="preserve"> Pero Lot titubeaba, así que los hombres lo tomaron de la mano, junto con su esposa y sus 2 hijas. Los sacaron y los dejaron fuera de la ciudad, porque el Señor les tuvo misericordia.</w:t>
       </w:r>
     </w:p>
     <w:p>
@@ -9658,7 +9658,7 @@
         <w:rPr>
           <w:lang w:val="es_ES" w:bidi="es_ES"/>
         </w:rPr>
-        <w:t xml:space="preserve"> Y las dos hijas de Lot quedaron embarazadas de su padre.</w:t>
+        <w:t xml:space="preserve"> Y las 2 hijas de Lot quedaron embarazadas de su padre.</w:t>
       </w:r>
     </w:p>
     <w:p>
@@ -10635,7 +10635,7 @@
         <w:rPr>
           <w:lang w:val="es_ES" w:bidi="es_ES"/>
         </w:rPr>
-        <w:t xml:space="preserve"> Entonces Abraham tomó ovejas y vacas y se las dio a Abimélec. Y los dos hicieron un pacto.</w:t>
+        <w:t xml:space="preserve"> Entonces Abraham tomó ovejas y vacas y se las dio a Abimélec. Y los 2 hicieron un pacto.</w:t>
       </w:r>
     </w:p>
     <w:p>
@@ -10656,7 +10656,7 @@
         <w:rPr>
           <w:lang w:val="es_ES" w:bidi="es_ES"/>
         </w:rPr>
-        <w:t xml:space="preserve"> Abraham apartó siete corderas del rebaño.</w:t>
+        <w:t xml:space="preserve"> Abraham apartó 7 corderas del rebaño.</w:t>
       </w:r>
     </w:p>
     <w:p>
@@ -10677,7 +10677,7 @@
         <w:rPr>
           <w:lang w:val="es_ES" w:bidi="es_ES"/>
         </w:rPr>
-        <w:t xml:space="preserve"> Entonces Abimélec le preguntó: —¿Para qué son esas siete corderas que has apartado?</w:t>
+        <w:t xml:space="preserve"> Entonces Abimélec le preguntó: —¿Para qué son esas 7 corderas que has apartado?</w:t>
       </w:r>
     </w:p>
     <w:p>
@@ -10719,7 +10719,7 @@
         <w:rPr>
           <w:lang w:val="es_ES" w:bidi="es_ES"/>
         </w:rPr>
-        <w:t xml:space="preserve"> Desde ese momento, ese lugar se llamó Berseba,Berseba: En hebreo, Berseba quiere decir pozo del juramento opozo de los siete." class="footnote-marker"&gt;1 porque allí los dos hicieron un juramento.</w:t>
+        <w:t xml:space="preserve"> Desde ese momento, ese lugar se llamó Berseba,1 porque allí los 2 hicieron un juramento.</w:t>
       </w:r>
     </w:p>
     <w:p>
@@ -11276,7 +11276,7 @@
         <w:rPr>
           <w:lang w:val="es_ES" w:bidi="es_ES"/>
         </w:rPr>
-        <w:t xml:space="preserve"> Sara vivió ciento veintisiete años</w:t>
+        <w:t xml:space="preserve"> Sara vivió 127 años</w:t>
       </w:r>
     </w:p>
     <w:p>
@@ -11570,7 +11570,7 @@
         <w:rPr>
           <w:lang w:val="es_ES" w:bidi="es_ES"/>
         </w:rPr>
-        <w:t xml:space="preserve"> —Señor mío, escúchame. El terreno vale cuatrocientas monedas de plata. Pero ¿qué importancia tiene esa cantidad para nosotros? Ve y entierra a tu esposa.</w:t>
+        <w:t xml:space="preserve"> —Señor mío, escúchame. El terreno vale 400 monedas de plata. Pero ¿qué importancia tiene esa cantidad para nosotros? Ve y entierra a tu esposa.</w:t>
       </w:r>
     </w:p>
     <w:p>
@@ -11591,7 +11591,7 @@
         <w:rPr>
           <w:lang w:val="es_ES" w:bidi="es_ES"/>
         </w:rPr>
-        <w:t xml:space="preserve"> Abraham se puso de acuerdo con Efrón. Pesó para él la cantidad de plata que había mencionado delante de los hititas, cuatrocientas monedas, conforme al peso habitual de los comerciantes.</w:t>
+        <w:t xml:space="preserve"> Abraham se puso de acuerdo con Efrón. Pesó para él la cantidad de plata que había mencionado delante de los hititas, 400 monedas, conforme al peso habitual de los comerciantes.</w:t>
       </w:r>
     </w:p>
     <w:p>
@@ -11901,7 +11901,7 @@
         <w:rPr>
           <w:lang w:val="es_ES" w:bidi="es_ES"/>
         </w:rPr>
-        <w:t xml:space="preserve"> Luego tomó diez camellos de Abraham y los cargó con toda clase de regalos de su amo. Emprendió camino hacia Aram Najarayin, a la ciudad de Najor.</w:t>
+        <w:t xml:space="preserve"> Luego tomó 10 camellos de Abraham y los cargó con toda clase de regalos de su amo. Emprendió camino hacia Aram Najarayin, a la ciudad de Najor.</w:t>
       </w:r>
     </w:p>
     <w:p>
@@ -12153,7 +12153,7 @@
         <w:rPr>
           <w:lang w:val="es_ES" w:bidi="es_ES"/>
         </w:rPr>
-        <w:t xml:space="preserve"> Cuando los camellos terminaron de beber, el hombre tomó un anillo de oro para la nariz, de unos seis gramos de peso, y se lo puso a Rebeca. También le puso en las manos dos pulseras de oro, que pesaban unos 115 gramos.</w:t>
+        <w:t xml:space="preserve"> Cuando los camellos terminaron de beber, el hombre tomó un anillo de oro para la nariz, de unos 6 gramos de peso, y se lo puso a Rebeca. También le puso en las manos 2 pulseras de oro, que pesaban unos 115 gramos.</w:t>
       </w:r>
     </w:p>
     <w:p>
@@ -12258,7 +12258,7 @@
         <w:rPr>
           <w:lang w:val="es_ES" w:bidi="es_ES"/>
         </w:rPr>
-        <w:t xml:space="preserve"> dijo: «Bendito sea el Señor, Dios de mi señor Abraham, que no ha dejado de mostrarle su misericordia y su fidelidad. El Señor me ha guiado a la casa de los familiares de mi amo».</w:t>
+        <w:t xml:space="preserve"> dijo:—Bendito sea el Señor, Dios de mi señor Abraham, que no ha dejado de mostrarle su misericordia y su fidelidad. El Señor me ha guiado a la casa de los familiares de mi amo.</w:t>
       </w:r>
     </w:p>
     <w:p>
@@ -12804,7 +12804,7 @@
         <w:rPr>
           <w:lang w:val="es_ES" w:bidi="es_ES"/>
         </w:rPr>
-        <w:t xml:space="preserve"> Pero el hermano y la madre de Rebeca dijeron: —Que la joven se quede con nosotros diez días más. Después de eso podrá irse.</w:t>
+        <w:t xml:space="preserve"> Pero el hermano y la madre de Rebeca dijeron: —Que la joven se quede con nosotros 10 días más. Después de eso podrá irse.</w:t>
       </w:r>
     </w:p>
     <w:p>
@@ -13219,7 +13219,7 @@
         <w:rPr>
           <w:lang w:val="es_ES" w:bidi="es_ES"/>
         </w:rPr>
-        <w:t xml:space="preserve"> Abraham vivió ciento setenta y cinco años.</w:t>
+        <w:t xml:space="preserve"> Abraham vivió ciento 75 años.</w:t>
       </w:r>
     </w:p>
     <w:p>
@@ -13303,7 +13303,7 @@
         <w:rPr>
           <w:lang w:val="es_ES" w:bidi="es_ES"/>
         </w:rPr>
-        <w:t xml:space="preserve"> Estos fueron y así se llamaban los doce hijos de Ismael. Así los conocían en sus campamentos y en sus tiendas. Fueron doce jefes de doce tribus.</w:t>
+        <w:t xml:space="preserve"> Estos fueron y así se llamaban los 12 hijos de Ismael. Así los conocían en sus campamentos y en sus tiendas. Fueron 12 jefes de 12 tribus.</w:t>
       </w:r>
     </w:p>
     <w:p>
@@ -13324,7 +13324,7 @@
         <w:rPr>
           <w:lang w:val="es_ES" w:bidi="es_ES"/>
         </w:rPr>
-        <w:t xml:space="preserve"> Ismael vivió ciento treinta y siete años. Murió y fue a reunirse con sus antepasados.</w:t>
+        <w:t xml:space="preserve"> Ismael vivió 137 años. Murió y fue a reunirse con sus antepasados.</w:t>
       </w:r>
     </w:p>
     <w:p>
@@ -13387,7 +13387,7 @@
         <w:rPr>
           <w:lang w:val="es_ES" w:bidi="es_ES"/>
         </w:rPr>
-        <w:t xml:space="preserve"> Isaac tenía cuarenta años cuando se casó con Rebeca, hija de Betuel de Padán Aram y hermana de Labán. Su padre y su hermano eran arameos.</w:t>
+        <w:t xml:space="preserve"> Isaac tenía 40 años cuando se casó con Rebeca, hija de Betuel de Padán Aram y hermana de Labán. Su padre y su hermano eran arameos.</w:t>
       </w:r>
     </w:p>
     <w:p>
@@ -13450,7 +13450,7 @@
         <w:rPr>
           <w:lang w:val="es_ES" w:bidi="es_ES"/>
         </w:rPr>
-        <w:t xml:space="preserve"> Y Dios le dijo: —En tu vientre hay dos naciones, dos pueblos separados desde tus entrañas. Uno será más fuerte que el otro, y el menor servirá al mayor.</w:t>
+        <w:t xml:space="preserve"> Y Dios le dijo: —En tu vientre hay dos naciones, 2 pueblos separados desde tus entrañas. Uno será más fuerte que el otro, y el menor servirá al mayor.</w:t>
       </w:r>
     </w:p>
     <w:p>
@@ -14432,7 +14432,7 @@
         <w:rPr>
           <w:lang w:val="es_ES" w:bidi="es_ES"/>
         </w:rPr>
-        <w:t xml:space="preserve"> Estas dos mujeres fueron una fuente de disgustos para Isaac y Rebeca.</w:t>
+        <w:t xml:space="preserve"> Estas 2 mujeres fueron una fuente de disgustos para Isaac y Rebeca.</w:t>
       </w:r>
     </w:p>
     <w:p>
@@ -15808,7 +15808,7 @@
         <w:rPr>
           <w:lang w:val="es_ES" w:bidi="es_ES"/>
         </w:rPr>
-        <w:t xml:space="preserve"> Jacob hizo esta promesa: «Si Dios está conmigo y me guarda en este camino, si me da alimento y vestido,</w:t>
+        <w:t xml:space="preserve"> Jacob hizo esta promesa: «Si Dios está conmigo y me guarda en este camino, si me da alimento y vestido, y regreso en paz a la casa de mi padre, entonces el Señor será mi Dios. Esta piedra que he puesto como monumento recordatorio será casa de Dios. Y le daré a Dios la décima parte de todo lo que me dé».</w:t>
       </w:r>
     </w:p>
     <w:p>
@@ -15866,7 +15866,7 @@
         <w:rPr>
           <w:lang w:val="es_ES" w:bidi="es_ES"/>
         </w:rPr>
-        <w:t xml:space="preserve"> Vio un pozo en el campo. Había tres rebaños de ovejas reposando allí, porque abrevaban en ese pozo. El pozo estaba tapado con una piedra muy grande.</w:t>
+        <w:t xml:space="preserve"> Vio un pozo en el campo. Había 3 rebaños de ovejas reposando allí, porque abrevaban en ese pozo. El pozo estaba tapado con una piedra muy grande.</w:t>
       </w:r>
     </w:p>
     <w:p>
@@ -16160,7 +16160,7 @@
         <w:rPr>
           <w:lang w:val="es_ES" w:bidi="es_ES"/>
         </w:rPr>
-        <w:t xml:space="preserve"> Labán tenía dos hijas. La mayor se llamaba Lea y la menor, Raquel.</w:t>
+        <w:t xml:space="preserve"> Labán tenía 2 hijas. La mayor se llamaba Lea y la menor, Raquel.</w:t>
       </w:r>
     </w:p>
     <w:p>
@@ -16391,7 +16391,7 @@
         <w:rPr>
           <w:lang w:val="es_ES" w:bidi="es_ES"/>
         </w:rPr>
-        <w:t xml:space="preserve"> Cumple con la semana de bodas de Lea y, a cambio de que trabajes siete años más para mí, te entregaré también a Raquel.</w:t>
+        <w:t xml:space="preserve"> Cumple con la semana de bodas de Lea y, a cambio de que trabajes 7 años más para mí, te entregaré también a Raquel.</w:t>
       </w:r>
     </w:p>
     <w:p>
@@ -16454,7 +16454,7 @@
         <w:rPr>
           <w:lang w:val="es_ES" w:bidi="es_ES"/>
         </w:rPr>
-        <w:t xml:space="preserve"> Jacob se acostó con Raquel y la amó más que a Lea. Y trabajó otros siete años para Labán.</w:t>
+        <w:t xml:space="preserve"> Jacob se acostó con Raquel y la amó más que a Lea. Y trabajó otros 7 años para Labán.</w:t>
       </w:r>
     </w:p>
     <w:p>
@@ -16995,7 +16995,7 @@
         <w:rPr>
           <w:lang w:val="es_ES" w:bidi="es_ES"/>
         </w:rPr>
-        <w:t xml:space="preserve"> Lea dijo: «Dios me ha hecho un buen regalo. Esta vez mi marido me honrará, pues le he dado seis hijos». Por eso lo llamó Zabulón.Zabulón: Suena parecido al verbo hebreo que significa honrar." class="footnote-marker"&gt;6</w:t>
+        <w:t xml:space="preserve"> Lea dijo: «Dios me ha hecho un buen regalo. Esta vez mi marido me honrará, pues le he dado 6 hijos». Por eso lo llamó Zabulón.6</w:t>
       </w:r>
     </w:p>
     <w:p>
@@ -17184,7 +17184,7 @@
         <w:rPr>
           <w:lang w:val="es_ES" w:bidi="es_ES"/>
         </w:rPr>
-        <w:t xml:space="preserve"> Porque lo poco que tenías antes de mi llegada se ha multiplicado, y el Señor te ha bendecido gracias a mí. Ahora es el momento de que yo haga algo también por mi propia familia.</w:t>
+        <w:t xml:space="preserve"> Lo poco que tenías antes de mi llegada se ha multiplicado, y el Señor te ha bendecido gracias a mí. Ahora es el momento de que yo haga algo también por mi propia familia.</w:t>
       </w:r>
     </w:p>
     <w:p>
@@ -18124,7 +18124,7 @@
         <w:rPr>
           <w:lang w:val="es_ES" w:bidi="es_ES"/>
         </w:rPr>
-        <w:t xml:space="preserve"> Veinte años he estado contigo; he cuidado tus ovejas y tus cabras, y ninguna de tus ovejas se perdió, ni jamás me comí un carnero de tu rebaño.</w:t>
+        <w:t xml:space="preserve"> Durante 20 años he estado contigo. He cuidado tus ovejas y tus cabras, y ninguna de tus ovejas se perdió, ni jamás me comí un carnero de tu rebaño.</w:t>
       </w:r>
     </w:p>
     <w:p>
@@ -18187,7 +18187,7 @@
         <w:rPr>
           <w:lang w:val="es_ES" w:bidi="es_ES"/>
         </w:rPr>
-        <w:t xml:space="preserve"> Veinte años: catorce para pagar por tus dos hijas y seis por tu ganado; y me cambiaste el salario diez veces.</w:t>
+        <w:t xml:space="preserve"> Durante 20 años: 14 para pagar por tus 2 hijas y 6 por tu ganado. Y me cambiaste el salario 10 veces.</w:t>
       </w:r>
     </w:p>
     <w:p>
@@ -18376,7 +18376,7 @@
         <w:rPr>
           <w:lang w:val="es_ES" w:bidi="es_ES"/>
         </w:rPr>
-        <w:t xml:space="preserve"> Si maltratas a mis hijas, o si tomas mujeres, Dios es testigo entre tú y yo, aunque no haya ningún hombre que lo sea.</w:t>
+        <w:t xml:space="preserve"> Si maltratas a mis hijas, o si tomas mujeres, Dios es testigo entre tú y yo, aunque no haya ningún ser humano que lo sea.</w:t>
       </w:r>
     </w:p>
     <w:p>
@@ -18539,7 +18539,7 @@
         <w:rPr>
           <w:lang w:val="es_ES" w:bidi="es_ES"/>
         </w:rPr>
-        <w:t xml:space="preserve"> Luego Jacob envió mensajeros a su hermano Esaú, que estaba en la tierra de Seir, en los campos de Edom,</w:t>
+        <w:t xml:space="preserve"> Luego Jacob envió mensajeros a su hermano Esaú, que estaba en la tierra de Seír, en los campos de Edom,</w:t>
       </w:r>
     </w:p>
     <w:p>
@@ -18728,7 +18728,7 @@
         <w:rPr>
           <w:lang w:val="es_ES" w:bidi="es_ES"/>
         </w:rPr>
-        <w:t xml:space="preserve"> Tú dijiste que me harías prosperar y que mi descendencia sería muy numerosa, tanto como la arena del mar, que no se puede contar».</w:t>
+        <w:t xml:space="preserve"> Tú dijiste que me harías prosperar y que mi descendencia sería muy numerosa, tanto como la arena del mar, que no se puede contar.</w:t>
       </w:r>
     </w:p>
     <w:p>
@@ -18896,7 +18896,7 @@
         <w:rPr>
           <w:lang w:val="es_ES" w:bidi="es_ES"/>
         </w:rPr>
-        <w:t xml:space="preserve"> Aquella misma noche, Jacob se levantó y tomó a sus dos esposas, a sus dos siervas y a sus once hijos, y cruzaron el vado del río Jaboc.</w:t>
+        <w:t xml:space="preserve"> Aquella misma noche, Jacob se levantó y tomó a sus 2 esposas, a sus 2 siervas y a sus 11 hijos, y cruzaron el vado del río Jaboc. Después de hacerlos pasar junto con todas sus posesiones, se quedó solo. Entonces un hombre luchó con él hasta el amanecer.</w:t>
       </w:r>
     </w:p>
     <w:p>
@@ -19600,7 +19600,7 @@
         <w:rPr>
           <w:lang w:val="es_ES" w:bidi="es_ES"/>
         </w:rPr>
-        <w:t xml:space="preserve"> Por eso le dijo a su padre: «Consígueme a esa muchacha para que sea mi esposa».</w:t>
+        <w:t xml:space="preserve"> Por eso le dijo a su padre:—Consígueme a esa muchacha para que sea mi esposa.</w:t>
       </w:r>
     </w:p>
     <w:p>
@@ -20645,7 +20645,7 @@
         <w:rPr>
           <w:lang w:val="es_ES" w:bidi="es_ES"/>
         </w:rPr>
-        <w:t xml:space="preserve"> Isaac tenía ciento ochenta años</w:t>
+        <w:t xml:space="preserve"> Isaac era muy anciano cuando murió. Tenía 180 años. Sus hijos Esaú y Jacob lo sepultaron.</w:t>
       </w:r>
     </w:p>
     <w:p>
@@ -21307,7 +21307,7 @@
         <w:rPr>
           <w:lang w:val="es_ES" w:bidi="es_ES"/>
         </w:rPr>
-        <w:t xml:space="preserve"> Esta es la historia de Jacob y su familia.Cuando tenía diecisiete años, José apacentaba el rebaño con sus hermanos, los hijos de Bilhá y de Zilpá, las concubinas de su padre. José le contaba a su padre sobre la mala conducta de sus hermanos.</w:t>
+        <w:t xml:space="preserve"> Esta es la historia de Jacob y su familia.Cuando tenía 17 años, José apacentaba el rebaño con sus hermanos, los hijos de Bilhá y de Zilpá, las concubinas de su padre. José le contaba a su padre sobre la mala conducta de sus hermanos.</w:t>
       </w:r>
     </w:p>
     <w:p>
@@ -21433,7 +21433,7 @@
         <w:rPr>
           <w:lang w:val="es_ES" w:bidi="es_ES"/>
         </w:rPr>
-        <w:t xml:space="preserve"> No derramen sangre. Arrójenlo vivo a esta cisterna en el desierto, pero no le pongan la mano encima.Lo que Rubén quería era rescatarlo y llevarlo de vuelta con su padre.</w:t>
+        <w:t xml:space="preserve"> Su padre continuó:—Ve a ver cómo están tus hermanos y el rebaño y tráeme noticias.Así que lo envió desde el valle de Hebrón y José fue a Siquén.</w:t>
       </w:r>
     </w:p>
     <w:p>
@@ -21643,7 +21643,7 @@
         <w:rPr>
           <w:lang w:val="es_ES" w:bidi="es_ES"/>
         </w:rPr>
-        <w:t xml:space="preserve"> —¡Ahí viene el soñador! —dijeron—.</w:t>
+        <w:t xml:space="preserve"> —¡Ahí viene el soñador! —dijeron—. Matémoslo y arrojémoslo en una cisterna. Luego le diremos a nuestro padre que un animal salvaje lo devoró. ¡A ver qué pasa entonces con sus sueños!</w:t>
       </w:r>
     </w:p>
     <w:p>
@@ -21769,7 +21769,7 @@
         <w:rPr>
           <w:lang w:val="es_ES" w:bidi="es_ES"/>
         </w:rPr>
-        <w:t xml:space="preserve"> Cuando llegaron los mercaderes madianitas, sacaron a José de la cisterna y se lo vendieron a los ismaelitas por veinte piezas de plata. Ellos se llevaron a José a Egipto.</w:t>
+        <w:t xml:space="preserve"> Cuando llegaron los mercaderes madianitas, sacaron a José de la cisterna y se lo vendieron a los ismaelitas por 20 piezas de plata. Ellos se llevaron a José a Egipto.</w:t>
       </w:r>
     </w:p>
     <w:p>
@@ -22893,7 +22893,7 @@
         <w:rPr>
           <w:lang w:val="es_ES" w:bidi="es_ES"/>
         </w:rPr>
-        <w:t xml:space="preserve"> Entonces llamó a sus siervos y les dijo:—¡Miren, el hebreo que mi esposo nos ha traído está aquí para burlarse de nosotros! Entró en mis aposentos queriendo acostarse conmigo. Yo grité con todas mis fuerzas.</w:t>
+        <w:t xml:space="preserve"> Entonces llamó a sus siervos y les dijo:—¡Miren, el hebreo que mi esposo nos ha traído está aquí para burlarse de nosotros! Entró en mis aposentos queriendo acostarse conmigo. Yo grité con todas mis fuerzas. En cuanto me oyó gritar, salió corriendo y se dejó el manto.</w:t>
       </w:r>
     </w:p>
     <w:p>
@@ -23140,7 +23140,7 @@
         <w:rPr>
           <w:lang w:val="es_ES" w:bidi="es_ES"/>
         </w:rPr>
-        <w:t xml:space="preserve"> El faraón se enojó con estos dos oficiales, el jefe de los coperos y el jefe de los panaderos.</w:t>
+        <w:t xml:space="preserve"> Así que los envió a la cárcel donde José estaba preso, bajo la custodia del capitán de la guardia.</w:t>
       </w:r>
     </w:p>
     <w:p>
@@ -23329,7 +23329,7 @@
         <w:rPr>
           <w:lang w:val="es_ES" w:bidi="es_ES"/>
         </w:rPr>
-        <w:t xml:space="preserve"> Dentro de tres días, el faraón te sacará de la cárcel, te devolverá a tu puesto y le pondrás al faraón la copa en la mano, como hacías antes, cuando eras su copero.</w:t>
+        <w:t xml:space="preserve"> Dentro de 3 días, el faraón te sacará de la cárcel, te devolverá a tu puesto y le pondrás al faraón la copa en la mano, como hacías antes, cuando eras su copero.</w:t>
       </w:r>
     </w:p>
     <w:p>
@@ -23392,7 +23392,7 @@
         <w:rPr>
           <w:lang w:val="es_ES" w:bidi="es_ES"/>
         </w:rPr>
-        <w:t xml:space="preserve"> Al ver que la interpretación era positiva, el jefe de los panaderos le dijo a José: —Yo también tuve un sueño. En él, yo llevaba tres canastas de pan sobre la cabeza.</w:t>
+        <w:t xml:space="preserve"> Al ver que la interpretación era positiva, el jefe de los panaderos le dijo a José: —Yo también tuve un sueño. En él, yo llevaba 3 canastas de pan sobre la cabeza.</w:t>
       </w:r>
     </w:p>
     <w:p>
@@ -23455,7 +23455,7 @@
         <w:rPr>
           <w:lang w:val="es_ES" w:bidi="es_ES"/>
         </w:rPr>
-        <w:t xml:space="preserve"> Dentro de tres días, el faraón te mandará decapitar. Colgarán tu cuerpo en un árbol y las aves lo picotearán.</w:t>
+        <w:t xml:space="preserve"> Dentro de 3 días, el faraón te mandará decapitar. Colgarán tu cuerpo en un árbol y las aves lo picotearán.</w:t>
       </w:r>
     </w:p>
     <w:p>
@@ -23476,7 +23476,7 @@
         <w:rPr>
           <w:lang w:val="es_ES" w:bidi="es_ES"/>
         </w:rPr>
-        <w:t xml:space="preserve"> Al cabo de tres días era el cumpleaños del faraón. Hizo un banquete para todos sus funcionarios. Delante de todos, mandó sacar de la cárcel al jefe de los coperos y al jefe de los panaderos.</w:t>
+        <w:t xml:space="preserve"> Al cabo de 3 días era el cumpleaños del faraón. Hizo un banquete para todos sus funcionarios. Delante de todos, mandó sacar de la cárcel al jefe de los coperos y al jefe de los panaderos.</w:t>
       </w:r>
     </w:p>
     <w:p>
@@ -23576,7 +23576,7 @@
         <w:rPr>
           <w:lang w:val="es_ES" w:bidi="es_ES"/>
         </w:rPr>
-        <w:t xml:space="preserve"> Dos años más tarde, el faraón tuvo un sueño. En el sueño, estaba de pie junto al río Nilo</w:t>
+        <w:t xml:space="preserve"> Después de 2 años, el faraón tuvo un sueño. En el sueño, estaba de pie junto al río Nilo</w:t>
       </w:r>
     </w:p>
     <w:p>
@@ -23597,7 +23597,7 @@
         <w:rPr>
           <w:lang w:val="es_ES" w:bidi="es_ES"/>
         </w:rPr>
-        <w:t xml:space="preserve"> cuando, de pronto, salieron siete vacas del río. Eran hermosas y bien cebadas, y se pusieron a pastar entre los juncos.</w:t>
+        <w:t xml:space="preserve"> cuando, de pronto, salieron 7 vacas del río. Eran hermosas y bien cebadas, y se pusieron a pastar entre los juncos.</w:t>
       </w:r>
     </w:p>
     <w:p>
@@ -23618,7 +23618,7 @@
         <w:rPr>
           <w:lang w:val="es_ES" w:bidi="es_ES"/>
         </w:rPr>
-        <w:t xml:space="preserve"> Luego salieron del río siete vacas feas y muy flacas. Se pusieron junto a las otras, a la orilla del Nilo.</w:t>
+        <w:t xml:space="preserve"> Luego salieron del río 7 vacas feas y muy flacas. Se pusieron junto a las otras, a la orilla del Nilo.</w:t>
       </w:r>
     </w:p>
     <w:p>
@@ -23639,7 +23639,7 @@
         <w:rPr>
           <w:lang w:val="es_ES" w:bidi="es_ES"/>
         </w:rPr>
-        <w:t xml:space="preserve"> Entonces, las vacas feas y flacas se comieron a las siete vacas hermosas y bien cebadas. En ese momento, el faraón despertó.</w:t>
+        <w:t xml:space="preserve"> Entonces, las vacas feas y flacas se comieron a las 7 vacas hermosas y bien cebadas. En ese momento, el faraón despertó.</w:t>
       </w:r>
     </w:p>
     <w:p>
@@ -23660,7 +23660,7 @@
         <w:rPr>
           <w:lang w:val="es_ES" w:bidi="es_ES"/>
         </w:rPr>
-        <w:t xml:space="preserve"> Volvió a dormirse y tuvo otro sueño. Siete espigas de trigo, hermosas y repletas, brotaron en un solo tallo.</w:t>
+        <w:t xml:space="preserve"> Volvió a dormirse y tuvo otro sueño. Unas 7 espigas de trigo, hermosas y repletas, brotaron en un solo tallo.</w:t>
       </w:r>
     </w:p>
     <w:p>
@@ -23681,7 +23681,7 @@
         <w:rPr>
           <w:lang w:val="es_ES" w:bidi="es_ES"/>
         </w:rPr>
-        <w:t xml:space="preserve"> Tras ellas brotaron siete espigas delgadas y secadas por el viento del este.</w:t>
+        <w:t xml:space="preserve"> Tras ellas brotaron 7 espigas delgadas y secadas por el viento del este.</w:t>
       </w:r>
     </w:p>
     <w:p>
@@ -23702,7 +23702,7 @@
         <w:rPr>
           <w:lang w:val="es_ES" w:bidi="es_ES"/>
         </w:rPr>
-        <w:t xml:space="preserve"> Entonces las espigas delgadas se tragaron a las siete espigas hermosas y repletas. En ese momento se despertó el faraón y vio que solo era un sueño.</w:t>
+        <w:t xml:space="preserve"> Entonces las espigas delgadas se tragaron a las 7 espigas hermosas y repletas. En ese momento se despertó el faraón y vio que solo era un sueño.</w:t>
       </w:r>
     </w:p>
     <w:p>
@@ -23933,7 +23933,7 @@
         <w:rPr>
           <w:lang w:val="es_ES" w:bidi="es_ES"/>
         </w:rPr>
-        <w:t xml:space="preserve"> cuando, de pronto, salieron siete vacas del río. Eran hermosas y bien cebadas, y se pusieron a pastar entre los juncos.</w:t>
+        <w:t xml:space="preserve"> cuando, de pronto, salieron 7 vacas del río. Eran hermosas y bien cebadas, y se pusieron a pastar entre los juncos.</w:t>
       </w:r>
     </w:p>
     <w:p>
@@ -23954,7 +23954,7 @@
         <w:rPr>
           <w:lang w:val="es_ES" w:bidi="es_ES"/>
         </w:rPr>
-        <w:t xml:space="preserve"> Luego salieron del río siete vacas feas y muy flacas. Nunca he visto en todo Egipto vacas tan flacas.</w:t>
+        <w:t xml:space="preserve"> Luego salieron del río 7 vacas feas y muy flacas. Nunca he visto en todo Egipto vacas tan flacas.</w:t>
       </w:r>
     </w:p>
     <w:p>
@@ -23975,7 +23975,7 @@
         <w:rPr>
           <w:lang w:val="es_ES" w:bidi="es_ES"/>
         </w:rPr>
-        <w:t xml:space="preserve"> De pronto, las vacas feas y flacas se comieron a las siete vacas hermosas y bien cebadas.</w:t>
+        <w:t xml:space="preserve"> De pronto, las vacas feas y flacas se comieron a las 7 vacas hermosas y bien cebadas.</w:t>
       </w:r>
     </w:p>
     <w:p>
@@ -24017,7 +24017,7 @@
         <w:rPr>
           <w:lang w:val="es_ES" w:bidi="es_ES"/>
         </w:rPr>
-        <w:t xml:space="preserve"> »Tuve otro sueño. En él, siete espigas de trigo, hermosas y repletas, brotaron en un solo tallo.</w:t>
+        <w:t xml:space="preserve"> »Tuve otro sueño. En él, 7 espigas de trigo, hermosas y repletas, brotaron en un solo tallo.</w:t>
       </w:r>
     </w:p>
     <w:p>
@@ -24038,7 +24038,7 @@
         <w:rPr>
           <w:lang w:val="es_ES" w:bidi="es_ES"/>
         </w:rPr>
-        <w:t xml:space="preserve"> Pero tras ellas brotaron siete espigas delgadas y secadas por el viento del este.</w:t>
+        <w:t xml:space="preserve"> Pero tras ellas brotaron 7 espigas delgadas y secadas por el viento del este.</w:t>
       </w:r>
     </w:p>
     <w:p>
@@ -24059,7 +24059,7 @@
         <w:rPr>
           <w:lang w:val="es_ES" w:bidi="es_ES"/>
         </w:rPr>
-        <w:t xml:space="preserve"> Las espigas delgadas se comieron a las siete espigas hermosas. Esto es lo que le conté a los magos, y ninguno supo darme una interpretación.</w:t>
+        <w:t xml:space="preserve"> Las espigas delgadas se comieron a las 7 espigas hermosas. Esto es lo que le conté a los magos, y ninguno supo darme una interpretación.</w:t>
       </w:r>
     </w:p>
     <w:p>
@@ -24101,7 +24101,7 @@
         <w:rPr>
           <w:lang w:val="es_ES" w:bidi="es_ES"/>
         </w:rPr>
-        <w:t xml:space="preserve"> Las siete vacas hermosas son siete años, y las siete espigas hermosas son siete años. Es el mismo sueño.</w:t>
+        <w:t xml:space="preserve"> Las 7 vacas hermosas son 7 años, y las 7 espigas hermosas son 7 años. Es el mismo sueño.</w:t>
       </w:r>
     </w:p>
     <w:p>
@@ -24122,7 +24122,7 @@
         <w:rPr>
           <w:lang w:val="es_ES" w:bidi="es_ES"/>
         </w:rPr>
-        <w:t xml:space="preserve"> Las siete vacas feas y flacas que salieron después son también siete años. Y las siete espigas delgadas y secadas por el viento del este son también siete años. Pero son siete años de hambre.</w:t>
+        <w:t xml:space="preserve"> Las 7 vacas feas y flacas que salieron después son también 7 años. Y las 7 espigas delgadas y secadas por el viento del este son también 7 años. Pero son 7 años de hambre.</w:t>
       </w:r>
     </w:p>
     <w:p>
@@ -24164,7 +24164,7 @@
         <w:rPr>
           <w:lang w:val="es_ES" w:bidi="es_ES"/>
         </w:rPr>
-        <w:t xml:space="preserve"> Van a venir siete años de gran abundancia en toda la tierra de Egipto.</w:t>
+        <w:t xml:space="preserve"> Van a venir 7 años de gran abundancia en toda la tierra de Egipto.</w:t>
       </w:r>
     </w:p>
     <w:p>
@@ -24185,7 +24185,7 @@
         <w:rPr>
           <w:lang w:val="es_ES" w:bidi="es_ES"/>
         </w:rPr>
-        <w:t xml:space="preserve"> Después vendrán siete años de hambre que harán olvidar toda la abundancia anterior de la tierra de Egipto. El hambre consumirá el país.</w:t>
+        <w:t xml:space="preserve"> Después vendrán 7 años de hambre que harán olvidar toda la abundancia anterior de la tierra de Egipto. El hambre consumirá el país.</w:t>
       </w:r>
     </w:p>
     <w:p>
@@ -24479,7 +24479,7 @@
         <w:rPr>
           <w:lang w:val="es_ES" w:bidi="es_ES"/>
         </w:rPr>
-        <w:t xml:space="preserve"> José tenía treinta años cuando comenzó a trabajar al servicio del faraón, rey de Egipto. En cuanto se retiró de la presencia del faraón, se puso a recorrer todo el territorio de Egipto.</w:t>
+        <w:t xml:space="preserve"> José tenía 30 años cuando comenzó a trabajar al servicio del faraón, rey de Egipto. En cuanto se retiró de la presencia del faraón, se puso a recorrer todo el territorio de Egipto.</w:t>
       </w:r>
     </w:p>
     <w:p>
@@ -24500,7 +24500,7 @@
         <w:rPr>
           <w:lang w:val="es_ES" w:bidi="es_ES"/>
         </w:rPr>
-        <w:t xml:space="preserve"> Durante los siete años de abundancia, la tierra produjo grandes cosechas.</w:t>
+        <w:t xml:space="preserve"> Durante los 7 años de abundancia, la tierra produjo grandes cosechas.</w:t>
       </w:r>
     </w:p>
     <w:p>
@@ -24521,7 +24521,7 @@
         <w:rPr>
           <w:lang w:val="es_ES" w:bidi="es_ES"/>
         </w:rPr>
-        <w:t xml:space="preserve"> José recogió a lo largo de Egipto todo el alimento de los siete años de abundancia y lo almacenó en las ciudades.</w:t>
+        <w:t xml:space="preserve"> José recogió a lo largo de Egipto todo el alimento de los 7 años de abundancia y lo almacenó en las ciudades.</w:t>
       </w:r>
     </w:p>
     <w:p>
@@ -24626,7 +24626,7 @@
         <w:rPr>
           <w:lang w:val="es_ES" w:bidi="es_ES"/>
         </w:rPr>
-        <w:t xml:space="preserve"> Se acabaron los siete años de abundancia en la tierra de Egipto.</w:t>
+        <w:t xml:space="preserve"> Se acabaron los 7 años de abundancia en la tierra de Egipto.</w:t>
       </w:r>
     </w:p>
     <w:p>
@@ -24647,7 +24647,7 @@
         <w:rPr>
           <w:lang w:val="es_ES" w:bidi="es_ES"/>
         </w:rPr>
-        <w:t xml:space="preserve"> Comenzaron los siete años de hambre anunciados por José. Hubo hambre en todos los países, pero en todo el territorio de Egipto no faltó el pan.</w:t>
+        <w:t xml:space="preserve"> Comenzaron los 7 años de hambre anunciados por José. Hubo hambre en todos los países, pero en todo el territorio de Egipto no faltó el pan.</w:t>
       </w:r>
     </w:p>
     <w:p>
@@ -24789,7 +24789,7 @@
         <w:rPr>
           <w:lang w:val="es_ES" w:bidi="es_ES"/>
         </w:rPr>
-        <w:t xml:space="preserve"> Entonces diez de los hermanos de José bajaron a Egipto para comprar alimento.</w:t>
+        <w:t xml:space="preserve"> Entonces 10 de los hermanos de José bajaron a Egipto para comprar alimento.</w:t>
       </w:r>
     </w:p>
     <w:p>
@@ -24978,7 +24978,7 @@
         <w:rPr>
           <w:lang w:val="es_ES" w:bidi="es_ES"/>
         </w:rPr>
-        <w:t xml:space="preserve"> ―Señor —dijeron de nuevo—, nosotros tus siervos somos doce hermanos, hijos de un mismo padre, de la tierra de Canaán. El menor de nuestros hermanos está con nuestro padre, y uno de nuestros hermanos falleció.</w:t>
+        <w:t xml:space="preserve"> ―Señor —dijeron de nuevo—, nosotros tus siervos somos 12 hermanos, hijos de un mismo padre, de la tierra de Canaán. El menor de nuestros hermanos está con nuestro padre, y 1 de nuestros hermanos falleció.</w:t>
       </w:r>
     </w:p>
     <w:p>
@@ -25062,7 +25062,7 @@
         <w:rPr>
           <w:lang w:val="es_ES" w:bidi="es_ES"/>
         </w:rPr>
-        <w:t xml:space="preserve"> Entonces los encerró en la cárcel por tres días.</w:t>
+        <w:t xml:space="preserve"> Entonces los encerró en la cárcel por 3 días.</w:t>
       </w:r>
     </w:p>
     <w:p>
@@ -25687,7 +25687,7 @@
         <w:rPr>
           <w:lang w:val="es_ES" w:bidi="es_ES"/>
         </w:rPr>
-        <w:t xml:space="preserve"> Si no hubiéramos perdido tanto tiempo, ya habríamos ido y vuelto dos veces.</w:t>
+        <w:t xml:space="preserve"> Si no hubiéramos perdido tanto tiempo, ya habríamos ido y vuelto 2 veces.</w:t>
       </w:r>
     </w:p>
     <w:p>
@@ -26333,7 +26333,7 @@
         <w:rPr>
           <w:lang w:val="es_ES" w:bidi="es_ES"/>
         </w:rPr>
-        <w:t xml:space="preserve"> Ellos respondieron:—¿Pero qué dice? ¡Nosotros jamás haríamos algo así!</w:t>
+        <w:t xml:space="preserve"> Ellos respondieron:—Pero ¿qué dices? ¡Nosotros jamás haríamos algo así!</w:t>
       </w:r>
     </w:p>
     <w:p>
@@ -27478,7 +27478,7 @@
         <w:rPr>
           <w:lang w:val="es_ES" w:bidi="es_ES"/>
         </w:rPr>
-        <w:t xml:space="preserve"> Estos fueron los hijos que Jacob tuvo con Bilhá, la sierva que Labán le dio a su hija Raquel. En total fueron siete.</w:t>
+        <w:t xml:space="preserve"> Estos fueron los hijos que Jacob tuvo con Bilhá, la sierva que Labán le dio a su hija Raquel. En total fueron 7.</w:t>
       </w:r>
     </w:p>
     <w:p>
@@ -27667,7 +27667,7 @@
         <w:rPr>
           <w:lang w:val="es_ES" w:bidi="es_ES"/>
         </w:rPr>
-        <w:t xml:space="preserve"> Estos fueron los hijos que Jacob tuvo con Lea en Padán Aram, incluida su hija Dina. En total fueron treinta y tres personas.</w:t>
+        <w:t xml:space="preserve"> Estos fueron los hijos que Jacob tuvo con Lea en Padán Aram, incluida su hija Dina. En total fueron 33 personas.</w:t>
       </w:r>
     </w:p>
     <w:p>
@@ -27709,7 +27709,7 @@
         <w:rPr>
           <w:lang w:val="es_ES" w:bidi="es_ES"/>
         </w:rPr>
-        <w:t xml:space="preserve"> Estos fueron los hijos que Jacob tuvo con Zilpá, la sierva que Labán le dio a su hija. En total fueron dieciséis personas.</w:t>
+        <w:t xml:space="preserve"> Estos fueron los hijos que Jacob tuvo con Zilpá, la sierva que Labán le dio a su hija. En total fueron 16 personas.</w:t>
       </w:r>
     </w:p>
     <w:p>
@@ -27772,7 +27772,7 @@
         <w:rPr>
           <w:lang w:val="es_ES" w:bidi="es_ES"/>
         </w:rPr>
-        <w:t xml:space="preserve"> El total de las personas que fueron con Jacob a Egipto, de su misma sangre, sin incluir a las nueras, fue de sesenta y seis.</w:t>
+        <w:t xml:space="preserve"> El total de las personas que fueron con Jacob a Egipto, de su misma sangre, sin incluir a las nueras, fue de 66.</w:t>
       </w:r>
     </w:p>
     <w:p>
@@ -27793,7 +27793,7 @@
         <w:rPr>
           <w:lang w:val="es_ES" w:bidi="es_ES"/>
         </w:rPr>
-        <w:t xml:space="preserve"> José tenía dos hijos que nacieron en Egipto. El total de personas de la familia de Jacob que llegaron a Egipto fue de setenta.</w:t>
+        <w:t xml:space="preserve"> José tenía 2 hijos que nacieron en Egipto. El total de personas de la familia de Jacob que llegaron a Egipto fue de 70.</w:t>
       </w:r>
     </w:p>
     <w:p>
@@ -27961,7 +27961,7 @@
         <w:rPr>
           <w:lang w:val="es_ES" w:bidi="es_ES"/>
         </w:rPr>
-        <w:t xml:space="preserve"> En total, los descendientes de Jacob y Raquel fueron catorce personas.</w:t>
+        <w:t xml:space="preserve"> En total, los descendientes de Jacob y Raquel fueron 14 personas.</w:t>
       </w:r>
     </w:p>
     <w:p>
@@ -29122,7 +29122,7 @@
         <w:rPr>
           <w:lang w:val="es_ES" w:bidi="es_ES"/>
         </w:rPr>
-        <w:t xml:space="preserve"> »Vengan, escuchen, hijos de Jacob, escuchen a su padre Israel.</w:t>
+        <w:t xml:space="preserve"> Vengan, escuchen, hijos de Jacob, escuchen a su padre Israel.</w:t>
       </w:r>
     </w:p>
     <w:p>
@@ -29143,7 +29143,7 @@
         <w:rPr>
           <w:lang w:val="es_ES" w:bidi="es_ES"/>
         </w:rPr>
-        <w:t xml:space="preserve"> »Rubén, mi primogénito, tú eres mi fuerza y las primicias de mi vigor, el primero en honor, el primero en poder.</w:t>
+        <w:t xml:space="preserve"> Rubén, mi primogénito, tú eres mi fuerza y las primicias de mi vigor, el primero en honor, el primero en poder.</w:t>
       </w:r>
     </w:p>
     <w:p>
@@ -29185,7 +29185,7 @@
         <w:rPr>
           <w:lang w:val="es_ES" w:bidi="es_ES"/>
         </w:rPr>
-        <w:t xml:space="preserve"> »Simeón y Leví son hermanos; instrumentos de violencia son sus armas.</w:t>
+        <w:t xml:space="preserve"> Simeón y Leví son hermanos; instrumentos de violencia son sus armas.</w:t>
       </w:r>
     </w:p>
     <w:p>
@@ -29248,7 +29248,7 @@
         <w:rPr>
           <w:lang w:val="es_ES" w:bidi="es_ES"/>
         </w:rPr>
-        <w:t xml:space="preserve"> »Judá, tus hermanos te alabarán. Vencerás a tus enemigos. Los hijos de tu padre se postrarán ante de ti.</w:t>
+        <w:t xml:space="preserve"> Judá, tus hermanos te alabarán. Vencerás a tus enemigos. Los hijos de tu padre se postrarán ante de ti.</w:t>
       </w:r>
     </w:p>
     <w:p>
@@ -29353,7 +29353,7 @@
         <w:rPr>
           <w:lang w:val="es_ES" w:bidi="es_ES"/>
         </w:rPr>
-        <w:t xml:space="preserve"> »Zabulón habitará junto a la orilla del mar, será puerto para los barcos y su frontera llegará hasta Sidón.</w:t>
+        <w:t xml:space="preserve"> Zabulón habitará junto a la orilla del mar, será puerto para los barcos y su frontera llegará hasta Sidón.</w:t>
       </w:r>
     </w:p>
     <w:p>
@@ -29374,7 +29374,7 @@
         <w:rPr>
           <w:lang w:val="es_ES" w:bidi="es_ES"/>
         </w:rPr>
-        <w:t xml:space="preserve"> »Isacar es fuerte asno que se recuesta entre las alforjas.</w:t>
+        <w:t xml:space="preserve"> Isacar es fuerte asno que se recuesta entre las alforjas.</w:t>
       </w:r>
     </w:p>
     <w:p>
@@ -29416,7 +29416,7 @@
         <w:rPr>
           <w:lang w:val="es_ES" w:bidi="es_ES"/>
         </w:rPr>
-        <w:t xml:space="preserve"> »Dan será juez en su pueblo como una de las tribus de Israel.</w:t>
+        <w:t xml:space="preserve"> Dan será juez en su pueblo como una de las tribus de Israel.</w:t>
       </w:r>
     </w:p>
     <w:p>
@@ -29458,7 +29458,7 @@
         <w:rPr>
           <w:lang w:val="es_ES" w:bidi="es_ES"/>
         </w:rPr>
-        <w:t xml:space="preserve"> »Señor, espero tu salvación.</w:t>
+        <w:t xml:space="preserve"> Señor, espero tu salvación.</w:t>
       </w:r>
     </w:p>
     <w:p>
@@ -29479,7 +29479,7 @@
         <w:rPr>
           <w:lang w:val="es_ES" w:bidi="es_ES"/>
         </w:rPr>
-        <w:t xml:space="preserve"> »Un ejército asalta a Gad, pero él lo atacará por la espalda.</w:t>
+        <w:t xml:space="preserve"> Un ejército asalta a Gad, pero él lo atacará por la espalda.</w:t>
       </w:r>
     </w:p>
     <w:p>
@@ -29500,7 +29500,7 @@
         <w:rPr>
           <w:lang w:val="es_ES" w:bidi="es_ES"/>
         </w:rPr>
-        <w:t xml:space="preserve"> »Aser goza de comidas deliciosas, ofrecerá manjares dignos de un rey.</w:t>
+        <w:t xml:space="preserve"> Aser goza de comidas deliciosas, ofrecerá manjares dignos de un rey.</w:t>
       </w:r>
     </w:p>
     <w:p>
@@ -29521,7 +29521,7 @@
         <w:rPr>
           <w:lang w:val="es_ES" w:bidi="es_ES"/>
         </w:rPr>
-        <w:t xml:space="preserve"> »Neftalí es una cierva en libertadcon preciosos cervatillos.</w:t>
+        <w:t xml:space="preserve"> Neftalí es una cierva en libertadcon preciosos cervatillos.</w:t>
       </w:r>
     </w:p>
     <w:p>
@@ -29542,7 +29542,7 @@
         <w:rPr>
           <w:lang w:val="es_ES" w:bidi="es_ES"/>
         </w:rPr>
-        <w:t xml:space="preserve"> »José es un retoño fructífero, fértil retoño junto a la fuente, y sus ramas trepan por el muro.</w:t>
+        <w:t xml:space="preserve"> José es un retoño fructífero, fértil retoño junto a la fuente, y sus ramas trepan por el muro.</w:t>
       </w:r>
     </w:p>
     <w:p>
@@ -29647,7 +29647,7 @@
         <w:rPr>
           <w:lang w:val="es_ES" w:bidi="es_ES"/>
         </w:rPr>
-        <w:t xml:space="preserve"> »Benjamín es un lobo rapaz; por la mañana devora la presay por la tarde reparte los despojos.</w:t>
+        <w:t xml:space="preserve"> Benjamín es un lobo rapaz; por la mañana devora la presay por la tarde reparte los despojos.</w:t>
       </w:r>
     </w:p>
     <w:p>
@@ -29668,7 +29668,7 @@
         <w:rPr>
           <w:lang w:val="es_ES" w:bidi="es_ES"/>
         </w:rPr>
-        <w:t xml:space="preserve"> Estos son las doce tribus de Israel. Esto es lo que les dijo su padre cuando le dio a cada una de ellas su bendición.</w:t>
+        <w:t xml:space="preserve"> Estos son las 12 tribus de Israel. Esto es lo que les dijo su padre cuando le dio a cada una de ellas su bendición.</w:t>
       </w:r>
     </w:p>
     <w:p>
@@ -29831,7 +29831,7 @@
         <w:rPr>
           <w:lang w:val="es_ES" w:bidi="es_ES"/>
         </w:rPr>
-        <w:t xml:space="preserve"> Esperaron los cuarenta días que requiere el proceso de embalsamamientos. Los egipcios hicieron duelo nacional por Israel durante setenta días.</w:t>
+        <w:t xml:space="preserve"> Esperaron los 40 días que requiere el proceso de embalsamamientos. Los egipcios hicieron duelo nacional por Israel durante 70 días.</w:t>
       </w:r>
     </w:p>
     <w:p>
@@ -29978,7 +29978,7 @@
         <w:rPr>
           <w:lang w:val="es_ES" w:bidi="es_ES"/>
         </w:rPr>
-        <w:t xml:space="preserve"> Los habitantes del lugar, los cananeos, vieron aquellas manifestaciones de duelo en el campo de Atad. Dijeron: «Los egipcios están haciendo un duelo muy solemne». Por eso llamaron Abel MisrayinAbel Misrayin: En hebreo, Abel Misrayin quiere decir luto de los egipcios." class="footnote-marker"&gt;1 a ese lugar que está al otro lado del Jordán.</w:t>
+        <w:t xml:space="preserve"> Los habitantes del lugar, los cananeos, vieron aquellas manifestaciones de duelo en el campo de Atad. Dijeron:—Los egipcios están haciendo un duelo muy solemne. Por eso llamaron Abel Misrayin1 a ese lugar que está al otro lado del Jordán.</w:t>
       </w:r>
     </w:p>
     <w:p>
@@ -30041,7 +30041,7 @@
         <w:rPr>
           <w:lang w:val="es_ES" w:bidi="es_ES"/>
         </w:rPr>
-        <w:t xml:space="preserve"> Cuando los hermanos de José vieron que su padre había muerto, dijeron:–Tal vez José nos guarde rencor y quiera devolvernos todo el mal que le hicimos.</w:t>
+        <w:t xml:space="preserve"> Cuando los hermanos de José vieron que su padre había muerto, dijeron:—Tal vez José nos guarde rencor y quiera devolvernos todo el mal que le hicimos.</w:t>
       </w:r>
     </w:p>
     <w:p>

</xml_diff>

<commit_message>
Update Spanish Bible reference texts and add new content for 2026-06-01 release
</commit_message>
<xml_diff>
--- a/spa/docx/01.content.docx
+++ b/spa/docx/01.content.docx
@@ -256,7 +256,7 @@
         <w:rPr>
           <w:lang w:val="es_ES" w:bidi="es_ES"/>
         </w:rPr>
-        <w:t xml:space="preserve"> Entonces Dios dijo: «¡Que haya luz!». Y apareció la luz.</w:t>
+        <w:t xml:space="preserve"> Entonces Dios dijo:—¡Que haya luz! Y apareció la luz.</w:t>
       </w:r>
     </w:p>
     <w:p>
@@ -319,7 +319,7 @@
         <w:rPr>
           <w:lang w:val="es_ES" w:bidi="es_ES"/>
         </w:rPr>
-        <w:t xml:space="preserve"> Después Dios dijo: «Que haya una expansión en medio de las aguas, para separarlas».</w:t>
+        <w:t xml:space="preserve"> Después Dios dijo: —Que haya una expansión en medio de las aguas, para separarlas.</w:t>
       </w:r>
     </w:p>
     <w:p>
@@ -382,7 +382,7 @@
         <w:rPr>
           <w:lang w:val="es_ES" w:bidi="es_ES"/>
         </w:rPr>
-        <w:t xml:space="preserve"> Después Dios dijo: «Que se junten las aguas que están debajo del cielo en un solo lugar, y que aparezca lo seco». Y fue así.</w:t>
+        <w:t xml:space="preserve"> Después Dios dijo: —Que se junten las aguas que están debajo del cielo en un solo lugar, y que aparezca lo seco. Y fue así.</w:t>
       </w:r>
     </w:p>
     <w:p>
@@ -424,7 +424,7 @@
         <w:rPr>
           <w:lang w:val="es_ES" w:bidi="es_ES"/>
         </w:rPr>
-        <w:t xml:space="preserve"> Entonces dijo Dios: «Que la tierra produzca hierba, plantas que den semilla según su especie y árboles frutales que den fruto con semilla según su especie». Y así fue.</w:t>
+        <w:t xml:space="preserve"> Entonces dijo Dios: —Que la tierra produzca hierba, plantas que den semilla según su especie y árboles frutales que den fruto con semilla según su especie. Y así fue. La tierra produjo hierba, plantas que dan semilla según su especie y árboles que dan fruto con semilla según su especie. Y Dios vio que era bueno.</w:t>
       </w:r>
     </w:p>
     <w:p>
@@ -466,7 +466,7 @@
         <w:rPr>
           <w:lang w:val="es_ES" w:bidi="es_ES"/>
         </w:rPr>
-        <w:t xml:space="preserve"> Después Dios dijo: «Que haya luces en el cielo, para que separen el día de la noche, y para que marquen las estaciones, los días y los años.</w:t>
+        <w:t xml:space="preserve"> Después Dios dijo: —Que haya luces en el cielo, para que separen el día de la noche, y para que marquen las estaciones, los días y los años. Que alumbren la tierra desde la expansión del cielo.Y así fue.</w:t>
       </w:r>
     </w:p>
     <w:p>
@@ -487,7 +487,7 @@
         <w:rPr>
           <w:lang w:val="es_ES" w:bidi="es_ES"/>
         </w:rPr>
-        <w:t xml:space="preserve"> Entonces Dios hizo las dos grandes luces: la luz mayor para alumbrar el día y la luz menor para alumbrar la noche; también hizo las estrellas.</w:t>
+        <w:t xml:space="preserve"> Entonces Dios hizo las 2 grandes luces: la luz mayor para alumbrar el día y la luz menor para alumbrar la noche; también hizo las estrellas.</w:t>
       </w:r>
     </w:p>
     <w:p>
@@ -508,7 +508,7 @@
         <w:rPr>
           <w:lang w:val="es_ES" w:bidi="es_ES"/>
         </w:rPr>
-        <w:t xml:space="preserve"> Dios puso estas luces en el cielo para alumbrar la tierra,</w:t>
+        <w:t xml:space="preserve"> Dios puso estas luces en el cielo para alumbrar la tierra, para marcar el día y la noche, y para separar la luz de la oscuridad. Y Dios vio que era bueno.</w:t>
       </w:r>
     </w:p>
     <w:p>
@@ -550,7 +550,7 @@
         <w:rPr>
           <w:lang w:val="es_ES" w:bidi="es_ES"/>
         </w:rPr>
-        <w:t xml:space="preserve"> Después Dios dijo: «Que las aguas se llenen de seres vivos y que vuelen aves sobre la tierra, en la expansión del cielo».</w:t>
+        <w:t xml:space="preserve"> Después Dios dijo: —Que las aguas se llenen de seres vivos y que vuelen aves sobre la tierra, en la expansión del cielo.</w:t>
       </w:r>
     </w:p>
     <w:p>
@@ -592,7 +592,7 @@
         <w:rPr>
           <w:lang w:val="es_ES" w:bidi="es_ES"/>
         </w:rPr>
-        <w:t xml:space="preserve"> Luego Dios los bendijo y les dijo: «Sean fructíferos y multiplíquense, y llenen las aguas en los mares; y que las aves se multipliquen sobre la tierra».</w:t>
+        <w:t xml:space="preserve"> Luego Dios los bendijo y les dijo: —Sean fructíferos y multiplíquense, y llenen las aguas en los mares; y que las aves se multipliquen sobre la tierra.</w:t>
       </w:r>
     </w:p>
     <w:p>
@@ -634,7 +634,7 @@
         <w:rPr>
           <w:lang w:val="es_ES" w:bidi="es_ES"/>
         </w:rPr>
-        <w:t xml:space="preserve"> Después Dios dijo: «Que la tierra produzca seres vivos: animales domésticos, reptiles y bestias salvajes, según su especie». Y así fue.</w:t>
+        <w:t xml:space="preserve"> Después Dios dijo: —Que la tierra produzca seres vivos: animales domésticos, reptiles y bestias salvajes, según su especie. Y así fue.</w:t>
       </w:r>
     </w:p>
     <w:p>
@@ -676,7 +676,7 @@
         <w:rPr>
           <w:lang w:val="es_ES" w:bidi="es_ES"/>
         </w:rPr>
-        <w:t xml:space="preserve"> Entonces Dios dijo: «Hagamos al ser humanoser humano: La palabra en hebreo es Adán, que significa hombre en el sentido general de humanidad. " class="footnote-marker"&gt;1 a nuestra imagen, conforme a nuestra semejanza, para que cuide y reine sobre los peces del mar, las aves del cielo, los animales domésticos y salvajes, y los reptiles».</w:t>
+        <w:t xml:space="preserve"> Entonces Dios dijo:—Hagamos al ser humano1 a nuestra imagen, conforme a nuestra semejanza, para que cuide y reine sobre los peces del mar, las aves del cielo, los animales domésticos y salvajes, y los reptiles.</w:t>
       </w:r>
     </w:p>
     <w:p>
@@ -697,7 +697,7 @@
         <w:rPr>
           <w:lang w:val="es_ES" w:bidi="es_ES"/>
         </w:rPr>
-        <w:t xml:space="preserve"> De modo que Dios creó al ser humano a su imagen. Sí, a su imagen lo creó: hombre y mujer.</w:t>
+        <w:t xml:space="preserve"> De ese modo Dios creó al ser humano a su imagen. Sí, a su imagen lo creó: hombre y mujer.</w:t>
       </w:r>
     </w:p>
     <w:p>
@@ -718,7 +718,7 @@
         <w:rPr>
           <w:lang w:val="es_ES" w:bidi="es_ES"/>
         </w:rPr>
-        <w:t xml:space="preserve"> Luego Dios los bendijo y les dijo: «Sean fructíferos y multiplíquense. Llenen la tierra, y cuíden y reinen sobre ella. Cuiden y reinen sobre los peces del mar, las aves del cielo y todos los seres vivos de la tierra».</w:t>
+        <w:t xml:space="preserve"> Luego Dios los bendijo y les dijo: —Sean fructíferos y multiplíquense. Llenen la tierra, y cuíden y reinen sobre ella. Cuiden y reinen sobre los peces del mar, las aves del cielo y todos los seres vivos de la tierra.</w:t>
       </w:r>
     </w:p>
     <w:p>
@@ -739,7 +739,7 @@
         <w:rPr>
           <w:lang w:val="es_ES" w:bidi="es_ES"/>
         </w:rPr>
-        <w:t xml:space="preserve"> También les dijo: «Yo les doy toda planta que tiene semilla, y todos los árboles frutales. Alíméntense de ellos.</w:t>
+        <w:t xml:space="preserve"> También les dijo: —Yo les doy toda planta que tiene semilla, y todos los árboles frutales. Alíméntense de ellos.</w:t>
       </w:r>
     </w:p>
     <w:p>
@@ -760,7 +760,7 @@
         <w:rPr>
           <w:lang w:val="es_ES" w:bidi="es_ES"/>
         </w:rPr>
-        <w:t xml:space="preserve"> A las bestias del campo, las aves del cielo y todos los seres vivos que se arrastran por la tierra les doy la hierba verde para que se alimenten».</w:t>
+        <w:t xml:space="preserve"> A las bestias del campo, las aves del cielo y todos los seres vivos que se arrastran por la tierra les doy la hierba verde para que se alimenten.</w:t>
       </w:r>
     </w:p>
     <w:p>
@@ -1028,7 +1028,7 @@
         <w:rPr>
           <w:lang w:val="es_ES" w:bidi="es_ES"/>
         </w:rPr>
-        <w:t xml:space="preserve"> El primero se llamaba Pisón, que recorría toda la región de Javilá, donde había oro.</w:t>
+        <w:t xml:space="preserve"> El primero se llamaba Pisón, que recorría toda la región de Javilá, donde había oro. El oro era de gran calidad. Allí también había ónice y resinas para hacer buenos perfumes.</w:t>
       </w:r>
     </w:p>
     <w:p>
@@ -1112,7 +1112,7 @@
         <w:rPr>
           <w:lang w:val="es_ES" w:bidi="es_ES"/>
         </w:rPr>
-        <w:t xml:space="preserve"> Y le dio esta orden: «Puedes comer de todo árbol del jardín,</w:t>
+        <w:t xml:space="preserve"> Y le dio esta orden: —Puedes comer de todo árbol del jardín,</w:t>
       </w:r>
     </w:p>
     <w:p>
@@ -1133,7 +1133,7 @@
         <w:rPr>
           <w:lang w:val="es_ES" w:bidi="es_ES"/>
         </w:rPr>
-        <w:t xml:space="preserve"> pero no comas del árbol del conocimiento del bien y del mal, porque el día que comas de su fruto morirás».</w:t>
+        <w:t xml:space="preserve"> pero no comas del árbol del conocimiento del bien y del mal, porque el día que comas de su fruto morirás.</w:t>
       </w:r>
     </w:p>
     <w:p>
@@ -1154,7 +1154,7 @@
         <w:rPr>
           <w:lang w:val="es_ES" w:bidi="es_ES"/>
         </w:rPr>
-        <w:t xml:space="preserve"> Dios el Señor dijo: «No es bueno que el hombre esté solo. Le haré una ayuda adecuada para él».</w:t>
+        <w:t xml:space="preserve"> Dios el Señor dijo: —No es bueno que el hombre esté solo. Le haré una ayuda adecuada para él.</w:t>
       </w:r>
     </w:p>
     <w:p>
@@ -1175,7 +1175,7 @@
         <w:rPr>
           <w:lang w:val="es_ES" w:bidi="es_ES"/>
         </w:rPr>
-        <w:t xml:space="preserve"> Dios el Señor formó, del polvo de la tierra, todos los animales del campo y todas las aves del cielo. Luego se los llevó al hombre para que él les pusiera nombre. Así que el hombre les puso nombre a todos los animales; y es el nombre que tienen.</w:t>
+        <w:t xml:space="preserve"> Dios el Señor formó, del polvo de la tierra, todos los animales del campo y todas las aves del cielo. Luego se los llevó al hombre para que él les pusiera nombre. Así que el hombre les puso nombre a todos los animales. Es el nombre que tienen. El hombre les dio nombre a todos los animales domésticos, a todas las aves y a todos los animales salvajes. Pero entre todos ellos no se encontró la ayuda adecuada para él.</w:t>
       </w:r>
     </w:p>
     <w:p>
@@ -1758,7 +1758,7 @@
         <w:rPr>
           <w:lang w:val="es_ES" w:bidi="es_ES"/>
         </w:rPr>
-        <w:t xml:space="preserve"> Y dijo: «Ahora el ser humano es como uno de nosotros, pues tiene conocimiento del bien y del mal; mejor será que no tome del fruto del árbol de la vida y viva para siempre».</w:t>
+        <w:t xml:space="preserve"> Y dijo: —Ahora el ser humano es como uno de nosotros, pues tiene conocimiento del bien y del mal; mejor será que no tome del fruto del árbol de la vida y viva para siempre.</w:t>
       </w:r>
     </w:p>
     <w:p>
@@ -1837,7 +1837,7 @@
         <w:rPr>
           <w:lang w:val="es_ES" w:bidi="es_ES"/>
         </w:rPr>
-        <w:t xml:space="preserve"> Adán se acostó con su esposa Eva, y ella quedó embarazada. Dio a luz a su hijo Caín, y dijo: «Es con la ayuda del Señor que he tenido un hijo varón».</w:t>
+        <w:t xml:space="preserve"> Adán se acostó con su esposa Eva, y ella quedó embarazada. Dio a luz a su hijo Caín, y dijo:—Es con la ayuda del Señor que he tenido un hijo varón.</w:t>
       </w:r>
     </w:p>
     <w:p>
@@ -2299,7 +2299,7 @@
         <w:rPr>
           <w:lang w:val="es_ES" w:bidi="es_ES"/>
         </w:rPr>
-        <w:t xml:space="preserve"> Un día, Lamec dijo a sus esposas: «¡Escúchenme, mujeres de Lamec! ¡Oigan bien lo que digo! A un hombre que me hirió, lo maté, y lo mismo hice con un joven que me golpeó.</w:t>
+        <w:t xml:space="preserve"> Un día, Lamec dijo a sus esposas: —¡Escúchenme, mujeres de Lamec! ¡Oigan bien lo que digo! A un hombre que me hirió, lo maté, y lo mismo hice con un joven que me golpeó.</w:t>
       </w:r>
     </w:p>
     <w:p>
@@ -2320,7 +2320,7 @@
         <w:rPr>
           <w:lang w:val="es_ES" w:bidi="es_ES"/>
         </w:rPr>
-        <w:t xml:space="preserve"> Si el que mate a Caín sufrirá venganza siete veces, entonces, el que mate a Lamec la sufrirá setenta y siete veces.</w:t>
+        <w:t xml:space="preserve"> Si el que mate a Caín sufrirá venganza 7 veces, entonces, el que mate a Lamec la sufrirá 77 veces.</w:t>
       </w:r>
     </w:p>
     <w:p>
@@ -2341,7 +2341,7 @@
         <w:rPr>
           <w:lang w:val="es_ES" w:bidi="es_ES"/>
         </w:rPr>
-        <w:t xml:space="preserve"> Adán volvió a acostarse con su esposa, y ella dio a luz un hijo. Lo llamó Set, pues dijo: «Dios me ha dado otro hijo en lugar de Abel, al que Caín mató».</w:t>
+        <w:t xml:space="preserve"> Adán volvió a acostarse con su esposa, y ella dio a luz un hijo. Lo llamó Set, pues dijo:—Dios me ha dado otro hijo en lugar de Abel, al que Caín mató.</w:t>
       </w:r>
     </w:p>
     <w:p>
@@ -2435,34 +2435,13 @@
           <w:vertAlign w:val="superscript"/>
           <w:lang w:val="es_ES" w:bidi="es_ES"/>
         </w:rPr>
-        <w:t>4</w:t>
-      </w:r>
-      <w:r>
-        <w:rPr>
-          <w:lang w:val="es_ES" w:bidi="es_ES"/>
-        </w:rPr>
-        <w:t xml:space="preserve"> Después del nacimiento de Set, Adán vivió ochocientos años más, tuvo hijos e hijas,</w:t>
-      </w:r>
-    </w:p>
-    <w:p>
-      <w:pPr/>
-      <w:r>
-        <w:rPr>
-          <w:lang w:val="es_ES" w:bidi="es_ES"/>
-        </w:rPr>
-      </w:r>
-      <w:r>
-        <w:rPr>
-          <w:vertAlign w:val="superscript"/>
-          <w:lang w:val="es_ES" w:bidi="es_ES"/>
-        </w:rPr>
         <w:t>5</w:t>
       </w:r>
       <w:r>
         <w:rPr>
           <w:lang w:val="es_ES" w:bidi="es_ES"/>
         </w:rPr>
-        <w:t xml:space="preserve"> y murió a la edad de novecientos doce años.</w:t>
+        <w:t xml:space="preserve"> Adán tenía 130 años cuando le nació un hijo a su imagen y semejanza, y lo llamó Set. Después del nacimiento de Set, Adán vivió 800 años más, tuvo hijos e hijas, y murió a la edad de 930 años.</w:t>
       </w:r>
     </w:p>
     <w:p>
@@ -2483,28 +2462,7 @@
         <w:rPr>
           <w:lang w:val="es_ES" w:bidi="es_ES"/>
         </w:rPr>
-        <w:t xml:space="preserve"> Set tenía 105 años cuando nació su hijo Enós.</w:t>
-      </w:r>
-    </w:p>
-    <w:p>
-      <w:pPr/>
-      <w:r>
-        <w:rPr>
-          <w:lang w:val="es_ES" w:bidi="es_ES"/>
-        </w:rPr>
-      </w:r>
-      <w:r>
-        <w:rPr>
-          <w:vertAlign w:val="superscript"/>
-          <w:lang w:val="es_ES" w:bidi="es_ES"/>
-        </w:rPr>
-        <w:t>9</w:t>
-      </w:r>
-      <w:r>
-        <w:rPr>
-          <w:lang w:val="es_ES" w:bidi="es_ES"/>
-        </w:rPr>
-        <w:t xml:space="preserve"> Después del nacimiento de Enós, vivió otros ochocientos siete años, tuvo hijos e hijas,</w:t>
+        <w:t xml:space="preserve"> Set tenía 105 años cuando nació su hijo Enós. Después del nacimiento de Enós, vivió otros 807 años, tuvo hijos e hijas, y murió a la edad de 912 años.</w:t>
       </w:r>
     </w:p>
     <w:p>
@@ -2525,7 +2483,7 @@
         <w:rPr>
           <w:lang w:val="es_ES" w:bidi="es_ES"/>
         </w:rPr>
-        <w:t xml:space="preserve"> Enós tenía 90 años cuando nació su hijo Cainán.</w:t>
+        <w:t xml:space="preserve"> Enós tenía 90 años cuando nació su hijo Cainán. Después del nacimiento de Cainán, vivió otros 815 años, tuvo hijos e hijas, y murió a la edad de 905 años.</w:t>
       </w:r>
     </w:p>
     <w:p>
@@ -2546,7 +2504,7 @@
         <w:rPr>
           <w:lang w:val="es_ES" w:bidi="es_ES"/>
         </w:rPr>
-        <w:t xml:space="preserve"> Cainán tenía 70 años cuando nació su hijo Malalel.</w:t>
+        <w:t xml:space="preserve"> Cainán tenía 70 años cuando nació su hijo Malalel. Después del nacimiento de Malalel, vivió otros 840 años, tuvo hijos e hijas, y murió a la edad de 910 años.</w:t>
       </w:r>
     </w:p>
     <w:p>
@@ -2567,7 +2525,7 @@
         <w:rPr>
           <w:lang w:val="es_ES" w:bidi="es_ES"/>
         </w:rPr>
-        <w:t xml:space="preserve"> Malalel tenía 65 años cuando nació su hijo Jared.</w:t>
+        <w:t xml:space="preserve"> Malalel tenía 65 años cuando nació su hijo Jared. Después del nacimiento de Jared, vivió otros 830 años, tuvo hijos e hijas, y murió a la edad de 895 años.</w:t>
       </w:r>
     </w:p>
     <w:p>
@@ -2588,7 +2546,7 @@
         <w:rPr>
           <w:lang w:val="es_ES" w:bidi="es_ES"/>
         </w:rPr>
-        <w:t xml:space="preserve"> Jared tenía 162 años cuando nació su hijo Enoc.</w:t>
+        <w:t xml:space="preserve"> Jared tenía 162 años cuando nació su hijo Enoc. Después del nacimiento de Enoc, vivió 800 años, tuvo hijos e hijas, y murió a la edad de 962 años.</w:t>
       </w:r>
     </w:p>
     <w:p>
@@ -2609,7 +2567,7 @@
         <w:rPr>
           <w:lang w:val="es_ES" w:bidi="es_ES"/>
         </w:rPr>
-        <w:t xml:space="preserve"> Enoc tenía 65 años cuando nació su hijo Matusalén.</w:t>
+        <w:t xml:space="preserve"> Enoc tenía 65 años cuando nació su hijo Matusalén. Después del nacimiento de Matusalén, vivió 300 años más y tuvo hijos e hijas. Vivía de acuerdo con la voluntad de Dios. En total, vivió 365 años. Vivía como Dios quería. Después, desapareció, porque Dios se lo llevó sin que muriera.</w:t>
       </w:r>
     </w:p>
     <w:p>
@@ -2630,7 +2588,7 @@
         <w:rPr>
           <w:lang w:val="es_ES" w:bidi="es_ES"/>
         </w:rPr>
-        <w:t xml:space="preserve"> Matusalén tenía 187 años cuando nació su hijo Lamec.</w:t>
+        <w:t xml:space="preserve"> Matusalén tenía 187 años cuando nació su hijo Lamec. Después del nacimiento de Lamec, vivió 782 años, tuvo hijos e hijas, y murió a los 969 años de edad.</w:t>
       </w:r>
     </w:p>
     <w:p>
@@ -2651,7 +2609,7 @@
         <w:rPr>
           <w:lang w:val="es_ES" w:bidi="es_ES"/>
         </w:rPr>
-        <w:t xml:space="preserve"> Lamec tenía 182 años cuando nació su hijo Noé.</w:t>
+        <w:t xml:space="preserve"> Lamec tenía 182 años cuando nació su hijo Noé. Lamec lo llamó Noé1 porque se dijo: «Él nos aliviará del duro trabajo que significa labrar la tierra que Dios maldijo». Después del nacimiento de Noé, Lamec vivió 595 años, tuvo hijos e hijas, y murió a la edad de 777 años.</w:t>
       </w:r>
     </w:p>
     <w:p>
@@ -2673,27 +2631,6 @@
           <w:lang w:val="es_ES" w:bidi="es_ES"/>
         </w:rPr>
         <w:t xml:space="preserve"> Noé había cumplido ya 500 años cuando tuvo a sus hijos Sem, Cam y Jafet.</w:t>
-      </w:r>
-    </w:p>
-    <w:p>
-      <w:pPr/>
-      <w:r>
-        <w:rPr>
-          <w:lang w:val="es_ES" w:bidi="es_ES"/>
-        </w:rPr>
-      </w:r>
-      <w:r>
-        <w:rPr>
-          <w:vertAlign w:val="superscript"/>
-          <w:lang w:val="es_ES" w:bidi="es_ES"/>
-        </w:rPr>
-        <w:t>759</w:t>
-      </w:r>
-      <w:r>
-        <w:rPr>
-          <w:lang w:val="es_ES" w:bidi="es_ES"/>
-        </w:rPr>
-        <w:t xml:space="preserve"> Después del nacimiento de Enoc, vivió ochocientos años, tuvo hijos e hijas,</w:t>
       </w:r>
     </w:p>
     <w:p>
@@ -2814,7 +2751,7 @@
         <w:rPr>
           <w:lang w:val="es_ES" w:bidi="es_ES"/>
         </w:rPr>
-        <w:t xml:space="preserve"> Cuando el Señor Dios vio hasta dónde llagaba la maldad humana, y que solo pensaban en hacer lo malo,</w:t>
+        <w:t xml:space="preserve"> Cuando el Señor Dios vio hasta dónde llagaba la maldad humana, y que solo pensaban en hacer lo malo, le dolió haber creado al ser humano, y se lamentó en su corazón.</w:t>
       </w:r>
     </w:p>
     <w:p>
@@ -2835,7 +2772,7 @@
         <w:rPr>
           <w:lang w:val="es_ES" w:bidi="es_ES"/>
         </w:rPr>
-        <w:t xml:space="preserve"> Entonces Dios dijo: «Voy a borrar de la tierra todo lo que he creado: seres humanos, animales, reptiles y aves. ¡Me duele haberlos creado!».</w:t>
+        <w:t xml:space="preserve"> Entonces Dios dijo:—Voy a borrar de la tierra todo lo que he creado: seres humanos, animales, reptiles y aves. ¡Me duele haberlos creado!</w:t>
       </w:r>
     </w:p>
     <w:p>
@@ -2919,7 +2856,7 @@
         <w:rPr>
           <w:lang w:val="es_ES" w:bidi="es_ES"/>
         </w:rPr>
-        <w:t xml:space="preserve"> Dios vio que la humanidad se había degenerado, y se había vuelto violenta.</w:t>
+        <w:t xml:space="preserve"> Dios vio que la humanidad se había degenerado, y se había vuelto violenta. La depravación llegó a tal extremo que un día Dios le dijo a Noé: —He decidido destruir a la humanidad, porque por su culpa hay mucha violencia y corrupción en la tierra. Sí, voy a destruir a toda la gente junto con la tierra.</w:t>
       </w:r>
     </w:p>
     <w:p>
@@ -3045,7 +2982,7 @@
         <w:rPr>
           <w:lang w:val="es_ES" w:bidi="es_ES"/>
         </w:rPr>
-        <w:t xml:space="preserve"> Trae un macho y una hembra de cada animal y hazlos entrar en el barco contigo, para que sobrevivan al diluvio.</w:t>
+        <w:t xml:space="preserve"> Trae un macho y una hembra de cada animal y hazlos entrar en el barco contigo, para que sobrevivan al diluvio. Haz entrar una pareja de cada especie de animal, ave y reptil, para que puedan sobrevivir.</w:t>
       </w:r>
     </w:p>
     <w:p>
@@ -3066,7 +3003,7 @@
         <w:rPr>
           <w:lang w:val="es_ES" w:bidi="es_ES"/>
         </w:rPr>
-        <w:t xml:space="preserve"> Almacena en el barco todo el alimento que tú y ellos necesitarán».</w:t>
+        <w:t xml:space="preserve"> Almacena en el barco todo el alimento que tú y ellos necesitarán.</w:t>
       </w:r>
     </w:p>
     <w:p>
@@ -3124,7 +3061,7 @@
         <w:rPr>
           <w:lang w:val="es_ES" w:bidi="es_ES"/>
         </w:rPr>
-        <w:t xml:space="preserve"> Después el Señor le dijo a Noé: «Entra en el barco con toda tu familia, porque eres el único justo que he encontrado de esta generación.</w:t>
+        <w:t xml:space="preserve"> Después el Señor le dijo a Noé: —Entra en el barco con toda tu familia, porque eres el único justo que he encontrado de esta generación.</w:t>
       </w:r>
     </w:p>
     <w:p>
@@ -3187,7 +3124,7 @@
         <w:rPr>
           <w:lang w:val="es_ES" w:bidi="es_ES"/>
         </w:rPr>
-        <w:t xml:space="preserve"> Dentro de 7 días haré que llueva sobre la tierra durante 40 días y 40 noches, y será destruida toda clase de ser vivo».</w:t>
+        <w:t xml:space="preserve"> Dentro de 7 días haré que llueva sobre la tierra durante 40 días y 40 noches, y será destruida toda clase de ser vivo.</w:t>
       </w:r>
     </w:p>
     <w:p>
@@ -3229,7 +3166,7 @@
         <w:rPr>
           <w:lang w:val="es_ES" w:bidi="es_ES"/>
         </w:rPr>
-        <w:t xml:space="preserve"> Cuando comenzó el diluvio, Noé tenía 600 años.</w:t>
+        <w:t xml:space="preserve"> Cuando comenzó el diluvio, Noé tenía 600 años. Entonces entró en el barco con sus hijos, su esposa y sus nueras, para salvarse del diluvio.</w:t>
       </w:r>
     </w:p>
     <w:p>
@@ -3250,7 +3187,7 @@
         <w:rPr>
           <w:lang w:val="es_ES" w:bidi="es_ES"/>
         </w:rPr>
-        <w:t xml:space="preserve"> También los animales puros y los impuros, las aves y los reptiles,</w:t>
+        <w:t xml:space="preserve"> También los animales puros y los impuros, las aves y los reptiles, macho y hembra de cada especie, entraron con él tal como el Señor se lo había ordenado.</w:t>
       </w:r>
     </w:p>
     <w:p>
@@ -3355,7 +3292,7 @@
         <w:rPr>
           <w:lang w:val="es_ES" w:bidi="es_ES"/>
         </w:rPr>
-        <w:t xml:space="preserve"> Con ellos entró en el barco toda clase de animales, domésticos y salvajes, reptiles y aves,</w:t>
+        <w:t xml:space="preserve"> Con ellos entró en el barco toda clase de animales, domésticos y salvajes, reptiles y aves, Entraron los animales por parejas,</w:t>
       </w:r>
     </w:p>
     <w:p>
@@ -3481,7 +3418,7 @@
         <w:rPr>
           <w:lang w:val="es_ES" w:bidi="es_ES"/>
         </w:rPr>
-        <w:t xml:space="preserve"> Por tanto, murieron todos los seres vivos: las aves, los animales salvajes, los domésticos, todos los reptiles y todos los seres humanos.</w:t>
+        <w:t xml:space="preserve"> Por tanto, murieron todos los seres vivos: las aves, los animales salvajes, los domésticos, todos los reptiles y todos los seres humanos. Murió todo ser que respiraba y que vivía en la tierra.</w:t>
       </w:r>
     </w:p>
     <w:p>
@@ -4080,7 +4017,7 @@
         <w:rPr>
           <w:lang w:val="es_ES" w:bidi="es_ES"/>
         </w:rPr>
-        <w:t xml:space="preserve"> Siempre que entre las nubes aparezca el arcoíris, lo veré. Así me acordaré del pacto que existe para siempre entre todos los seres vivos de la tierra y yo».</w:t>
+        <w:t xml:space="preserve"> »Pero no deberán comer carne con su sangre, porque la vida está en la sangre.</w:t>
       </w:r>
     </w:p>
     <w:p>
@@ -4122,7 +4059,7 @@
         <w:rPr>
           <w:lang w:val="es_ES" w:bidi="es_ES"/>
         </w:rPr>
-        <w:t xml:space="preserve"> Bebió del vino, se embriagó y se quedó desnudo dentro de su tienda.</w:t>
+        <w:t xml:space="preserve"> »Si alguien derrama la sangre de un ser humano, otro ser humano derramará la suya, porque el ser humano fue creado a imagen de Dios.</w:t>
       </w:r>
     </w:p>
     <w:p>
@@ -4164,7 +4101,7 @@
         <w:rPr>
           <w:lang w:val="es_ES" w:bidi="es_ES"/>
         </w:rPr>
-        <w:t xml:space="preserve"> Entonces Dios les dijo a Noé y a sus hijos:</w:t>
+        <w:t xml:space="preserve"> Entonces Dios les dijo a Noé y a sus hijos: —Yo hago un pacto con ustedes; con todo hombre y mujer que nazca después de ustedes; y con todos los animales que están con ustedes y que salieron del barco, es decir, con los animales domésticos y los salvajes, con las aves y con todos los demás animales. En este pacto les prometo que nunca más enviaré otro diluvio para destruir la tierra. ¡Nunca más destruiré a todos los seres vivos por medio de un diluvio!</w:t>
       </w:r>
     </w:p>
     <w:p>
@@ -4185,7 +4122,7 @@
         <w:rPr>
           <w:lang w:val="es_ES" w:bidi="es_ES"/>
         </w:rPr>
-        <w:t xml:space="preserve"> Dios dijo también:—Habrá una señal del pacto que acabo de hacer con ustedes y con todos los animales.</w:t>
+        <w:t xml:space="preserve"> Dios dijo también:—Habrá una señal del pacto que acabo de hacer con ustedes y con todos los animales. Será el arcoíris. Cada vez que aparezca el arcoíris en las nubes, les recordará la promesa que he hecho a toda la tierra.</w:t>
       </w:r>
     </w:p>
     <w:p>
@@ -4206,7 +4143,7 @@
         <w:rPr>
           <w:lang w:val="es_ES" w:bidi="es_ES"/>
         </w:rPr>
-        <w:t xml:space="preserve"> Cuando yo cubra de nubes la tierra y aparezca el arcoíris,</w:t>
+        <w:t xml:space="preserve"> Cuando yo cubra de nubes la tierra y aparezca el arcoíris, me acordaré de la promesa que les he hecho a ustedes y a todos los seres vivos de la tierra. Así que nunca más los destruiré por medio de un diluvio. Siempre que entre las nubes aparezca el arcoíris, lo veré. Así me acordaré del pacto que existe para siempre entre todos los seres vivos de la tierra y yo.</w:t>
       </w:r>
     </w:p>
     <w:p>
@@ -4290,7 +4227,7 @@
         <w:rPr>
           <w:lang w:val="es_ES" w:bidi="es_ES"/>
         </w:rPr>
-        <w:t xml:space="preserve"> Noé, que cultivaba la tierra, plantó una viña.</w:t>
+        <w:t xml:space="preserve"> Noé, que cultivaba la tierra, plantó una viña. Bebió del vino, se embriagó y se quedó desnudo dentro de su tienda.</w:t>
       </w:r>
     </w:p>
     <w:p>
@@ -4353,7 +4290,7 @@
         <w:rPr>
           <w:lang w:val="es_ES" w:bidi="es_ES"/>
         </w:rPr>
-        <w:t xml:space="preserve"> Cuando Noé despertó de su borrachera y supo lo que su hijo menor le había hecho,</w:t>
+        <w:t xml:space="preserve"> Cuando Noé despertó de su borrachera y supo lo que su hijo menor le había hecho, dijo:—Maldito sea Canaán. Malditos sean sus descendientes. Serán esclavos para sus hermanos. ¡Los más bajos de sus esclavos!</w:t>
       </w:r>
     </w:p>
     <w:p>
@@ -4495,7 +4432,7 @@
         <w:rPr>
           <w:lang w:val="es_ES" w:bidi="es_ES"/>
         </w:rPr>
-        <w:t xml:space="preserve"> los patruseos, los caslujitas —de quienes descienden los filisteos— y los caftoritas.</w:t>
+        <w:t xml:space="preserve"> Los hijos de Jafet fueron Gómer, Magog, Maday, Javán, Tubal, Mésec y Tirás.</w:t>
       </w:r>
     </w:p>
     <w:p>
@@ -4621,7 +4558,7 @@
         <w:rPr>
           <w:lang w:val="es_ES" w:bidi="es_ES"/>
         </w:rPr>
-        <w:t xml:space="preserve"> y la gran ciudad de Resén, que está entre Nínive y Cala.</w:t>
+        <w:t xml:space="preserve"> Cus fue el padre de Nimrod, conocido como el primer gran guerrero.</w:t>
       </w:r>
     </w:p>
     <w:p>
@@ -4684,7 +4621,7 @@
         <w:rPr>
           <w:lang w:val="es_ES" w:bidi="es_ES"/>
         </w:rPr>
-        <w:t xml:space="preserve"> De esa región salió hacia Asur, donde edificó las ciudades de Nínive, Rejobot Ir, Cala</w:t>
+        <w:t xml:space="preserve"> De esa región salió hacia Asur, donde edificó las ciudades de Nínive, Rejobot Ir, Cala y la gran ciudad de Resén, que está entre Nínive y Cala.</w:t>
       </w:r>
     </w:p>
     <w:p>
@@ -4705,7 +4642,7 @@
         <w:rPr>
           <w:lang w:val="es_ES" w:bidi="es_ES"/>
         </w:rPr>
-        <w:t xml:space="preserve"> Misrayin fue el antepasado de los ludeos, los anameos, los leabitas, los naftuitas,</w:t>
+        <w:t xml:space="preserve"> Misrayin fue el antepasado de los ludeos, los anameos, los leabitas, los naftuitas, los patruseos, los caftoritas y los caslujitas. De los caslujitas descienden los filisteos.</w:t>
       </w:r>
     </w:p>
     <w:p>
@@ -4747,7 +4684,7 @@
         <w:rPr>
           <w:lang w:val="es_ES" w:bidi="es_ES"/>
         </w:rPr>
-        <w:t xml:space="preserve"> De Canaán descienden también los jebuseos, los amorreos, los gergeseos,</w:t>
+        <w:t xml:space="preserve"> De Canaán descienden también los jebuseos, los amorreos, los gergeseos, los heveos, los araceos, los sineos, los arvadeos, los zemareos y los jamatitas. Después de algún tiempo todos estos grupos cananeos se separaron y se dispersaron por la tierra.</w:t>
       </w:r>
     </w:p>
     <w:p>
@@ -4894,7 +4831,7 @@
         <w:rPr>
           <w:lang w:val="es_ES" w:bidi="es_ES"/>
         </w:rPr>
-        <w:t xml:space="preserve"> Éber tuvo dos hijos. El primero se llamó Péleg,Péleg: En hebreo, Péleg significadivisión." class="footnote-marker"&gt;1 porque en sus días se dividió la tierra. El otro hijo de Éber fue Joctán.</w:t>
+        <w:t xml:space="preserve"> Éber tuvo 2 hijos. El primero se llamó Péleg,1 porque en sus días se dividió la tierra. El otro hijo de Éber fue Joctán.</w:t>
       </w:r>
     </w:p>
     <w:p>
@@ -4915,7 +4852,7 @@
         <w:rPr>
           <w:lang w:val="es_ES" w:bidi="es_ES"/>
         </w:rPr>
-        <w:t xml:space="preserve"> Joctán fue el padre de Almodad, Sélef, Jazar Mávet, Yeraj,</w:t>
+        <w:t xml:space="preserve"> Joctán fue el padre de Almodad, Sélef, Jazar Mávet, Yeraj, Hadorán, Uzal, Diclá, Obal, Abimael, Sabá, Ofir, Javilá y Jobab. Todos estos fueron hijos de Joctán y habitaron desde Mesá hasta Sefar, la región montañosa oriental.</w:t>
       </w:r>
     </w:p>
     <w:p>
@@ -6391,7 +6328,7 @@
         <w:rPr>
           <w:lang w:val="es_ES" w:bidi="es_ES"/>
         </w:rPr>
-        <w:t xml:space="preserve"> Después de que Lot se fue por su lado, el Señor le dijo a Abram: «Mira toda la tierra que tienes a tu alrededor, por el norte, el sur, el oriente y el occidente.</w:t>
+        <w:t xml:space="preserve"> Después de que Lot se fue por su lado, el Señor le dijo a Abram:—Mira toda la tierra que tienes a tu alrededor, por el norte, el sur, el oriente y el occidente. Toda esa tierra te la daré para ti y para tus descendientes.</w:t>
       </w:r>
     </w:p>
     <w:p>
@@ -6638,7 +6575,7 @@
         <w:rPr>
           <w:lang w:val="es_ES" w:bidi="es_ES"/>
         </w:rPr>
-        <w:t xml:space="preserve"> Entonces salieron el rey de Sodoma, el rey de Gomorra, el rey de Admá, el rey de Zeboyín y el rey de Bela, también llamada Zoar. Lucharon contra ellos en el valle de Sidín.</w:t>
+        <w:t xml:space="preserve"> Entonces salieron el rey de Sodoma, el rey de Gomorra, el rey de Admá, el rey de Zeboyín y el rey de Bela, también llamada Zoar. Lucharon contra ellos en el valle de Sidín. Lucharon contra Quedorlaómer rey de Elam, Tidal rey de Goyim, Amrafel rey de Sinar, y Arioc rey de Elasar. Eran 4 reyes contra 5.</w:t>
       </w:r>
     </w:p>
     <w:p>
@@ -6911,7 +6848,7 @@
         <w:rPr>
           <w:lang w:val="es_ES" w:bidi="es_ES"/>
         </w:rPr>
-        <w:t xml:space="preserve"> Pero Abram le respondió: —He jurado por el Señor, el Dios Altísimo, Creador del cielo y de la tierra,</w:t>
+        <w:t xml:space="preserve"> Pero Abram le respondió: —He jurado por el Señor, el Dios Altísimo, Creador del cielo y de la tierra, que no tomaré nada de lo que es tuyo. No tomaré ni un hilo ni una correa de sandalia. Eso es para que no digas: “Abram se hizo rico gracias a mí”.</w:t>
       </w:r>
     </w:p>
     <w:p>
@@ -6933,27 +6870,6 @@
           <w:lang w:val="es_ES" w:bidi="es_ES"/>
         </w:rPr>
         <w:t xml:space="preserve"> No quiero nada para mí. Tan solo aceptaré de ti los alimentos que ya comieron mis criados. Pero los hombres que me acompañan, Aner, Escol y Mamré, sí tomarán lo que les corresponde.</w:t>
-      </w:r>
-    </w:p>
-    <w:p>
-      <w:pPr/>
-      <w:r>
-        <w:rPr>
-          <w:lang w:val="es_ES" w:bidi="es_ES"/>
-        </w:rPr>
-      </w:r>
-      <w:r>
-        <w:rPr>
-          <w:vertAlign w:val="superscript"/>
-          <w:lang w:val="es_ES" w:bidi="es_ES"/>
-        </w:rPr>
-        <w:t>644</w:t>
-      </w:r>
-      <w:r>
-        <w:rPr>
-          <w:lang w:val="es_ES" w:bidi="es_ES"/>
-        </w:rPr>
-        <w:t xml:space="preserve"> que no tomaré nada de lo que es tuyo, ni un hilo ni una correa de sandalia, para que no digas: “Abram se hizo rico gracias a mí”.</w:t>
       </w:r>
     </w:p>
     <w:p>
@@ -7011,7 +6927,7 @@
         <w:rPr>
           <w:lang w:val="es_ES" w:bidi="es_ES"/>
         </w:rPr>
-        <w:t xml:space="preserve"> Pero Abram contestó: ―Mi Señor y Dios, ¿para qué me vas a dar algo si continúo sin hijos?</w:t>
+        <w:t xml:space="preserve"> Pero Abram contestó: ―Mi Señor y Dios, ¿para qué me vas a dar algo si continúo sin hijos? Como no me has dado descendencia, mi heredero va a ser un criado de mi casa, Eliezer de Damasco.</w:t>
       </w:r>
     </w:p>
     <w:p>
@@ -7347,28 +7263,7 @@
         <w:rPr>
           <w:lang w:val="es_ES" w:bidi="es_ES"/>
         </w:rPr>
-        <w:t xml:space="preserve"> Es la tierra en la que ahora viven los quenitas, los quenizitas, los cadmoneos,</w:t>
-      </w:r>
-    </w:p>
-    <w:p>
-      <w:pPr/>
-      <w:r>
-        <w:rPr>
-          <w:lang w:val="es_ES" w:bidi="es_ES"/>
-        </w:rPr>
-      </w:r>
-      <w:r>
-        <w:rPr>
-          <w:vertAlign w:val="superscript"/>
-          <w:lang w:val="es_ES" w:bidi="es_ES"/>
-        </w:rPr>
-        <w:t>88</w:t>
-      </w:r>
-      <w:r>
-        <w:rPr>
-          <w:lang w:val="es_ES" w:bidi="es_ES"/>
-        </w:rPr>
-        <w:t xml:space="preserve"> Como no me has dado descendencia, mi heredero va a ser un criado de mi casa, Eliezer de Damasco.</w:t>
+        <w:t xml:space="preserve"> Es la tierra en la que ahora viven los quenitas, los quenizitas, los cadmoneos, los hititas, los ferezeos, los refaítas, los amorreos, los cananeos, los gergeseos y los jebuseos.</w:t>
       </w:r>
     </w:p>
     <w:p>
@@ -7426,7 +7321,7 @@
         <w:rPr>
           <w:lang w:val="es_ES" w:bidi="es_ES"/>
         </w:rPr>
-        <w:t xml:space="preserve"> Entonces Saray tomó a su sierva Agar la egipcia y se la entregó. Llevaban diez años viviendo en Canaán cuando sucedió esto.</w:t>
+        <w:t xml:space="preserve"> Así que le dijo a Abram: —Mira, el Señor no me ha permitido tener hijos. Acuéstate con mi sierva, y tal vez por medio de ella pueda tener descendencia.Abram aceptó.Entonces Saray tomó a su sierva Agar la egipcia y se la entregó. Llevaban 10 años viviendo en Canaán cuando sucedió esto.</w:t>
       </w:r>
     </w:p>
     <w:p>
@@ -7820,7 +7715,7 @@
         <w:rPr>
           <w:lang w:val="es_ES" w:bidi="es_ES"/>
         </w:rPr>
-        <w:t xml:space="preserve"> Este es mi pacto que guardarán: todo varón entre ustedes será circuncidado.</w:t>
+        <w:t xml:space="preserve"> Ya no te llamarás Abram, sino Abraham, porque te he hecho padre de una multitud de naciones.</w:t>
       </w:r>
     </w:p>
     <w:p>
@@ -7904,7 +7799,7 @@
         <w:rPr>
           <w:lang w:val="es_ES" w:bidi="es_ES"/>
         </w:rPr>
-        <w:t xml:space="preserve"> Dios dijo además a Abraham: ―Tú y tus descendientes después de ti guardarán mi pacto por generaciones.</w:t>
+        <w:t xml:space="preserve"> Dios dijo además a Abraham: ―Tú y tus descendientes después de ti guardarán mi pacto por generaciones. Este es mi pacto que guardarán: todo varón entre ustedes será circuncidado.</w:t>
       </w:r>
     </w:p>
     <w:p>
@@ -8198,7 +8093,7 @@
         <w:rPr>
           <w:lang w:val="es_ES" w:bidi="es_ES"/>
         </w:rPr>
-        <w:t xml:space="preserve"> Abraham tenía 99 años cuando fue circuncidado,</w:t>
+        <w:t xml:space="preserve"> Abraham tenía 99 años cuando fue circuncidado, y su hijo Ismael tenía 13 años cuando fue circuncidado.</w:t>
       </w:r>
     </w:p>
     <w:p>
@@ -8718,7 +8613,7 @@
         <w:rPr>
           <w:lang w:val="es_ES" w:bidi="es_ES"/>
         </w:rPr>
-        <w:t xml:space="preserve"> Siguieron su camino hacia Sodoma 2 de los varones, pero Abraham se quedó de pie delante del Señor.</w:t>
+        <w:t xml:space="preserve"> Siguieron su camino hacia Sodoma 2 de los varones, pero Abraham se quedó de pie delante del Señor. Entonces Abraham se acercó al Señor y le dijo:—¿De verdad vas a exterminar al justo junto con el malvado?</w:t>
       </w:r>
     </w:p>
     <w:p>
@@ -8739,7 +8634,7 @@
         <w:rPr>
           <w:lang w:val="es_ES" w:bidi="es_ES"/>
         </w:rPr>
-        <w:t xml:space="preserve"> —¿Y si hay 50 justos en la ciudad? ¿De verdad exterminarás y no perdonarás la ciudad por amor a los 50 justos que hay en ella?</w:t>
+        <w:t xml:space="preserve"> ¿Y si hay 50 justos en la ciudad? ¿De verdad exterminarás y no perdonarás la ciudad por amor a los 50 justos que hay en ella?</w:t>
       </w:r>
     </w:p>
     <w:p>
@@ -9070,7 +8965,7 @@
         <w:rPr>
           <w:lang w:val="es_ES" w:bidi="es_ES"/>
         </w:rPr>
-        <w:t xml:space="preserve"> ¡Apresúrate, porque no puedo hacer nada hasta que llegues! Por eso, desde entonces, la ciudad se llamó Zoar.Zoar: En hebreo, Zoar significa pequeña." class="footnote-marker"&gt;2</w:t>
+        <w:t xml:space="preserve"> Lot salió a hablar con ellos, cerró la puerta trás de sí</w:t>
       </w:r>
     </w:p>
     <w:p>
@@ -9322,7 +9217,7 @@
         <w:rPr>
           <w:lang w:val="es_ES" w:bidi="es_ES"/>
         </w:rPr>
-        <w:t xml:space="preserve"> Pero Lot les dijo: —Por favor, señores míos,</w:t>
+        <w:t xml:space="preserve"> Pero Lot les dijo: —Por favor, señores míos, ustedes han sido muy buenos y misericordiosos conmigo. Me han salvado la vida. Pero no puedo escapar a las montañas, porque la destrucción puede alcanzarme y moriría en el camino.</w:t>
       </w:r>
     </w:p>
     <w:p>
@@ -9364,7 +9259,7 @@
         <w:rPr>
           <w:lang w:val="es_ES" w:bidi="es_ES"/>
         </w:rPr>
-        <w:t xml:space="preserve"> —Muy bien —dijo uno de los ángeles—. He escuchado tu petición y no destruiré la ciudad de la que hablas.</w:t>
+        <w:t xml:space="preserve"> —Muy bien —dijo uno de los ángeles—. He escuchado tu petición y no destruiré la ciudad de la que hablas. ¡Apresúrate, porque no puedo hacer nada hasta que llegues! Por eso, desde entonces, la ciudad se llamó Zoar.1</w:t>
       </w:r>
     </w:p>
     <w:p>
@@ -9905,7 +9800,7 @@
         <w:rPr>
           <w:lang w:val="es_ES" w:bidi="es_ES"/>
         </w:rPr>
-        <w:t xml:space="preserve"> Entonces Abimélec llamó a Abraham y le dijo:—¿Qué nos has hecho? ¿Yo qué te he hecho para que hayas traído sobre mí y sobre mi reino un pecado tan grande? Lo que me has hecho no se le hace a nadie.</w:t>
+        <w:t xml:space="preserve"> Entonces Abimélec llamó a Abraham y le dijo:—¿Qué nos has hecho? ¿Yo qué te he hecho para que hayas traído sobre mí y sobre mi reino un pecado tan grande? Lo que me has hecho no se le hace a nadie. ¿Qué pretendías al actuar así?</w:t>
       </w:r>
     </w:p>
     <w:p>
@@ -10509,7 +10404,7 @@
         <w:rPr>
           <w:lang w:val="es_ES" w:bidi="es_ES"/>
         </w:rPr>
-        <w:t xml:space="preserve"> Dios bendijo al niño, y fue creciendo. Vivió en el desierto y se convirtió en un arquero hábil.</w:t>
+        <w:t xml:space="preserve"> Dios bendijo al niño, y fue creciendo. Vivió en el desierto y se convirtió en un arquero hábil. Habitó en el desierto de Parán, y su madre lo casó con una mujer de Egipto.</w:t>
       </w:r>
     </w:p>
     <w:p>
@@ -10882,7 +10777,7 @@
         <w:rPr>
           <w:lang w:val="es_ES" w:bidi="es_ES"/>
         </w:rPr>
-        <w:t xml:space="preserve"> El primogénito fue Uz; luego nacieron Buz y Quemuel, que es el padre de Aram.</w:t>
+        <w:t xml:space="preserve"> Al tercer día, Abraham alzó los ojos y vio el lugar desde lejos.</w:t>
       </w:r>
     </w:p>
     <w:p>
@@ -11218,7 +11113,7 @@
         <w:rPr>
           <w:lang w:val="es_ES" w:bidi="es_ES"/>
         </w:rPr>
-        <w:t xml:space="preserve"> Pasado cierto tiempo, le llegó a Abraham la noticia de que Milca también le había dado hijos a Najor, su hermano.</w:t>
+        <w:t xml:space="preserve"> Pasado cierto tiempo, le llegó a Abraham la noticia de que Milca también le había dado hijos a Najor, su hermano. El primogénito fue Uz; luego nacieron Buz y Quemuel, que es el padre de Aram. Tuvo después a Quésed, Jazó, Pildás, Yidlaf y Betuel. Betuel fue el padre de Rebeca. Estos son los 8 hijos que Milca le dio a Najor, hermano de Abraham.</w:t>
       </w:r>
     </w:p>
     <w:p>
@@ -12300,7 +12195,7 @@
         <w:rPr>
           <w:lang w:val="es_ES" w:bidi="es_ES"/>
         </w:rPr>
-        <w:t xml:space="preserve"> Rebeca tenía un hermano llamado Labán. Este corrió hacia el pozo en busca del criado. Lo encontró allí, junto a los camellos.</w:t>
+        <w:t xml:space="preserve"> Rebeca tenía un hermano llamado Labán. Este corrió hacia el pozo en busca del criado. Lo encontró allí, junto a los camellos. Es que Labán se había fijado en el anillo y los brazaletes que lucía su hermana y en lo que contó. Al ver al criado,</w:t>
       </w:r>
     </w:p>
     <w:p>
@@ -12321,7 +12216,7 @@
         <w:rPr>
           <w:lang w:val="es_ES" w:bidi="es_ES"/>
         </w:rPr>
-        <w:t xml:space="preserve"> Al ver al criado, Labán le dijo: ―¡Ven, bendito del Señor, quédate con nosotros! No tienes por qué quedarte aquí afuera. Ya he preparado un lugar para ti. También hay sitio para los camellos.</w:t>
+        <w:t xml:space="preserve"> Labán le dijo: ―¡Ven, bendito del Señor, quédate con nosotros! No tienes por qué quedarte aquí afuera. Ya he preparado un lugar para ti. También hay sitio para los camellos.</w:t>
       </w:r>
     </w:p>
     <w:p>
@@ -12447,7 +12342,7 @@
         <w:rPr>
           <w:lang w:val="es_ES" w:bidi="es_ES"/>
         </w:rPr>
-        <w:t xml:space="preserve"> Mi amo me hizo jurar y me dijo: "No tomarás esposa para mi hijo de entre las mujeres de Canaán, donde vivo.</w:t>
+        <w:t xml:space="preserve"> Mi amo me hizo jurar y me dijo: "No tomarás esposa para mi hijo de entre las mujeres de Canaán, donde vivo. Irás a mi tierra, donde están mis parientes, y allí le buscarás una esposa a mi hijo".</w:t>
       </w:r>
     </w:p>
     <w:p>
@@ -13219,7 +13114,7 @@
         <w:rPr>
           <w:lang w:val="es_ES" w:bidi="es_ES"/>
         </w:rPr>
-        <w:t xml:space="preserve"> Abraham vivió ciento 75 años.</w:t>
+        <w:t xml:space="preserve"> Abraham vivió 175 años. Era muy anciano cuando murió y fue a reunirse con sus antepasados.</w:t>
       </w:r>
     </w:p>
     <w:p>
@@ -13240,7 +13135,7 @@
         <w:rPr>
           <w:lang w:val="es_ES" w:bidi="es_ES"/>
         </w:rPr>
-        <w:t xml:space="preserve"> Fue sepultado por sus hijos Isaac e Ismael en la cueva de Macpela, en el campo de Efrón hijo de Zojar, el hitita, que está cerca de Mamré.</w:t>
+        <w:t xml:space="preserve"> Fue sepultado por sus hijos Isaac e Ismael en la cueva de Macpela, en el campo de Efrón, hijo de Zojar, el hitita, que está cerca de Mamré. Ese era el campo que Abraham compró a los hijos de Het. Allí dieron sepultura a Abraham junto a su esposa Sara.</w:t>
       </w:r>
     </w:p>
     <w:p>
@@ -13282,7 +13177,7 @@
         <w:rPr>
           <w:lang w:val="es_ES" w:bidi="es_ES"/>
         </w:rPr>
-        <w:t xml:space="preserve"> Esta es la historia de Ismael, el hijo que Abraham tuvo con Agar la egipcia, sierva de Sara.</w:t>
+        <w:t xml:space="preserve"> Esta es la historia de Ismael, el hijo que Abraham tuvo con Agar, la egipcia, sierva de Sara. Estos son los nombres de los hijos de Ismael, por orden de nacimiento: Nebayot, Cedar, Abdel, Mibsán, Mismá, Dumá, Masá, Hadad, Temá, Jetur, Nafis y Cedema.</w:t>
       </w:r>
     </w:p>
     <w:p>
@@ -13450,7 +13345,7 @@
         <w:rPr>
           <w:lang w:val="es_ES" w:bidi="es_ES"/>
         </w:rPr>
-        <w:t xml:space="preserve"> Y Dios le dijo: —En tu vientre hay dos naciones, 2 pueblos separados desde tus entrañas. Uno será más fuerte que el otro, y el menor servirá al mayor.</w:t>
+        <w:t xml:space="preserve"> Y Dios le dijo: —En tu vientre hay dos naciones, 2 pueblos separados desde tus entrañas. Uno será más fuerte que el otro, y el mayor servirá al menor.</w:t>
       </w:r>
     </w:p>
     <w:p>
@@ -15372,7 +15267,7 @@
         <w:rPr>
           <w:lang w:val="es_ES" w:bidi="es_ES"/>
         </w:rPr>
-        <w:t xml:space="preserve"> Quédate con él un tiempo, hasta que calme la furia de tu hermano.</w:t>
+        <w:t xml:space="preserve"> Quédate con él un tiempo, hasta que calme la furia de tu hermano. Entonces, cuando haya olvidado lo que le hiciste, te enviaré a buscar y te traeré de vuelta. ¿Cómo voy a perder a mis 2 hijos en un mismo día?</w:t>
       </w:r>
     </w:p>
     <w:p>
@@ -15745,7 +15640,7 @@
         <w:rPr>
           <w:lang w:val="es_ES" w:bidi="es_ES"/>
         </w:rPr>
-        <w:t xml:space="preserve"> Al despertar Jacob de su sueño, tuvo miedo y dijo: «Sin duda, el Señor está en este lugar y yo no lo sabía».</w:t>
+        <w:t xml:space="preserve"> Al despertar Jacob de su sueño, tuvo miedo y dijo:—Sin duda, el Señor está en este lugar y yo no lo sabía.leno de temor, añadió:—¡Qué asombroso es este lugar! ¡Es nada menos que la casa de Dios y la puerta del cielo!</w:t>
       </w:r>
     </w:p>
     <w:p>
@@ -15808,7 +15703,7 @@
         <w:rPr>
           <w:lang w:val="es_ES" w:bidi="es_ES"/>
         </w:rPr>
-        <w:t xml:space="preserve"> Jacob hizo esta promesa: «Si Dios está conmigo y me guarda en este camino, si me da alimento y vestido, y regreso en paz a la casa de mi padre, entonces el Señor será mi Dios. Esta piedra que he puesto como monumento recordatorio será casa de Dios. Y le daré a Dios la décima parte de todo lo que me dé».</w:t>
+        <w:t xml:space="preserve"> Jacob hizo esta promesa:—Que Dios esté conmigo y me guarde en este camino. Que me dé alimento y vestido, y que regrese yo en paz a la casa de mi padre. Si todo esto ocurre, entonces el Señor será mi Dios. Esta piedra que he puesto como monumento recordatorio será casa de Dios. Y le daré a Dios la décima parte de todo lo que me dé.</w:t>
       </w:r>
     </w:p>
     <w:p>
@@ -16680,7 +16575,7 @@
         <w:rPr>
           <w:lang w:val="es_ES" w:bidi="es_ES"/>
         </w:rPr>
-        <w:t xml:space="preserve"> Le puso por nombre José,José: En hebreo, José quiere decir que él añada." class="footnote-marker"&gt;7 y dijo: «Quiera el Señor añadirme un hijo más».</w:t>
+        <w:t xml:space="preserve"> Bilhá quedó embarazada y le dio un hijo a Jacob.</w:t>
       </w:r>
     </w:p>
     <w:p>
@@ -16701,7 +16596,7 @@
         <w:rPr>
           <w:lang w:val="es_ES" w:bidi="es_ES"/>
         </w:rPr>
-        <w:t xml:space="preserve"> Raquel dijo: «¡Dios me ha hecho justicia! ¡Escuchó mi oración y me ha dado un hijo!». Por eso lo llamó Dan.Dan: En hebreo, Dan quiere decir él hizo justicia." class="footnote-marker"&gt;1</w:t>
+        <w:t xml:space="preserve"> Raquel dijo:—¡Dios me ha hecho justicia! ¡Escuchó mi oración y me ha dado un hijo!Por eso lo llamó Dan.1</w:t>
       </w:r>
     </w:p>
     <w:p>
@@ -16743,7 +16638,7 @@
         <w:rPr>
           <w:lang w:val="es_ES" w:bidi="es_ES"/>
         </w:rPr>
-        <w:t xml:space="preserve"> Raquel dijo: «Dios me ha hecho luchar con mi hermana y he vencido». Por eso le puso por nombre Neftalí.Neftalí: En hebreo, Neftalí significa mi lucha." class="footnote-marker"&gt;2</w:t>
+        <w:t xml:space="preserve"> Raquel dijo:—Dios me ha hecho luchar con mi hermana y he vencido. Por eso le puso por nombre Neftalí.2</w:t>
       </w:r>
     </w:p>
     <w:p>
@@ -16806,7 +16701,7 @@
         <w:rPr>
           <w:lang w:val="es_ES" w:bidi="es_ES"/>
         </w:rPr>
-        <w:t xml:space="preserve"> Lea dijo: «¡Qué buena suerte!», y llamó a su hijo Gad.Gad: En hebreo, Gad puede indicar suerte o buena fortuna." class="footnote-marker"&gt;3</w:t>
+        <w:t xml:space="preserve"> Lea dijo: —¡Qué buena suerte!Y llamó a su hijo Gad.3</w:t>
       </w:r>
     </w:p>
     <w:p>
@@ -16848,7 +16743,7 @@
         <w:rPr>
           <w:lang w:val="es_ES" w:bidi="es_ES"/>
         </w:rPr>
-        <w:t xml:space="preserve"> Lea dijo: «¡Qué felicidad! Ahora las demás mujeres me felicitarán». Por eso le puso por nombre Aser.Aser: En hebreo, Aser quiere decir feliz, dichoso." class="footnote-marker"&gt;4</w:t>
+        <w:t xml:space="preserve"> Lea dijo:—¡Qué felicidad! Ahora las demás mujeres me felicitarán. Por eso le puso por nombre Aser.4</w:t>
       </w:r>
     </w:p>
     <w:p>
@@ -16953,7 +16848,7 @@
         <w:rPr>
           <w:lang w:val="es_ES" w:bidi="es_ES"/>
         </w:rPr>
-        <w:t xml:space="preserve"> Lea dijo: «Dios me ha dado recompensa por haberle entregado mi sierva a mi esposo». Por eso lo llamó Isacar.Isacar: Isacar suena como las palabras hebreas que quieren decir premiar y alquilar." class="footnote-marker"&gt;5</w:t>
+        <w:t xml:space="preserve"> Lea dijo:—Dios me ha dado recompensa por haberle entregado mi sierva a mi esposo. Por eso lo llamó Isacar.5</w:t>
       </w:r>
     </w:p>
     <w:p>
@@ -16995,7 +16890,7 @@
         <w:rPr>
           <w:lang w:val="es_ES" w:bidi="es_ES"/>
         </w:rPr>
-        <w:t xml:space="preserve"> Lea dijo: «Dios me ha hecho un buen regalo. Esta vez mi marido me honrará, pues le he dado 6 hijos». Por eso lo llamó Zabulón.6</w:t>
+        <w:t xml:space="preserve"> Lea dijo: —Dios me ha hecho un buen regalo. Esta vez mi marido me honrará, pues le he dado 6 hijos. Por eso lo llamó Zabulón.6</w:t>
       </w:r>
     </w:p>
     <w:p>
@@ -17058,7 +16953,7 @@
         <w:rPr>
           <w:lang w:val="es_ES" w:bidi="es_ES"/>
         </w:rPr>
-        <w:t xml:space="preserve"> Ella quedó embarazada y dio a luz un hijo. Entonces dijo: «Dios ha quitado mi desgracia».</w:t>
+        <w:t xml:space="preserve"> Ella quedó embarazada y dio a luz un hijo. Entonces dijo:—Dios ha quitado mi desgracia.Le puso por nombre José,7 y dijo:—Quiera el Señor añadirme un hijo más.</w:t>
       </w:r>
     </w:p>
     <w:p>
@@ -17205,7 +17100,7 @@
         <w:rPr>
           <w:lang w:val="es_ES" w:bidi="es_ES"/>
         </w:rPr>
-        <w:t xml:space="preserve"> ―¿Qué salario quieres que te pague? —volvió a preguntarle Labán. Jacob respondió: ―No me tienes que pagar nada. Si aceptas lo que te voy a proponer, seguiré cuidando tus rebaños.</w:t>
+        <w:t xml:space="preserve"> ―¿Qué salario quieres que te pague? —volvió a preguntarle Labán.Jacob respondió:―No me tienes que pagar nada. Si aceptas lo que te voy a proponer, seguiré cuidando tus rebaños. Hoy pasaré por todo tu rebaño y apartaré las ovejas manchadas, moteadas y negras, así como todas las cabras manchadas y moteadas. Ese será mi salario.</w:t>
       </w:r>
     </w:p>
     <w:p>
@@ -17268,7 +17163,7 @@
         <w:rPr>
           <w:lang w:val="es_ES" w:bidi="es_ES"/>
         </w:rPr>
-        <w:t xml:space="preserve"> Ese mismo día Labán salió al campo y apartó todos los chivos con rayas o manchas, y todas las cabras con algo de color o manchas o listas blancas, y todos los corderos negros. Labán entregó este rebaño a sus hijos para que lo cuidaran.</w:t>
+        <w:t xml:space="preserve"> Ese mismo día Labán salió al campo y apartó todos los chivos con rayas o manchas, y todas las cabras con algo de color o manchas o listas blancas, y todos los corderos negros. Labán entregó este rebaño a sus hijos para que lo cuidaran. Después, Labán se llevó el rebaño a unos 3 días de distancia de Jacob, mientras este seguía cuidando el resto de los rebaños de Labán.</w:t>
       </w:r>
     </w:p>
     <w:p>
@@ -17331,7 +17226,7 @@
         <w:rPr>
           <w:lang w:val="es_ES" w:bidi="es_ES"/>
         </w:rPr>
-        <w:t xml:space="preserve"> los machos se apareaban con ellas frente a las ramas. Así parían crías rayadas, manchadas y moteadas.</w:t>
+        <w:t xml:space="preserve"> los machos se apareaban con ellas frente a las ramas. Así parían crías rayadas, manchadas y moteadas. Entonces Jacob separaba las ovejas y las ponía frente a los animales rayados y oscuros del ganado de Labán. Así formó Jacob su propio ganado, diferente del de Labán.</w:t>
       </w:r>
     </w:p>
     <w:p>
@@ -17431,7 +17326,7 @@
         <w:rPr>
           <w:lang w:val="es_ES" w:bidi="es_ES"/>
         </w:rPr>
-        <w:t xml:space="preserve"> Jacob, pues, engañó a Labán el arameo y salió sin decirle nada.</w:t>
+        <w:t xml:space="preserve"> Jacob se enteró de que los hijos de Labán iban diciendo: —Jacob se ha ido quedando con todo lo que era de nuestro padre, por eso se ha hecho tan rico.</w:t>
       </w:r>
     </w:p>
     <w:p>
@@ -17662,7 +17557,7 @@
         <w:rPr>
           <w:lang w:val="es_ES" w:bidi="es_ES"/>
         </w:rPr>
-        <w:t xml:space="preserve"> Entonces él me dijo: "Levanta la vista y verás que los machos que cubren a las hembras son manchados, rayados o moteados. Yo estoy al tanto de lo que Labán te ha hecho.</w:t>
+        <w:t xml:space="preserve"> Entonces él me dijo: "Levanta la vista y verás que los machos que cubren a las hembras son manchados, rayados o moteados. Yo estoy al tanto de lo que Labán te ha hecho. Yo soy el Dios de Betel, el lugar donde ungiste la piedra y me hiciste una promesa. Deja ahora este país y vete a la tierra donde naciste".</w:t>
       </w:r>
     </w:p>
     <w:p>
@@ -17746,7 +17641,7 @@
         <w:rPr>
           <w:lang w:val="es_ES" w:bidi="es_ES"/>
         </w:rPr>
-        <w:t xml:space="preserve"> Entonces Jacob hizo los preparativos, montó a sus hijos y a sus esposas sobre los camellos</w:t>
+        <w:t xml:space="preserve"> Entonces Jacob hizo los preparativos. Montó a sus hijos y a sus esposas sobre los camellos y se puso en marcha con todo el ganado y las riquezas que había conseguido en Padán Aram. Salió rumbo a la tierra de Canaán, donde vivía Isaac, su padre. Mientras Labán esquilaba sus ovejas, Raquel robó los ídolos de su padre. Jacob, pues, engañó a Labán el arameo y salió sin decirle nada.</w:t>
       </w:r>
     </w:p>
     <w:p>
@@ -18397,7 +18292,7 @@
         <w:rPr>
           <w:lang w:val="es_ES" w:bidi="es_ES"/>
         </w:rPr>
-        <w:t xml:space="preserve"> Labán continuó diciéndole a Jacob: —Mira bien, este montón de piedras y este monumento que he levantado entre nosotros.</w:t>
+        <w:t xml:space="preserve"> Labán continuó diciéndole a Jacob: —Mira bien este montón de piedras y este monumento que he levantado entre nosotros. Serán testigos de que ni tú ni yo cruzaremos el límite que marcan para hacernos daño.</w:t>
       </w:r>
     </w:p>
     <w:p>
@@ -18560,7 +18455,7 @@
         <w:rPr>
           <w:lang w:val="es_ES" w:bidi="es_ES"/>
         </w:rPr>
-        <w:t xml:space="preserve"> con este encargo:—Así dirán a mi señor Esaú: "Su siervo Jacob nos envía a decirle: 'He estado viviendo con Labán hasta hace poco.</w:t>
+        <w:t xml:space="preserve"> con este encargo:—Díganle a mi señor Esaú que su siervo Jacob dice: "He estado viviendo con Labán hasta hace poco.</w:t>
       </w:r>
     </w:p>
     <w:p>
@@ -18581,7 +18476,7 @@
         <w:rPr>
           <w:lang w:val="es_ES" w:bidi="es_ES"/>
         </w:rPr>
-        <w:t xml:space="preserve"> Tengo bueyes, burros, ovejas, siervos y siervas. Envío este mensaje a mi señor con la esperanza de ganarme su favor'".</w:t>
+        <w:t xml:space="preserve"> Tengo bueyes, burros, ovejas, siervos y siervas. Envío este mensaje a mi señor con la esperanza de ganarme su favor".</w:t>
       </w:r>
     </w:p>
     <w:p>
@@ -18602,7 +18497,7 @@
         <w:rPr>
           <w:lang w:val="es_ES" w:bidi="es_ES"/>
         </w:rPr>
-        <w:t xml:space="preserve"> Cuando los mensajeros regresaron, le dijeron a Jacob: —Hemos ido a donde está su hermano Esaú. Él también viene a su encuentro; le acompañan cuatrocientos hombres.</w:t>
+        <w:t xml:space="preserve"> Cuando los mensajeros regresaron, le dijeron a Jacob: —Hemos ido a donde está su hermano Esaú. Él también viene a su encuentro; le acompañan 400 hombres.</w:t>
       </w:r>
     </w:p>
     <w:p>
@@ -18623,7 +18518,7 @@
         <w:rPr>
           <w:lang w:val="es_ES" w:bidi="es_ES"/>
         </w:rPr>
-        <w:t xml:space="preserve"> Jacob sintió miedo y se angustió mucho. Así que dividió la gente que estaba con él, así como las ovejas, las vacas y los camellos, en dos grupos.</w:t>
+        <w:t xml:space="preserve"> Jacob sintió miedo y se angustió mucho. Así que dividió la gente que estaba con él, así como las ovejas, las vacas y los camellos, en 2 grupos.</w:t>
       </w:r>
     </w:p>
     <w:p>
@@ -18665,7 +18560,7 @@
         <w:rPr>
           <w:lang w:val="es_ES" w:bidi="es_ES"/>
         </w:rPr>
-        <w:t xml:space="preserve"> Así se quedó solo. Entonces un hombre luchó con él hasta el amanecer.</w:t>
+        <w:t xml:space="preserve"> Entonces Jacob oró:—Señor, Dios de mi abuelo Abraham y de mi padre Isaac, tú me dijiste que regresara a la tierra donde nací. Me dijiste que estarías conmigo y que me iría bien.</w:t>
       </w:r>
     </w:p>
     <w:p>
@@ -18749,7 +18644,7 @@
         <w:rPr>
           <w:lang w:val="es_ES" w:bidi="es_ES"/>
         </w:rPr>
-        <w:t xml:space="preserve"> Jacob pasó allí la noche y preparó presentes para su hermano Esaú:</w:t>
+        <w:t xml:space="preserve"> Jacob pasó allí la noche y preparó presentes para su hermano Esaú: 200 cabras, 20 chivos, 200 ovejas, 20 carneros, 30 camellas con sus crías, 40 vacas, 10 toros, 20 burras y 10 burros.doscientas cabras, veinte chivos, doscientas ovejas, veinte carneros, treinta camellas con sus crías, cuarenta vacas, diez toros, veinte burras y diez burros.</w:t>
       </w:r>
     </w:p>
     <w:p>
@@ -18896,7 +18791,7 @@
         <w:rPr>
           <w:lang w:val="es_ES" w:bidi="es_ES"/>
         </w:rPr>
-        <w:t xml:space="preserve"> Aquella misma noche, Jacob se levantó y tomó a sus 2 esposas, a sus 2 siervas y a sus 11 hijos, y cruzaron el vado del río Jaboc. Después de hacerlos pasar junto con todas sus posesiones, se quedó solo. Entonces un hombre luchó con él hasta el amanecer.</w:t>
+        <w:t xml:space="preserve"> Aquella misma noche, Jacob se levantó y tomó a sus 2 esposas, a sus 2 siervas y a sus 11 hijos, y cruzaron el vado del río Jaboc. Después de que todos cruzaran, Jacob hizo pasar también todos sus bienes. Así se quedó solo. Entonces un hombre luchó con él hasta el amanecer.</w:t>
       </w:r>
     </w:p>
     <w:p>
@@ -19642,7 +19537,7 @@
         <w:rPr>
           <w:lang w:val="es_ES" w:bidi="es_ES"/>
         </w:rPr>
-        <w:t xml:space="preserve"> Jamor, padre de Siquén, fue a hablar con Jacob.</w:t>
+        <w:t xml:space="preserve"> Jamor, padre de Siquén, fue a hablar con Jacob. Los hijos de Jacob llegaron del campo y se enteraron de lo ocurrido. Se sintieron muy dolidos y se llenaron de ira. Siquén había cometido una ofensa gravísima contra Israel al acostarse con su hija. Nunca debió haber hecho algo así.</w:t>
       </w:r>
     </w:p>
     <w:p>
@@ -19684,7 +19579,7 @@
         <w:rPr>
           <w:lang w:val="es_ES" w:bidi="es_ES"/>
         </w:rPr>
-        <w:t xml:space="preserve"> Seamos parientes. Casemos a nuestras hijas con sus hijos y a sus hijas con nuestros hijos.</w:t>
+        <w:t xml:space="preserve"> Seamos parientes. Casemos a nuestras hijas con sus hijos y a sus hijas con nuestros hijos. Así podrán vivir entre nosotros, y nuestra tierra estará a su disposición para que vivan aquí, hagan negocios y compren terrenos.</w:t>
       </w:r>
     </w:p>
     <w:p>
@@ -19789,7 +19684,7 @@
         <w:rPr>
           <w:lang w:val="es_ES" w:bidi="es_ES"/>
         </w:rPr>
-        <w:t xml:space="preserve"> Ahora bien, si ustedes aceptan que todos los varones de su pueblo se circunciden, podremos aceptarlo.</w:t>
+        <w:t xml:space="preserve"> Ahora bien, si ustedes aceptan que todos los varones de su pueblo se circunciden, podremos aceptarlo. Además, así podremos darles a nuestras hijas para casarse con sus hijos y a nuestros hijos para casarse con sus hijas. Esa es la condición que les ponemos. Si la cumplen, nos quedaremos a vivir con ustedes y formaremos un solo pueblo.</w:t>
       </w:r>
     </w:p>
     <w:p>
@@ -19831,7 +19726,7 @@
         <w:rPr>
           <w:lang w:val="es_ES" w:bidi="es_ES"/>
         </w:rPr>
-        <w:t xml:space="preserve"> Jamor y Siquén aceptaron la propuesta.</w:t>
+        <w:t xml:space="preserve"> Jamor y Siquén aceptaron la propuesta. Siquén estaba tan enamorado de Dina que no tardó en circuncidarse. Siquén gozaba del respeto de toda su familia,</w:t>
       </w:r>
     </w:p>
     <w:p>
@@ -19852,7 +19747,7 @@
         <w:rPr>
           <w:lang w:val="es_ES" w:bidi="es_ES"/>
         </w:rPr>
-        <w:t xml:space="preserve"> él y Jamor, su padre, fueron a la puerta de la ciudad y hablaron con sus conciudadanos. Les dijeron:</w:t>
+        <w:t xml:space="preserve"> Él y Jamor, su padre, fueron a la puerta de la ciudad y hablaron con sus conciudadanos. Les dijeron:</w:t>
       </w:r>
     </w:p>
     <w:p>
@@ -19894,7 +19789,7 @@
         <w:rPr>
           <w:lang w:val="es_ES" w:bidi="es_ES"/>
         </w:rPr>
-        <w:t xml:space="preserve"> Pero ellos nos han puesto una condición, que todos los varones nos circuncidemos, como ellos hacen. Si la cumplimos, se quedarán a vivir entre nosotros y formaremos un solo pueblo.</w:t>
+        <w:t xml:space="preserve"> Pero ellos nos han puesto una condición, que todos los varones nos circuncidemos, como ellos hacen. Si la cumplimos, se quedarán a vivir entre nosotros y formaremos un solo pueblo. Aceptemos la condición. Así habitarán con nosotros, y sus posesiones y todo su ganado serán nuestros.</w:t>
       </w:r>
     </w:p>
     <w:p>
@@ -19936,7 +19831,7 @@
         <w:rPr>
           <w:lang w:val="es_ES" w:bidi="es_ES"/>
         </w:rPr>
-        <w:t xml:space="preserve"> Al tercer día, los varones aún estaban muy adoloridos. Simeón y Leví, hijos de Jacob y hermanos de Dina, tomaron cada uno su espada y entraron en la ciudad. Los varones estaban desprevenidos y los mataron a todos.</w:t>
+        <w:t xml:space="preserve"> Al tercer día, los varones aún estaban muy adoloridos. Simeón y Leví, hijos de Jacob y hermanos de Dina, tomaron cada uno su espada y entraron en la ciudad. Los varones estaban desprevenidos y los mataron a todos. Mataron también a Jamor y a Siquén, su hijo, a filo de espada. Sacaron a Dina de la casa de Siquén y se fueron.</w:t>
       </w:r>
     </w:p>
     <w:p>
@@ -20645,28 +20540,7 @@
         <w:rPr>
           <w:lang w:val="es_ES" w:bidi="es_ES"/>
         </w:rPr>
-        <w:t xml:space="preserve"> Isaac era muy anciano cuando murió. Tenía 180 años. Sus hijos Esaú y Jacob lo sepultaron.</w:t>
-      </w:r>
-    </w:p>
-    <w:p>
-      <w:pPr/>
-      <w:r>
-        <w:rPr>
-          <w:lang w:val="es_ES" w:bidi="es_ES"/>
-        </w:rPr>
-      </w:r>
-      <w:r>
-        <w:rPr>
-          <w:vertAlign w:val="superscript"/>
-          <w:lang w:val="es_ES" w:bidi="es_ES"/>
-        </w:rPr>
-        <w:t>0</w:t>
-      </w:r>
-      <w:r>
-        <w:rPr>
-          <w:lang w:val="es_ES" w:bidi="es_ES"/>
-        </w:rPr>
-        <w:t xml:space="preserve"> Quenaz, Temán, Mibzar,</w:t>
+        <w:t xml:space="preserve"> Isaac era muy anciano cuando murió y fue a reunirse con sus antepasados. Tenía 180 años. Sus hijos Esaú y Jacob lo sepultaron.</w:t>
       </w:r>
     </w:p>
     <w:p>
@@ -20718,34 +20592,13 @@
           <w:vertAlign w:val="superscript"/>
           <w:lang w:val="es_ES" w:bidi="es_ES"/>
         </w:rPr>
-        <w:t>2</w:t>
-      </w:r>
-      <w:r>
-        <w:rPr>
-          <w:lang w:val="es_ES" w:bidi="es_ES"/>
-        </w:rPr>
-        <w:t xml:space="preserve"> Coré, Gatán y Amalec. Estos fueron los jefes de los descendientes de Elifaz en la tierra de Edom. Todos ellos fueron descendientes de Ada.</w:t>
-      </w:r>
-    </w:p>
-    <w:p>
-      <w:pPr/>
-      <w:r>
-        <w:rPr>
-          <w:lang w:val="es_ES" w:bidi="es_ES"/>
-        </w:rPr>
-      </w:r>
-      <w:r>
-        <w:rPr>
-          <w:vertAlign w:val="superscript"/>
-          <w:lang w:val="es_ES" w:bidi="es_ES"/>
-        </w:rPr>
         <w:t>3</w:t>
       </w:r>
       <w:r>
         <w:rPr>
           <w:lang w:val="es_ES" w:bidi="es_ES"/>
         </w:rPr>
-        <w:t xml:space="preserve"> Esaú se casó con mujeres cananesas: con Ada, hija de Elón el hitita; con Aholibama, hija de Aná y nieta de Zibeón el heveo;</w:t>
+        <w:t xml:space="preserve"> Se casó Esaú con mujeres cananesas: con Ada, hija de Elón, el hitita; con Aholibama, hija de Aná y nieta de Zibeón, el heveo; y con Basemat, hija de Ismael y hermana de Nebayot.</w:t>
       </w:r>
     </w:p>
     <w:p>
@@ -20766,7 +20619,7 @@
         <w:rPr>
           <w:lang w:val="es_ES" w:bidi="es_ES"/>
         </w:rPr>
-        <w:t xml:space="preserve"> Tras la muerte de Baal Janán, reinó Hadad, de la ciudad de Pau. La esposa de Hadad fue Mehitabel, hija de Matred y nieta de Mezab.</w:t>
+        <w:t xml:space="preserve"> Con Ada tuvo un hijo llamado Elifaz, y con Basemat tuvo a Reuel.</w:t>
       </w:r>
     </w:p>
     <w:p>
@@ -20802,34 +20655,13 @@
           <w:vertAlign w:val="superscript"/>
           <w:lang w:val="es_ES" w:bidi="es_ES"/>
         </w:rPr>
-        <w:t>7</w:t>
-      </w:r>
-      <w:r>
-        <w:rPr>
-          <w:lang w:val="es_ES" w:bidi="es_ES"/>
-        </w:rPr>
-        <w:t xml:space="preserve"> Los hijos de Elifaz fueron Temán, Omar, Zefo, Gatán y Quenaz.</w:t>
-      </w:r>
-    </w:p>
-    <w:p>
-      <w:pPr/>
-      <w:r>
-        <w:rPr>
-          <w:lang w:val="es_ES" w:bidi="es_ES"/>
-        </w:rPr>
-      </w:r>
-      <w:r>
-        <w:rPr>
-          <w:vertAlign w:val="superscript"/>
-          <w:lang w:val="es_ES" w:bidi="es_ES"/>
-        </w:rPr>
         <w:t>8</w:t>
       </w:r>
       <w:r>
         <w:rPr>
           <w:lang w:val="es_ES" w:bidi="es_ES"/>
         </w:rPr>
-        <w:t xml:space="preserve"> Esaú tomó a sus esposas, sus hijos, sus hijas, toda su familia, su ganado, todos sus animales y todos los bienes que había adquirido en la tierra de Canaán. Se fue a la tierra de Seír para alejarse de su hermano Jacob.</w:t>
+        <w:t xml:space="preserve"> Esaú tomó a sus esposas, sus hijos, sus hijas, toda su familia, su ganado, todos sus animales y todos los bienes que había adquirido en la tierra de Canaán. Se fue a la tierra de Seír para alejarse de su hermano Jacob. Habían acumulado tantos bienes que ya no podían vivir juntos, pues no había suficiente tierra para ambos. Esaú, que es Edom, se quedó a vivir en la región montañosa de Seír.</w:t>
       </w:r>
     </w:p>
     <w:p>
@@ -20871,7 +20703,7 @@
         <w:rPr>
           <w:lang w:val="es_ES" w:bidi="es_ES"/>
         </w:rPr>
-        <w:t xml:space="preserve"> Estos son los nombres de los hijos de Esaú: Elifaz hijo de Ada, esposa de Esaú; y Reuel hijo de Basemat, esposa de Esaú.</w:t>
+        <w:t xml:space="preserve"> Estos son los nombres de los hijos de Esaú. Elifaz fue hijo de Ada, esposa de Esaú. Reuel fue hijo de Basemat, esposa de Esaú. Los hijos de Elifaz fueron Temán, Omar, Zefo, Gatán y Quenaz. Elifaz tuvo un hijo con su concubina Timná, y lo llamó Amalec. Todos estos fueron descendientes de Ada, esposa de Esaú.</w:t>
       </w:r>
     </w:p>
     <w:p>
@@ -20934,7 +20766,7 @@
         <w:rPr>
           <w:lang w:val="es_ES" w:bidi="es_ES"/>
         </w:rPr>
-        <w:t xml:space="preserve"> Estos son los jefes de los descendientes de Esaú. De los hijos de Elifaz, primogénito de Esaú, los jefes fueron Temán, Omar, Zefo, Quenaz,</w:t>
+        <w:t xml:space="preserve"> Estos son los jefes de los descendientes de Esaú. De los hijos de Elifaz, primogénito de Esaú, los jefes fueron Temán, Omar, Zefo, Quenaz, Coré, Gatán y Amalec. Estos fueron los jefes de los descendientes de Elifaz en la tierra de Edom. Todos ellos fueron descendientes de Ada.</w:t>
       </w:r>
     </w:p>
     <w:p>
@@ -21018,7 +20850,7 @@
         <w:rPr>
           <w:lang w:val="es_ES" w:bidi="es_ES"/>
         </w:rPr>
-        <w:t xml:space="preserve"> Estos fueron los descendientes de Seír el horeo, que vivían en aquella región: Lotán, Sobal, Zibeón, Aná,</w:t>
+        <w:t xml:space="preserve"> Estos fueron los descendientes de Seír, el horeo, que vivían en aquella región: Lotán, Sobal, Zibeón, Aná, Disón, Ezer y Disán. Estos descendientes de Seír son los jefes de los horeos en la tierra de Edom.</w:t>
       </w:r>
     </w:p>
     <w:p>
@@ -21186,7 +21018,7 @@
         <w:rPr>
           <w:lang w:val="es_ES" w:bidi="es_ES"/>
         </w:rPr>
-        <w:t xml:space="preserve"> Los jefes de los horeos fueron Lotán, Sobal, Zibeón, Aná,</w:t>
+        <w:t xml:space="preserve"> Los jefes de los horeos fueron Lotán, Sobal, Zibeón, Aná, Disón, Ezer y Disán. Cada uno de ellos fue jefe de su tribu en la región de Seír.</w:t>
       </w:r>
     </w:p>
     <w:p>
@@ -21207,7 +21039,7 @@
         <w:rPr>
           <w:lang w:val="es_ES" w:bidi="es_ES"/>
         </w:rPr>
-        <w:t xml:space="preserve"> Estos son los nombres de los reyes que gobernaron en la tierra de Edom antes de que hubiera rey en Israel.</w:t>
+        <w:t xml:space="preserve"> Estos son los nombres de los reyes que gobernaron en la tierra de Edom antes de que hubiera rey en Israel. El rey Bela, hijo de Beor, reinó en la ciudad de Dinaba. Después de su muerte, reinó Jobab, hijo de Zera, del pueblo de Bosra. Luego murió Jobab y reinó Jusán, de la tierra de Temán. Después murió Jusán y reinó Hadad, hijo de Bedad, que derrotó a Madián en el campo de Moab; su ciudad fue Avit. Tras su muerte, reinó Samla, del pueblo de Masreca. Luego murió Samla y reinó Saúl, de Rejobot, junto al río Éufrates. Después murió Saúl y reinó Baal Janán, hijo de Acbor. Tras la muerte de Baal Janán, reinó Hadad, de la ciudad de Pau. La esposa de Hadad fue Mehetabel, hija de Matred y nieta de Mezab.</w:t>
       </w:r>
     </w:p>
     <w:p>
@@ -21228,28 +21060,7 @@
         <w:rPr>
           <w:lang w:val="es_ES" w:bidi="es_ES"/>
         </w:rPr>
-        <w:t xml:space="preserve"> Estos son los nombres de los jefes descendientes de Esaú, según sus clanes, sus regiones y sus nombres: Timná, Alvá, Jetet,</w:t>
-      </w:r>
-    </w:p>
-    <w:p>
-      <w:pPr/>
-      <w:r>
-        <w:rPr>
-          <w:lang w:val="es_ES" w:bidi="es_ES"/>
-        </w:rPr>
-      </w:r>
-      <w:r>
-        <w:rPr>
-          <w:vertAlign w:val="superscript"/>
-          <w:lang w:val="es_ES" w:bidi="es_ES"/>
-        </w:rPr>
-        <w:t>44</w:t>
-      </w:r>
-      <w:r>
-        <w:rPr>
-          <w:lang w:val="es_ES" w:bidi="es_ES"/>
-        </w:rPr>
-        <w:t xml:space="preserve"> Elifaz tuvo un hijo con su concubina Timná, y lo llamó Amalec. Todos estos fueron descendientes de Ada, esposa de Esaú.</w:t>
+        <w:t xml:space="preserve"> Estos son los nombres de los jefes descendientes de Esaú, según sus clanes, sus regiones y sus nombres: Timná, Alvá, Jetet, Aholibama, Elá, Pinón, Quenaz, Temán, Mibzar, Magdiel e Iram. Estos fueron los jefes de Edom, según los lugares donde vivían. Este fue Esaú, padre de los edomitas.</w:t>
       </w:r>
     </w:p>
     <w:p>
@@ -21433,7 +21244,7 @@
         <w:rPr>
           <w:lang w:val="es_ES" w:bidi="es_ES"/>
         </w:rPr>
-        <w:t xml:space="preserve"> Su padre continuó:—Ve a ver cómo están tus hermanos y el rebaño y tráeme noticias.Así que lo envió desde el valle de Hebrón y José fue a Siquén.</w:t>
+        <w:t xml:space="preserve"> Sus hermanos le respondieron:—¿Qué te crees, que vas a reinar sobre nosotros? Y lo odiaron aún más por los sueños que contaba.</w:t>
       </w:r>
     </w:p>
     <w:p>
@@ -21538,7 +21349,7 @@
         <w:rPr>
           <w:lang w:val="es_ES" w:bidi="es_ES"/>
         </w:rPr>
-        <w:t xml:space="preserve"> Entonces Israel llamó a José y le dijo: —Tus hermanos están apacentando en Siquén. Quiero que vayas a verlos.José respondió: —Sí, iré.</w:t>
+        <w:t xml:space="preserve"> Entonces Israel llamó a José y le dijo: —Tus hermanos están apacentando en Siquén. Quiero que vayas a verlos.José respondió:—Sí, iré.Su padre continuó:—Ve a ver cómo están tus hermanos y el rebaño y tráeme noticias.Así que lo envió desde el valle de Hebrón y José fue a Siquén.</w:t>
       </w:r>
     </w:p>
     <w:p>
@@ -21664,7 +21475,7 @@
         <w:rPr>
           <w:lang w:val="es_ES" w:bidi="es_ES"/>
         </w:rPr>
-        <w:t xml:space="preserve"> Cuando Rubén escuchó esto, intentó librarlo de las manos de sus hermanos. Dijo: —No lo matemos.</w:t>
+        <w:t xml:space="preserve"> Cuando Rubén escuchó esto, intentó librarlo de las manos de sus hermanos. Dijo: —No lo matemos. No derramen sangre. Arrójenlo vivo a esta cisterna en el desierto, pero no le pongan la mano encima.Lo que Rubén quería era rescatarlo y llevarlo de vuelta con su padre.</w:t>
       </w:r>
     </w:p>
     <w:p>
@@ -21748,7 +21559,7 @@
         <w:rPr>
           <w:lang w:val="es_ES" w:bidi="es_ES"/>
         </w:rPr>
-        <w:t xml:space="preserve"> Entonces Judá dijo a sus hermanos:―¡Miren! ¿Qué ganamos con matar a nuestro hermano y encubrir su muerte?</w:t>
+        <w:t xml:space="preserve"> Entonces Judá dijo a sus hermanos:―¡Miren! ¿Qué ganamos con matar a nuestro hermano y encubrir su muerte? Mejor se lo vendemos a los ismaelitas, en vez de ponerle la mano encima. Después de todo, es nuestro hermano, de nuestra propia sangre. Sus hermanos estuvieron de acuerdo.</w:t>
       </w:r>
     </w:p>
     <w:p>
@@ -23113,34 +22924,13 @@
           <w:vertAlign w:val="superscript"/>
           <w:lang w:val="es_ES" w:bidi="es_ES"/>
         </w:rPr>
-        <w:t>2</w:t>
-      </w:r>
-      <w:r>
-        <w:rPr>
-          <w:lang w:val="es_ES" w:bidi="es_ES"/>
-        </w:rPr>
-        <w:t xml:space="preserve"> con tres ramas. La vid echó brotes, floreció y maduraron uvas en los racimos.</w:t>
-      </w:r>
-    </w:p>
-    <w:p>
-      <w:pPr/>
-      <w:r>
-        <w:rPr>
-          <w:lang w:val="es_ES" w:bidi="es_ES"/>
-        </w:rPr>
-      </w:r>
-      <w:r>
-        <w:rPr>
-          <w:vertAlign w:val="superscript"/>
-          <w:lang w:val="es_ES" w:bidi="es_ES"/>
-        </w:rPr>
         <w:t>3</w:t>
       </w:r>
       <w:r>
         <w:rPr>
           <w:lang w:val="es_ES" w:bidi="es_ES"/>
         </w:rPr>
-        <w:t xml:space="preserve"> Así que los envió a la cárcel donde José estaba preso, bajo la custodia del capitán de la guardia.</w:t>
+        <w:t xml:space="preserve"> El faraón se enojó con estos 2 oficiales, el jefe de los coperos y el jefe de los panaderos. Así que los envió a la cárcel donde José estaba preso, bajo la custodia del capitán de la guardia.</w:t>
       </w:r>
     </w:p>
     <w:p>
@@ -23266,7 +23056,7 @@
         <w:rPr>
           <w:lang w:val="es_ES" w:bidi="es_ES"/>
         </w:rPr>
-        <w:t xml:space="preserve"> Entonces el jefe de los coperos contó su sueño:—Soñé que delante de mí había una vid</w:t>
+        <w:t xml:space="preserve"> Entonces el jefe de los coperos contó su sueño:—Soñé que delante de mí había una vid con 3 ramas. La vid echó brotes, floreció y maduraron uvas en los racimos.</w:t>
       </w:r>
     </w:p>
     <w:p>
@@ -23744,7 +23534,7 @@
         <w:rPr>
           <w:lang w:val="es_ES" w:bidi="es_ES"/>
         </w:rPr>
-        <w:t xml:space="preserve"> Esos supervisores, bajo el control del faraón, deberán recoger todo el alimento de los próximos años de abundancia y almacenarlo en las ciudades. Así habrá reserva de alimento.</w:t>
+        <w:t xml:space="preserve"> Entonces el jefe de los coperos le dijo al faraón:—Ahora recuerdo mi falta.</w:t>
       </w:r>
     </w:p>
     <w:p>
@@ -24269,7 +24059,7 @@
         <w:rPr>
           <w:lang w:val="es_ES" w:bidi="es_ES"/>
         </w:rPr>
-        <w:t xml:space="preserve"> También debería poner supervisores por todo el país. Deben recoger la quinta parte de la cosecha de todo el país en esos siete años de abundancia.</w:t>
+        <w:t xml:space="preserve"> También debería poner supervisores por todo el país. Deben recoger la quinta parte de la cosecha de todo el país en esos 7 años de abundancia. Esos supervisores, bajo el control del faraón, deberán recoger todo el alimento de los próximos años de abundancia y almacenarlo en las ciudades. Así habrá reserva de alimento.</w:t>
       </w:r>
     </w:p>
     <w:p>
@@ -24395,7 +24185,7 @@
         <w:rPr>
           <w:lang w:val="es_ES" w:bidi="es_ES"/>
         </w:rPr>
-        <w:t xml:space="preserve"> Entonces el faraón dijo a José: —Mira, te he puesto al mando sobre todo Egipto.</w:t>
+        <w:t xml:space="preserve"> Entonces el faraón dijo a José: —Mira, te he puesto al mando sobre todo Egipto.Entonces el faraón se quitó el anillo oficial de sellar y lo puso en la mano de José. Hizo que lo vistieran con vestiduras de lino y que le pusieran un collar de oro.</w:t>
       </w:r>
     </w:p>
     <w:p>
@@ -24416,7 +24206,7 @@
         <w:rPr>
           <w:lang w:val="es_ES" w:bidi="es_ES"/>
         </w:rPr>
-        <w:t xml:space="preserve"> Después lo invitó a subir en el carruaje del segundo del reino. Ordenó que pregonaran a su paso: «¡Inclínense!». Así fue como el faraón puso a José al frente de todo Egipto.</w:t>
+        <w:t xml:space="preserve"> Después lo invitó a subir en el carruaje del segundo del reino. Ordenó que pregonaran a su paso:—¡Inclínense! Así fue como el faraón puso a José al frente de todo Egipto.</w:t>
       </w:r>
     </w:p>
     <w:p>
@@ -24584,7 +24374,7 @@
         <w:rPr>
           <w:lang w:val="es_ES" w:bidi="es_ES"/>
         </w:rPr>
-        <w:t xml:space="preserve"> A su primogénito lo llamó Manasés,Manasés: Este nombre suena parecido a la palabra hebrea que significa hacer olvidar." class="footnote-marker"&gt;1 porque dijo: «Dios me hizo olvidar todos mis padecimientos y la casa de mi padre».</w:t>
+        <w:t xml:space="preserve"> A su primogénito lo llamó Manasés,1 porque dijo:—Dios me hizo olvidar todos mis padecimientos y la casa de mi padre.</w:t>
       </w:r>
     </w:p>
     <w:p>
@@ -24605,7 +24395,7 @@
         <w:rPr>
           <w:lang w:val="es_ES" w:bidi="es_ES"/>
         </w:rPr>
-        <w:t xml:space="preserve"> Al segundo hijo lo llamó Efraín,Efraín: Este nombre suena parecido a la palabra hebrea que quiere decir fecundidad." class="footnote-marker"&gt;2 porque dijo: «Dios me hizo fecundo en esta tierra de mi aflicción».</w:t>
+        <w:t xml:space="preserve"> Al segundo hijo lo llamó Efraín,2 porque dijo:—Dios me hizo fecundo en esta tierra de mi aflicción.</w:t>
       </w:r>
     </w:p>
     <w:p>
@@ -24894,7 +24684,7 @@
         <w:rPr>
           <w:lang w:val="es_ES" w:bidi="es_ES"/>
         </w:rPr>
-        <w:t xml:space="preserve"> Aunque José los había reconocido, ellos a él, no.</w:t>
+        <w:t xml:space="preserve"> Aunque José los había reconocido, ellos a él, no. Entonces José se acordó de los sueños que había tenido acerca de ellos. Les dijo:—Ustedes son espías; han venido a ver los puntos débiles de nuestro país.</w:t>
       </w:r>
     </w:p>
     <w:p>
@@ -25582,7 +25372,7 @@
         <w:rPr>
           <w:lang w:val="es_ES" w:bidi="es_ES"/>
         </w:rPr>
-        <w:t xml:space="preserve"> Pero Judá le dijo: —Aquel hombre ya nos dijo que no podíamos presentarnos ante él si no llevábamos a nuestro hermano.</w:t>
+        <w:t xml:space="preserve"> Pero Judá le dijo: —Aquel hombre ya nos dijo que no podíamos presentarnos ante él si no llevábamos a nuestro hermano. Si permites que llevemos a nuestro hermano menor, iremos y compraremos comida para ti. Pero si no nos permites llevarlo, no iremos, porque aquel hombre nos dijo no regresar sin traer a nuestro hermano.</w:t>
       </w:r>
     </w:p>
     <w:p>
@@ -25918,7 +25708,7 @@
         <w:rPr>
           <w:lang w:val="es_ES" w:bidi="es_ES"/>
         </w:rPr>
-        <w:t xml:space="preserve"> resulta que, al llegar a la posada, abrimos nuestros costales y nos encontramos con que cada uno tenía el dinero en su costal. Fue justo el dinero que habíamos pagado por el trigo. Pero lo hemos vuelto a traer.</w:t>
+        <w:t xml:space="preserve"> resulta que, al llegar a la posada, abrimos nuestros costales y nos encontramos con que cada uno tenía el dinero en su costal. Fue justo el dinero que habíamos pagado por el trigo. Pero lo hemos vuelto a traer. Además, hemos traído aún más dinero para comprar alimento. No sabemos quién puso el dinero en nuestros costales.</w:t>
       </w:r>
     </w:p>
     <w:p>
@@ -26816,7 +26606,7 @@
         <w:rPr>
           <w:lang w:val="es_ES" w:bidi="es_ES"/>
         </w:rPr>
-        <w:t xml:space="preserve"> »Ahora, señor, si regresamos a casa de nuestro padre sin nuestro hermano menor, a quien está muy apegado,</w:t>
+        <w:t xml:space="preserve"> »Ahora, señor, si regresamos a casa de nuestro padre sin nuestro hermano menor, a quien está muy apegado, seguro que se muere de tristeza. Entonces nosotros seremos culpables de que nuestro padre descienda con sus canas al lugar de los muertos.</w:t>
       </w:r>
     </w:p>
     <w:p>
@@ -27084,7 +26874,7 @@
         <w:rPr>
           <w:lang w:val="es_ES" w:bidi="es_ES"/>
         </w:rPr>
-        <w:t xml:space="preserve"> Dense prisa. Vuelvan a la casa de mi padre y díganle: "Así dice tu hijo José: 'Dios me ha puesto por señor de todo Egipto. Ven a verme sin tardanza.</w:t>
+        <w:t xml:space="preserve"> Dense prisa. Vuelvan a la casa de mi padre y díganle que así dice su hijo José: "Dios me ha puesto por señor de todo Egipto. Ven a verme sin tardanza.</w:t>
       </w:r>
     </w:p>
     <w:p>
@@ -27126,7 +26916,7 @@
         <w:rPr>
           <w:lang w:val="es_ES" w:bidi="es_ES"/>
         </w:rPr>
-        <w:t xml:space="preserve"> Yo cuidaré que no te falte alimento, porque aún quedan cinco años de hambre. Si no, tú, tu familia y todo lo que tienes quedarán en la pobreza'".</w:t>
+        <w:t xml:space="preserve"> Yo cuidaré que no te falte alimento, porque aún quedan 5 años de hambre. Si no, tú, tu familia y todo lo que tienes quedarán en la pobreza". »Mi hermano Benjamín y ustedes son testigos de lo que les he dicho. Cuéntenle a mi padre la honra que tengo en Egipto y todo lo que han visto. Apúrense y traigan a mi padre.</w:t>
       </w:r>
     </w:p>
     <w:p>
@@ -27478,7 +27268,7 @@
         <w:rPr>
           <w:lang w:val="es_ES" w:bidi="es_ES"/>
         </w:rPr>
-        <w:t xml:space="preserve"> Estos fueron los hijos que Jacob tuvo con Bilhá, la sierva que Labán le dio a su hija Raquel. En total fueron 7.</w:t>
+        <w:t xml:space="preserve"> Israel emprendió el viaje con todas sus posesiones y llegó a Berseba. Allí ofreció sacrificios al Dios de su padre Isaac.</w:t>
       </w:r>
     </w:p>
     <w:p>
@@ -27520,7 +27310,7 @@
         <w:rPr>
           <w:lang w:val="es_ES" w:bidi="es_ES"/>
         </w:rPr>
-        <w:t xml:space="preserve"> Los hijos de Benjamín fueron Bela, Béquer, Asbel, Guerá, Naamán, Ehí, Ros, Mupín, Jupín y Ard.</w:t>
+        <w:t xml:space="preserve"> Dios le dijo:―Yo soy Dios, el Dios de tu padre; no temas descender a Egipto, porque allí haré de ti una gran nación.</w:t>
       </w:r>
     </w:p>
     <w:p>
@@ -27562,7 +27352,7 @@
         <w:rPr>
           <w:lang w:val="es_ES" w:bidi="es_ES"/>
         </w:rPr>
-        <w:t xml:space="preserve"> Los hijos de Zabulón fueron Séred, Elón y Yalel.</w:t>
+        <w:t xml:space="preserve"> Jacob se fue de Berseba. Los hijos de Israel llevaron a Jacob su padre, junto con sus hijos pequeños y sus esposas, en los carros que el faraón había enviado para transportarlos.</w:t>
       </w:r>
     </w:p>
     <w:p>
@@ -27619,34 +27409,13 @@
           <w:vertAlign w:val="superscript"/>
           <w:lang w:val="es_ES" w:bidi="es_ES"/>
         </w:rPr>
-        <w:t>9</w:t>
-      </w:r>
-      <w:r>
-        <w:rPr>
-          <w:lang w:val="es_ES" w:bidi="es_ES"/>
-        </w:rPr>
-        <w:t xml:space="preserve"> Los hijos de Judá fueron Er, Onán, Selá, Fares y Zera, pero Er y Onán murieron en Canaán. Los hijos de Fares fueron Jezrón y Jamul.</w:t>
-      </w:r>
-    </w:p>
-    <w:p>
-      <w:pPr/>
-      <w:r>
-        <w:rPr>
-          <w:lang w:val="es_ES" w:bidi="es_ES"/>
-        </w:rPr>
-      </w:r>
-      <w:r>
-        <w:rPr>
-          <w:vertAlign w:val="superscript"/>
-          <w:lang w:val="es_ES" w:bidi="es_ES"/>
-        </w:rPr>
         <w:t>14</w:t>
       </w:r>
       <w:r>
         <w:rPr>
           <w:lang w:val="es_ES" w:bidi="es_ES"/>
         </w:rPr>
-        <w:t xml:space="preserve"> Estos son los nombres de los israelitas que fueron a Egipto, es decir, Jacob y sus descendientes. Rubén fue el primogénito de Jacob.</w:t>
+        <w:t xml:space="preserve"> Estos son los nombres de los israelitas que fueron a Egipto, es decir, Jacob y sus descendientes. Rubén fue el primogénito de Jacob. Los hijos de Rubén fueron Janoc, Falú, Jezrón y Carmí. Los hijos de Simeón fueron Jemuel, Jamín, Oad, Jaquín, Zojar y Saúl, hijo de la cananea. Los hijos de Leví fueron Guersón, Coat y Merari. Los hijos de Judá fueron Er, Onán, Selá, Fares y Zera, pero Er y Onán murieron en Canaán. Los hijos de Fares fueron Jezrón y Jamul. Los hijos de Isacar fueron Tola, Fuvá, Job y Simrón. Los hijos de Zabulón fueron Séred, Elón y Yalel.</w:t>
       </w:r>
     </w:p>
     <w:p>
@@ -27688,7 +27457,7 @@
         <w:rPr>
           <w:lang w:val="es_ES" w:bidi="es_ES"/>
         </w:rPr>
-        <w:t xml:space="preserve"> Los hijos de Gad fueron Zefón, Jaguí, Esbón, Suni, Erí, Arodí y Arelí.</w:t>
+        <w:t xml:space="preserve"> Los hijos de Gad fueron Zefón, Jaguí, Esbón, Suni, Erí, Arodí y Arelí. Los hijos de Aser fueron Imná, Isvá, Isví, Beriá y Sera, su hermana. Los hijos de Beriá fueron Héber y Malquiel.</w:t>
       </w:r>
     </w:p>
     <w:p>
@@ -27730,7 +27499,7 @@
         <w:rPr>
           <w:lang w:val="es_ES" w:bidi="es_ES"/>
         </w:rPr>
-        <w:t xml:space="preserve"> Los hijos de Raquel, esposa de Jacob, fueron José y Benjamín.</w:t>
+        <w:t xml:space="preserve"> Los hijos de Raquel, esposa de Jacob, fueron José y Benjamín. José tuvo 2 hijos en Egipto con Asenat, hija de Potifera, sacerdote de On. Sus 2 hijos fueron Manasés y Efraín. Los hijos de Benjamín fueron Bela, Béquer, Asbel, Guerá, Naamán, Ehí, Ros, Mupín, Jupín y Ard. En total, los descendientes de Jacob y Raquel fueron 14 personas.</w:t>
       </w:r>
     </w:p>
     <w:p>
@@ -27751,7 +27520,7 @@
         <w:rPr>
           <w:lang w:val="es_ES" w:bidi="es_ES"/>
         </w:rPr>
-        <w:t xml:space="preserve"> El hijo de Dan fue Jusín.</w:t>
+        <w:t xml:space="preserve"> El hijo de Dan fue Jusín. Los hijos de Neftalí fueron Guní, Jéser y Silén. Estos fueron los hijos que Jacob tuvo con Bilhá, la sierva que Labán le dio a su hija Raquel. En total fueron 7.</w:t>
       </w:r>
     </w:p>
     <w:p>
@@ -27941,27 +27710,6 @@
           <w:lang w:val="es_ES" w:bidi="es_ES"/>
         </w:rPr>
         <w:t xml:space="preserve"> Entonces ustedes le dirán que siempre se han dedicado al ganado, igual que sus antepasados. Así podrán quedarse a vivir en la región de Gosén, porque los egipcios no quieren estar con los pastores.</w:t>
-      </w:r>
-    </w:p>
-    <w:p>
-      <w:pPr/>
-      <w:r>
-        <w:rPr>
-          <w:lang w:val="es_ES" w:bidi="es_ES"/>
-        </w:rPr>
-      </w:r>
-      <w:r>
-        <w:rPr>
-          <w:vertAlign w:val="superscript"/>
-          <w:lang w:val="es_ES" w:bidi="es_ES"/>
-        </w:rPr>
-        <w:t>904</w:t>
-      </w:r>
-      <w:r>
-        <w:rPr>
-          <w:lang w:val="es_ES" w:bidi="es_ES"/>
-        </w:rPr>
-        <w:t xml:space="preserve"> En total, los descendientes de Jacob y Raquel fueron 14 personas.</w:t>
       </w:r>
     </w:p>
     <w:p>
@@ -28040,7 +27788,7 @@
         <w:rPr>
           <w:lang w:val="es_ES" w:bidi="es_ES"/>
         </w:rPr>
-        <w:t xml:space="preserve"> Tienes todo Egipto a tu disposición. Dales la mejor zona del país para vivir. Pueden quedarse en la región de Gosén. Y si sabes que algunos de ellos tienen experiencia, ponlos a cargo de mi ganado.</w:t>
+        <w:t xml:space="preserve"> Entonces el faraón les preguntó: —¿Cuál es su oficio?—Nosotros, tus siervos, somos pastores de ovejas —respondieron—, como nuestros antepasados.</w:t>
       </w:r>
     </w:p>
     <w:p>
@@ -28082,7 +27830,7 @@
         <w:rPr>
           <w:lang w:val="es_ES" w:bidi="es_ES"/>
         </w:rPr>
-        <w:t xml:space="preserve"> El faraón le dijo a José: —Tu padre y tus hermanos han venido a estar cerca de ti.</w:t>
+        <w:t xml:space="preserve"> El faraón le dijo a José: —Tu padre y tus hermanos han venido a estar cerca de ti. Tienes todo Egipto a tu disposición. Dales la mejor zona del país para vivir. Pueden quedarse en la región de Gosén. Y si sabes que algunos de ellos tienen experiencia, ponlos a cargo de mi ganado.</w:t>
       </w:r>
     </w:p>
     <w:p>
@@ -28875,7 +28623,7 @@
         <w:rPr>
           <w:lang w:val="es_ES" w:bidi="es_ES"/>
         </w:rPr>
-        <w:t xml:space="preserve"> José los bajó de las rodillas de Israel y se inclinó con su rostro en la tierra.</w:t>
+        <w:t xml:space="preserve"> José los bajó de las rodillas de Israel y se inclinó con su rostro en la tierra. Luego tomó a sus hijos de la mano. Tomó a Efraín con su mano derecha y a Manasés con la izquierda, y se los acercó a su padre. Así, Efraín estaba a la izquierda de Israel y Manasés a su derecha.</w:t>
       </w:r>
     </w:p>
     <w:p>
@@ -29689,7 +29437,7 @@
         <w:rPr>
           <w:lang w:val="es_ES" w:bidi="es_ES"/>
         </w:rPr>
-        <w:t xml:space="preserve"> Además, Jacob les dio estas instrucciones:—Yo estoy a punto de ir a encontrarme con mis antepasados. Sepúltenme con mis antepasados en la cueva del campo</w:t>
+        <w:t xml:space="preserve"> Además, Jacob les dio estas instrucciones:—Yo estoy a punto de ir a encontrarme con mis antepasados. Sepúltenme con mis antepasados en la cueva del campode Macpela, frente a Mamré, en Canaán. Está en el campo que Abraham le compró a Efrón, el hitita, para sepultar allí a su familia.</w:t>
       </w:r>
     </w:p>
     <w:p>
@@ -29915,7 +29663,7 @@
         <w:rPr>
           <w:lang w:val="es_ES" w:bidi="es_ES"/>
         </w:rPr>
-        <w:t xml:space="preserve"> Entonces José fue a sepultar a su padre. Fue con él toda la gente de la corte del faraón, toda la gente importante de Egipto.</w:t>
+        <w:t xml:space="preserve"> Entonces José fue a sepultar a su padre. Fue con él toda la gente de la corte del faraón, toda la gente importante de Egipto. También fue toda la familia de José, sus hermanos y el resto de la familia de Jacob. En Gosén solo dejaron a los niños, las ovejas y las vacas.</w:t>
       </w:r>
     </w:p>
     <w:p>
@@ -29999,7 +29747,7 @@
         <w:rPr>
           <w:lang w:val="es_ES" w:bidi="es_ES"/>
         </w:rPr>
-        <w:t xml:space="preserve"> Los hijos de Israel cumplieron las instrucciones de su padre.</w:t>
+        <w:t xml:space="preserve"> Los hijos de Israel cumplieron las instrucciones de su padre. Llevaron su cuerpo a la tierra de Canaán. Lo sepultaron en la cueva de Macpela, frente a Mamré, en el campo que Abraham le había comprado a Efrón, el hitita, para usarlo como sepultura.</w:t>
       </w:r>
     </w:p>
     <w:p>
@@ -30272,7 +30020,7 @@
         <w:rPr>
           <w:lang w:val="es_ES" w:bidi="es_ES"/>
         </w:rPr>
-        <w:t xml:space="preserve"> José murió en Egipto a la edad de ciento diez años. Lo embalsamaron y pusieron su cuerpo en un ataúd.</w:t>
+        <w:t xml:space="preserve"> José murió en Egipto a la edad de 110 años. Lo embalsamaron y pusieron su cuerpo en un ataúd.</w:t>
       </w:r>
     </w:p>
     <w:sectPr>

</xml_diff>